<commit_message>
Fix undeclared variable in mo-with-rollback tiny-query path
Full test pass: 51/51 templates compile with their documented context,
5 new templates pass randomized tests vs brute force, TOC verified
67/67 entries against actual pages.

Co-Authored-By: Claude Fable 5 <noreply@anthropic.com>
</commit_message>
<xml_diff>
--- a/CP-Reference.docx
+++ b/CP-Reference.docx
@@ -50,7 +50,7 @@
       <w:r>
         <w:fldChar w:fldCharType="separate"/>
       </w:r>
-      <w:hyperlink w:anchor="_Toc237878288" w:history="1">
+      <w:hyperlink w:anchor="_Toc237879043" w:history="1">
         <w:r>
           <w:rPr>
             <w:rStyle w:val="Hyperlink"/>
@@ -77,7 +77,7 @@
             <w:noProof/>
             <w:webHidden/>
           </w:rPr>
-          <w:instrText xml:space="preserve"> PAGEREF _Toc237878288 \h </w:instrText>
+          <w:instrText xml:space="preserve"> PAGEREF _Toc237879043 \h </w:instrText>
         </w:r>
         <w:r>
           <w:rPr>
@@ -123,7 +123,7 @@
           <w14:ligatures w14:val="standardContextual"/>
         </w:rPr>
       </w:pPr>
-      <w:hyperlink w:anchor="_Toc237878289" w:history="1">
+      <w:hyperlink w:anchor="_Toc237879044" w:history="1">
         <w:r>
           <w:rPr>
             <w:rStyle w:val="Hyperlink"/>
@@ -150,7 +150,7 @@
             <w:noProof/>
             <w:webHidden/>
           </w:rPr>
-          <w:instrText xml:space="preserve"> PAGEREF _Toc237878289 \h </w:instrText>
+          <w:instrText xml:space="preserve"> PAGEREF _Toc237879044 \h </w:instrText>
         </w:r>
         <w:r>
           <w:rPr>
@@ -196,7 +196,7 @@
           <w14:ligatures w14:val="standardContextual"/>
         </w:rPr>
       </w:pPr>
-      <w:hyperlink w:anchor="_Toc237878290" w:history="1">
+      <w:hyperlink w:anchor="_Toc237879045" w:history="1">
         <w:r>
           <w:rPr>
             <w:rStyle w:val="Hyperlink"/>
@@ -223,7 +223,7 @@
             <w:noProof/>
             <w:webHidden/>
           </w:rPr>
-          <w:instrText xml:space="preserve"> PAGEREF _Toc237878290 \h </w:instrText>
+          <w:instrText xml:space="preserve"> PAGEREF _Toc237879045 \h </w:instrText>
         </w:r>
         <w:r>
           <w:rPr>
@@ -269,7 +269,7 @@
           <w14:ligatures w14:val="standardContextual"/>
         </w:rPr>
       </w:pPr>
-      <w:hyperlink w:anchor="_Toc237878291" w:history="1">
+      <w:hyperlink w:anchor="_Toc237879046" w:history="1">
         <w:r>
           <w:rPr>
             <w:rStyle w:val="Hyperlink"/>
@@ -296,7 +296,7 @@
             <w:noProof/>
             <w:webHidden/>
           </w:rPr>
-          <w:instrText xml:space="preserve"> PAGEREF _Toc237878291 \h </w:instrText>
+          <w:instrText xml:space="preserve"> PAGEREF _Toc237879046 \h </w:instrText>
         </w:r>
         <w:r>
           <w:rPr>
@@ -342,7 +342,7 @@
           <w14:ligatures w14:val="standardContextual"/>
         </w:rPr>
       </w:pPr>
-      <w:hyperlink w:anchor="_Toc237878292" w:history="1">
+      <w:hyperlink w:anchor="_Toc237879047" w:history="1">
         <w:r>
           <w:rPr>
             <w:rStyle w:val="Hyperlink"/>
@@ -369,7 +369,7 @@
             <w:noProof/>
             <w:webHidden/>
           </w:rPr>
-          <w:instrText xml:space="preserve"> PAGEREF _Toc237878292 \h </w:instrText>
+          <w:instrText xml:space="preserve"> PAGEREF _Toc237879047 \h </w:instrText>
         </w:r>
         <w:r>
           <w:rPr>
@@ -415,7 +415,7 @@
           <w14:ligatures w14:val="standardContextual"/>
         </w:rPr>
       </w:pPr>
-      <w:hyperlink w:anchor="_Toc237878293" w:history="1">
+      <w:hyperlink w:anchor="_Toc237879048" w:history="1">
         <w:r>
           <w:rPr>
             <w:rStyle w:val="Hyperlink"/>
@@ -442,7 +442,7 @@
             <w:noProof/>
             <w:webHidden/>
           </w:rPr>
-          <w:instrText xml:space="preserve"> PAGEREF _Toc237878293 \h </w:instrText>
+          <w:instrText xml:space="preserve"> PAGEREF _Toc237879048 \h </w:instrText>
         </w:r>
         <w:r>
           <w:rPr>
@@ -488,7 +488,7 @@
           <w14:ligatures w14:val="standardContextual"/>
         </w:rPr>
       </w:pPr>
-      <w:hyperlink w:anchor="_Toc237878294" w:history="1">
+      <w:hyperlink w:anchor="_Toc237879049" w:history="1">
         <w:r>
           <w:rPr>
             <w:rStyle w:val="Hyperlink"/>
@@ -515,7 +515,7 @@
             <w:noProof/>
             <w:webHidden/>
           </w:rPr>
-          <w:instrText xml:space="preserve"> PAGEREF _Toc237878294 \h </w:instrText>
+          <w:instrText xml:space="preserve"> PAGEREF _Toc237879049 \h </w:instrText>
         </w:r>
         <w:r>
           <w:rPr>
@@ -561,7 +561,7 @@
           <w14:ligatures w14:val="standardContextual"/>
         </w:rPr>
       </w:pPr>
-      <w:hyperlink w:anchor="_Toc237878295" w:history="1">
+      <w:hyperlink w:anchor="_Toc237879050" w:history="1">
         <w:r>
           <w:rPr>
             <w:rStyle w:val="Hyperlink"/>
@@ -588,7 +588,7 @@
             <w:noProof/>
             <w:webHidden/>
           </w:rPr>
-          <w:instrText xml:space="preserve"> PAGEREF _Toc237878295 \h </w:instrText>
+          <w:instrText xml:space="preserve"> PAGEREF _Toc237879050 \h </w:instrText>
         </w:r>
         <w:r>
           <w:rPr>
@@ -635,7 +635,7 @@
           <w14:ligatures w14:val="standardContextual"/>
         </w:rPr>
       </w:pPr>
-      <w:hyperlink w:anchor="_Toc237878296" w:history="1">
+      <w:hyperlink w:anchor="_Toc237879051" w:history="1">
         <w:r>
           <w:rPr>
             <w:rStyle w:val="Hyperlink"/>
@@ -662,7 +662,7 @@
             <w:noProof/>
             <w:webHidden/>
           </w:rPr>
-          <w:instrText xml:space="preserve"> PAGEREF _Toc237878296 \h </w:instrText>
+          <w:instrText xml:space="preserve"> PAGEREF _Toc237879051 \h </w:instrText>
         </w:r>
         <w:r>
           <w:rPr>
@@ -708,7 +708,7 @@
           <w14:ligatures w14:val="standardContextual"/>
         </w:rPr>
       </w:pPr>
-      <w:hyperlink w:anchor="_Toc237878297" w:history="1">
+      <w:hyperlink w:anchor="_Toc237879052" w:history="1">
         <w:r>
           <w:rPr>
             <w:rStyle w:val="Hyperlink"/>
@@ -735,7 +735,7 @@
             <w:noProof/>
             <w:webHidden/>
           </w:rPr>
-          <w:instrText xml:space="preserve"> PAGEREF _Toc237878297 \h </w:instrText>
+          <w:instrText xml:space="preserve"> PAGEREF _Toc237879052 \h </w:instrText>
         </w:r>
         <w:r>
           <w:rPr>
@@ -781,7 +781,7 @@
           <w14:ligatures w14:val="standardContextual"/>
         </w:rPr>
       </w:pPr>
-      <w:hyperlink w:anchor="_Toc237878298" w:history="1">
+      <w:hyperlink w:anchor="_Toc237879053" w:history="1">
         <w:r>
           <w:rPr>
             <w:rStyle w:val="Hyperlink"/>
@@ -808,7 +808,7 @@
             <w:noProof/>
             <w:webHidden/>
           </w:rPr>
-          <w:instrText xml:space="preserve"> PAGEREF _Toc237878298 \h </w:instrText>
+          <w:instrText xml:space="preserve"> PAGEREF _Toc237879053 \h </w:instrText>
         </w:r>
         <w:r>
           <w:rPr>
@@ -854,7 +854,7 @@
           <w14:ligatures w14:val="standardContextual"/>
         </w:rPr>
       </w:pPr>
-      <w:hyperlink w:anchor="_Toc237878299" w:history="1">
+      <w:hyperlink w:anchor="_Toc237879054" w:history="1">
         <w:r>
           <w:rPr>
             <w:rStyle w:val="Hyperlink"/>
@@ -881,7 +881,7 @@
             <w:noProof/>
             <w:webHidden/>
           </w:rPr>
-          <w:instrText xml:space="preserve"> PAGEREF _Toc237878299 \h </w:instrText>
+          <w:instrText xml:space="preserve"> PAGEREF _Toc237879054 \h </w:instrText>
         </w:r>
         <w:r>
           <w:rPr>
@@ -927,7 +927,7 @@
           <w14:ligatures w14:val="standardContextual"/>
         </w:rPr>
       </w:pPr>
-      <w:hyperlink w:anchor="_Toc237878300" w:history="1">
+      <w:hyperlink w:anchor="_Toc237879055" w:history="1">
         <w:r>
           <w:rPr>
             <w:rStyle w:val="Hyperlink"/>
@@ -954,7 +954,7 @@
             <w:noProof/>
             <w:webHidden/>
           </w:rPr>
-          <w:instrText xml:space="preserve"> PAGEREF _Toc237878300 \h </w:instrText>
+          <w:instrText xml:space="preserve"> PAGEREF _Toc237879055 \h </w:instrText>
         </w:r>
         <w:r>
           <w:rPr>
@@ -1000,7 +1000,7 @@
           <w14:ligatures w14:val="standardContextual"/>
         </w:rPr>
       </w:pPr>
-      <w:hyperlink w:anchor="_Toc237878301" w:history="1">
+      <w:hyperlink w:anchor="_Toc237879056" w:history="1">
         <w:r>
           <w:rPr>
             <w:rStyle w:val="Hyperlink"/>
@@ -1027,7 +1027,7 @@
             <w:noProof/>
             <w:webHidden/>
           </w:rPr>
-          <w:instrText xml:space="preserve"> PAGEREF _Toc237878301 \h </w:instrText>
+          <w:instrText xml:space="preserve"> PAGEREF _Toc237879056 \h </w:instrText>
         </w:r>
         <w:r>
           <w:rPr>
@@ -1073,7 +1073,7 @@
           <w14:ligatures w14:val="standardContextual"/>
         </w:rPr>
       </w:pPr>
-      <w:hyperlink w:anchor="_Toc237878302" w:history="1">
+      <w:hyperlink w:anchor="_Toc237879057" w:history="1">
         <w:r>
           <w:rPr>
             <w:rStyle w:val="Hyperlink"/>
@@ -1100,7 +1100,7 @@
             <w:noProof/>
             <w:webHidden/>
           </w:rPr>
-          <w:instrText xml:space="preserve"> PAGEREF _Toc237878302 \h </w:instrText>
+          <w:instrText xml:space="preserve"> PAGEREF _Toc237879057 \h </w:instrText>
         </w:r>
         <w:r>
           <w:rPr>
@@ -1147,7 +1147,7 @@
           <w14:ligatures w14:val="standardContextual"/>
         </w:rPr>
       </w:pPr>
-      <w:hyperlink w:anchor="_Toc237878303" w:history="1">
+      <w:hyperlink w:anchor="_Toc237879058" w:history="1">
         <w:r>
           <w:rPr>
             <w:rStyle w:val="Hyperlink"/>
@@ -1174,7 +1174,7 @@
             <w:noProof/>
             <w:webHidden/>
           </w:rPr>
-          <w:instrText xml:space="preserve"> PAGEREF _Toc237878303 \h </w:instrText>
+          <w:instrText xml:space="preserve"> PAGEREF _Toc237879058 \h </w:instrText>
         </w:r>
         <w:r>
           <w:rPr>
@@ -1220,7 +1220,7 @@
           <w14:ligatures w14:val="standardContextual"/>
         </w:rPr>
       </w:pPr>
-      <w:hyperlink w:anchor="_Toc237878304" w:history="1">
+      <w:hyperlink w:anchor="_Toc237879059" w:history="1">
         <w:r>
           <w:rPr>
             <w:rStyle w:val="Hyperlink"/>
@@ -1247,7 +1247,7 @@
             <w:noProof/>
             <w:webHidden/>
           </w:rPr>
-          <w:instrText xml:space="preserve"> PAGEREF _Toc237878304 \h </w:instrText>
+          <w:instrText xml:space="preserve"> PAGEREF _Toc237879059 \h </w:instrText>
         </w:r>
         <w:r>
           <w:rPr>
@@ -1293,7 +1293,7 @@
           <w14:ligatures w14:val="standardContextual"/>
         </w:rPr>
       </w:pPr>
-      <w:hyperlink w:anchor="_Toc237878305" w:history="1">
+      <w:hyperlink w:anchor="_Toc237879060" w:history="1">
         <w:r>
           <w:rPr>
             <w:rStyle w:val="Hyperlink"/>
@@ -1320,7 +1320,7 @@
             <w:noProof/>
             <w:webHidden/>
           </w:rPr>
-          <w:instrText xml:space="preserve"> PAGEREF _Toc237878305 \h </w:instrText>
+          <w:instrText xml:space="preserve"> PAGEREF _Toc237879060 \h </w:instrText>
         </w:r>
         <w:r>
           <w:rPr>
@@ -1366,7 +1366,7 @@
           <w14:ligatures w14:val="standardContextual"/>
         </w:rPr>
       </w:pPr>
-      <w:hyperlink w:anchor="_Toc237878306" w:history="1">
+      <w:hyperlink w:anchor="_Toc237879061" w:history="1">
         <w:r>
           <w:rPr>
             <w:rStyle w:val="Hyperlink"/>
@@ -1393,7 +1393,7 @@
             <w:noProof/>
             <w:webHidden/>
           </w:rPr>
-          <w:instrText xml:space="preserve"> PAGEREF _Toc237878306 \h </w:instrText>
+          <w:instrText xml:space="preserve"> PAGEREF _Toc237879061 \h </w:instrText>
         </w:r>
         <w:r>
           <w:rPr>
@@ -1440,7 +1440,7 @@
           <w14:ligatures w14:val="standardContextual"/>
         </w:rPr>
       </w:pPr>
-      <w:hyperlink w:anchor="_Toc237878307" w:history="1">
+      <w:hyperlink w:anchor="_Toc237879062" w:history="1">
         <w:r>
           <w:rPr>
             <w:rStyle w:val="Hyperlink"/>
@@ -1467,7 +1467,7 @@
             <w:noProof/>
             <w:webHidden/>
           </w:rPr>
-          <w:instrText xml:space="preserve"> PAGEREF _Toc237878307 \h </w:instrText>
+          <w:instrText xml:space="preserve"> PAGEREF _Toc237879062 \h </w:instrText>
         </w:r>
         <w:r>
           <w:rPr>
@@ -1513,7 +1513,7 @@
           <w14:ligatures w14:val="standardContextual"/>
         </w:rPr>
       </w:pPr>
-      <w:hyperlink w:anchor="_Toc237878308" w:history="1">
+      <w:hyperlink w:anchor="_Toc237879063" w:history="1">
         <w:r>
           <w:rPr>
             <w:rStyle w:val="Hyperlink"/>
@@ -1540,7 +1540,7 @@
             <w:noProof/>
             <w:webHidden/>
           </w:rPr>
-          <w:instrText xml:space="preserve"> PAGEREF _Toc237878308 \h </w:instrText>
+          <w:instrText xml:space="preserve"> PAGEREF _Toc237879063 \h </w:instrText>
         </w:r>
         <w:r>
           <w:rPr>
@@ -1586,7 +1586,7 @@
           <w14:ligatures w14:val="standardContextual"/>
         </w:rPr>
       </w:pPr>
-      <w:hyperlink w:anchor="_Toc237878309" w:history="1">
+      <w:hyperlink w:anchor="_Toc237879064" w:history="1">
         <w:r>
           <w:rPr>
             <w:rStyle w:val="Hyperlink"/>
@@ -1613,7 +1613,7 @@
             <w:noProof/>
             <w:webHidden/>
           </w:rPr>
-          <w:instrText xml:space="preserve"> PAGEREF _Toc237878309 \h </w:instrText>
+          <w:instrText xml:space="preserve"> PAGEREF _Toc237879064 \h </w:instrText>
         </w:r>
         <w:r>
           <w:rPr>
@@ -1659,7 +1659,7 @@
           <w14:ligatures w14:val="standardContextual"/>
         </w:rPr>
       </w:pPr>
-      <w:hyperlink w:anchor="_Toc237878310" w:history="1">
+      <w:hyperlink w:anchor="_Toc237879065" w:history="1">
         <w:r>
           <w:rPr>
             <w:rStyle w:val="Hyperlink"/>
@@ -1686,7 +1686,7 @@
             <w:noProof/>
             <w:webHidden/>
           </w:rPr>
-          <w:instrText xml:space="preserve"> PAGEREF _Toc237878310 \h </w:instrText>
+          <w:instrText xml:space="preserve"> PAGEREF _Toc237879065 \h </w:instrText>
         </w:r>
         <w:r>
           <w:rPr>
@@ -1732,7 +1732,7 @@
           <w14:ligatures w14:val="standardContextual"/>
         </w:rPr>
       </w:pPr>
-      <w:hyperlink w:anchor="_Toc237878311" w:history="1">
+      <w:hyperlink w:anchor="_Toc237879066" w:history="1">
         <w:r>
           <w:rPr>
             <w:rStyle w:val="Hyperlink"/>
@@ -1759,7 +1759,7 @@
             <w:noProof/>
             <w:webHidden/>
           </w:rPr>
-          <w:instrText xml:space="preserve"> PAGEREF _Toc237878311 \h </w:instrText>
+          <w:instrText xml:space="preserve"> PAGEREF _Toc237879066 \h </w:instrText>
         </w:r>
         <w:r>
           <w:rPr>
@@ -1805,7 +1805,7 @@
           <w14:ligatures w14:val="standardContextual"/>
         </w:rPr>
       </w:pPr>
-      <w:hyperlink w:anchor="_Toc237878312" w:history="1">
+      <w:hyperlink w:anchor="_Toc237879067" w:history="1">
         <w:r>
           <w:rPr>
             <w:rStyle w:val="Hyperlink"/>
@@ -1832,7 +1832,7 @@
             <w:noProof/>
             <w:webHidden/>
           </w:rPr>
-          <w:instrText xml:space="preserve"> PAGEREF _Toc237878312 \h </w:instrText>
+          <w:instrText xml:space="preserve"> PAGEREF _Toc237879067 \h </w:instrText>
         </w:r>
         <w:r>
           <w:rPr>
@@ -1878,7 +1878,7 @@
           <w14:ligatures w14:val="standardContextual"/>
         </w:rPr>
       </w:pPr>
-      <w:hyperlink w:anchor="_Toc237878313" w:history="1">
+      <w:hyperlink w:anchor="_Toc237879068" w:history="1">
         <w:r>
           <w:rPr>
             <w:rStyle w:val="Hyperlink"/>
@@ -1905,7 +1905,7 @@
             <w:noProof/>
             <w:webHidden/>
           </w:rPr>
-          <w:instrText xml:space="preserve"> PAGEREF _Toc237878313 \h </w:instrText>
+          <w:instrText xml:space="preserve"> PAGEREF _Toc237879068 \h </w:instrText>
         </w:r>
         <w:r>
           <w:rPr>
@@ -1952,7 +1952,7 @@
           <w14:ligatures w14:val="standardContextual"/>
         </w:rPr>
       </w:pPr>
-      <w:hyperlink w:anchor="_Toc237878314" w:history="1">
+      <w:hyperlink w:anchor="_Toc237879069" w:history="1">
         <w:r>
           <w:rPr>
             <w:rStyle w:val="Hyperlink"/>
@@ -1979,7 +1979,7 @@
             <w:noProof/>
             <w:webHidden/>
           </w:rPr>
-          <w:instrText xml:space="preserve"> PAGEREF _Toc237878314 \h </w:instrText>
+          <w:instrText xml:space="preserve"> PAGEREF _Toc237879069 \h </w:instrText>
         </w:r>
         <w:r>
           <w:rPr>
@@ -2025,7 +2025,7 @@
           <w14:ligatures w14:val="standardContextual"/>
         </w:rPr>
       </w:pPr>
-      <w:hyperlink w:anchor="_Toc237878315" w:history="1">
+      <w:hyperlink w:anchor="_Toc237879070" w:history="1">
         <w:r>
           <w:rPr>
             <w:rStyle w:val="Hyperlink"/>
@@ -2052,7 +2052,7 @@
             <w:noProof/>
             <w:webHidden/>
           </w:rPr>
-          <w:instrText xml:space="preserve"> PAGEREF _Toc237878315 \h </w:instrText>
+          <w:instrText xml:space="preserve"> PAGEREF _Toc237879070 \h </w:instrText>
         </w:r>
         <w:r>
           <w:rPr>
@@ -2098,7 +2098,7 @@
           <w14:ligatures w14:val="standardContextual"/>
         </w:rPr>
       </w:pPr>
-      <w:hyperlink w:anchor="_Toc237878316" w:history="1">
+      <w:hyperlink w:anchor="_Toc237879071" w:history="1">
         <w:r>
           <w:rPr>
             <w:rStyle w:val="Hyperlink"/>
@@ -2125,7 +2125,7 @@
             <w:noProof/>
             <w:webHidden/>
           </w:rPr>
-          <w:instrText xml:space="preserve"> PAGEREF _Toc237878316 \h </w:instrText>
+          <w:instrText xml:space="preserve"> PAGEREF _Toc237879071 \h </w:instrText>
         </w:r>
         <w:r>
           <w:rPr>
@@ -2171,7 +2171,7 @@
           <w14:ligatures w14:val="standardContextual"/>
         </w:rPr>
       </w:pPr>
-      <w:hyperlink w:anchor="_Toc237878317" w:history="1">
+      <w:hyperlink w:anchor="_Toc237879072" w:history="1">
         <w:r>
           <w:rPr>
             <w:rStyle w:val="Hyperlink"/>
@@ -2198,7 +2198,7 @@
             <w:noProof/>
             <w:webHidden/>
           </w:rPr>
-          <w:instrText xml:space="preserve"> PAGEREF _Toc237878317 \h </w:instrText>
+          <w:instrText xml:space="preserve"> PAGEREF _Toc237879072 \h </w:instrText>
         </w:r>
         <w:r>
           <w:rPr>
@@ -2244,7 +2244,7 @@
           <w14:ligatures w14:val="standardContextual"/>
         </w:rPr>
       </w:pPr>
-      <w:hyperlink w:anchor="_Toc237878318" w:history="1">
+      <w:hyperlink w:anchor="_Toc237879073" w:history="1">
         <w:r>
           <w:rPr>
             <w:rStyle w:val="Hyperlink"/>
@@ -2271,7 +2271,7 @@
             <w:noProof/>
             <w:webHidden/>
           </w:rPr>
-          <w:instrText xml:space="preserve"> PAGEREF _Toc237878318 \h </w:instrText>
+          <w:instrText xml:space="preserve"> PAGEREF _Toc237879073 \h </w:instrText>
         </w:r>
         <w:r>
           <w:rPr>
@@ -2317,7 +2317,7 @@
           <w14:ligatures w14:val="standardContextual"/>
         </w:rPr>
       </w:pPr>
-      <w:hyperlink w:anchor="_Toc237878319" w:history="1">
+      <w:hyperlink w:anchor="_Toc237879074" w:history="1">
         <w:r>
           <w:rPr>
             <w:rStyle w:val="Hyperlink"/>
@@ -2344,7 +2344,7 @@
             <w:noProof/>
             <w:webHidden/>
           </w:rPr>
-          <w:instrText xml:space="preserve"> PAGEREF _Toc237878319 \h </w:instrText>
+          <w:instrText xml:space="preserve"> PAGEREF _Toc237879074 \h </w:instrText>
         </w:r>
         <w:r>
           <w:rPr>
@@ -2390,7 +2390,7 @@
           <w14:ligatures w14:val="standardContextual"/>
         </w:rPr>
       </w:pPr>
-      <w:hyperlink w:anchor="_Toc237878320" w:history="1">
+      <w:hyperlink w:anchor="_Toc237879075" w:history="1">
         <w:r>
           <w:rPr>
             <w:rStyle w:val="Hyperlink"/>
@@ -2417,7 +2417,7 @@
             <w:noProof/>
             <w:webHidden/>
           </w:rPr>
-          <w:instrText xml:space="preserve"> PAGEREF _Toc237878320 \h </w:instrText>
+          <w:instrText xml:space="preserve"> PAGEREF _Toc237879075 \h </w:instrText>
         </w:r>
         <w:r>
           <w:rPr>
@@ -2463,7 +2463,7 @@
           <w14:ligatures w14:val="standardContextual"/>
         </w:rPr>
       </w:pPr>
-      <w:hyperlink w:anchor="_Toc237878321" w:history="1">
+      <w:hyperlink w:anchor="_Toc237879076" w:history="1">
         <w:r>
           <w:rPr>
             <w:rStyle w:val="Hyperlink"/>
@@ -2490,7 +2490,7 @@
             <w:noProof/>
             <w:webHidden/>
           </w:rPr>
-          <w:instrText xml:space="preserve"> PAGEREF _Toc237878321 \h </w:instrText>
+          <w:instrText xml:space="preserve"> PAGEREF _Toc237879076 \h </w:instrText>
         </w:r>
         <w:r>
           <w:rPr>
@@ -2536,7 +2536,7 @@
           <w14:ligatures w14:val="standardContextual"/>
         </w:rPr>
       </w:pPr>
-      <w:hyperlink w:anchor="_Toc237878322" w:history="1">
+      <w:hyperlink w:anchor="_Toc237879077" w:history="1">
         <w:r>
           <w:rPr>
             <w:rStyle w:val="Hyperlink"/>
@@ -2563,7 +2563,7 @@
             <w:noProof/>
             <w:webHidden/>
           </w:rPr>
-          <w:instrText xml:space="preserve"> PAGEREF _Toc237878322 \h </w:instrText>
+          <w:instrText xml:space="preserve"> PAGEREF _Toc237879077 \h </w:instrText>
         </w:r>
         <w:r>
           <w:rPr>
@@ -2609,7 +2609,7 @@
           <w14:ligatures w14:val="standardContextual"/>
         </w:rPr>
       </w:pPr>
-      <w:hyperlink w:anchor="_Toc237878323" w:history="1">
+      <w:hyperlink w:anchor="_Toc237879078" w:history="1">
         <w:r>
           <w:rPr>
             <w:rStyle w:val="Hyperlink"/>
@@ -2636,7 +2636,7 @@
             <w:noProof/>
             <w:webHidden/>
           </w:rPr>
-          <w:instrText xml:space="preserve"> PAGEREF _Toc237878323 \h </w:instrText>
+          <w:instrText xml:space="preserve"> PAGEREF _Toc237879078 \h </w:instrText>
         </w:r>
         <w:r>
           <w:rPr>
@@ -2682,7 +2682,7 @@
           <w14:ligatures w14:val="standardContextual"/>
         </w:rPr>
       </w:pPr>
-      <w:hyperlink w:anchor="_Toc237878324" w:history="1">
+      <w:hyperlink w:anchor="_Toc237879079" w:history="1">
         <w:r>
           <w:rPr>
             <w:rStyle w:val="Hyperlink"/>
@@ -2709,7 +2709,7 @@
             <w:noProof/>
             <w:webHidden/>
           </w:rPr>
-          <w:instrText xml:space="preserve"> PAGEREF _Toc237878324 \h </w:instrText>
+          <w:instrText xml:space="preserve"> PAGEREF _Toc237879079 \h </w:instrText>
         </w:r>
         <w:r>
           <w:rPr>
@@ -2755,7 +2755,7 @@
           <w14:ligatures w14:val="standardContextual"/>
         </w:rPr>
       </w:pPr>
-      <w:hyperlink w:anchor="_Toc237878325" w:history="1">
+      <w:hyperlink w:anchor="_Toc237879080" w:history="1">
         <w:r>
           <w:rPr>
             <w:rStyle w:val="Hyperlink"/>
@@ -2782,7 +2782,7 @@
             <w:noProof/>
             <w:webHidden/>
           </w:rPr>
-          <w:instrText xml:space="preserve"> PAGEREF _Toc237878325 \h </w:instrText>
+          <w:instrText xml:space="preserve"> PAGEREF _Toc237879080 \h </w:instrText>
         </w:r>
         <w:r>
           <w:rPr>
@@ -2828,7 +2828,7 @@
           <w14:ligatures w14:val="standardContextual"/>
         </w:rPr>
       </w:pPr>
-      <w:hyperlink w:anchor="_Toc237878326" w:history="1">
+      <w:hyperlink w:anchor="_Toc237879081" w:history="1">
         <w:r>
           <w:rPr>
             <w:rStyle w:val="Hyperlink"/>
@@ -2855,7 +2855,7 @@
             <w:noProof/>
             <w:webHidden/>
           </w:rPr>
-          <w:instrText xml:space="preserve"> PAGEREF _Toc237878326 \h </w:instrText>
+          <w:instrText xml:space="preserve"> PAGEREF _Toc237879081 \h </w:instrText>
         </w:r>
         <w:r>
           <w:rPr>
@@ -2901,7 +2901,7 @@
           <w14:ligatures w14:val="standardContextual"/>
         </w:rPr>
       </w:pPr>
-      <w:hyperlink w:anchor="_Toc237878327" w:history="1">
+      <w:hyperlink w:anchor="_Toc237879082" w:history="1">
         <w:r>
           <w:rPr>
             <w:rStyle w:val="Hyperlink"/>
@@ -2928,7 +2928,7 @@
             <w:noProof/>
             <w:webHidden/>
           </w:rPr>
-          <w:instrText xml:space="preserve"> PAGEREF _Toc237878327 \h </w:instrText>
+          <w:instrText xml:space="preserve"> PAGEREF _Toc237879082 \h </w:instrText>
         </w:r>
         <w:r>
           <w:rPr>
@@ -2975,7 +2975,7 @@
           <w14:ligatures w14:val="standardContextual"/>
         </w:rPr>
       </w:pPr>
-      <w:hyperlink w:anchor="_Toc237878328" w:history="1">
+      <w:hyperlink w:anchor="_Toc237879083" w:history="1">
         <w:r>
           <w:rPr>
             <w:rStyle w:val="Hyperlink"/>
@@ -3002,7 +3002,7 @@
             <w:noProof/>
             <w:webHidden/>
           </w:rPr>
-          <w:instrText xml:space="preserve"> PAGEREF _Toc237878328 \h </w:instrText>
+          <w:instrText xml:space="preserve"> PAGEREF _Toc237879083 \h </w:instrText>
         </w:r>
         <w:r>
           <w:rPr>
@@ -3048,7 +3048,7 @@
           <w14:ligatures w14:val="standardContextual"/>
         </w:rPr>
       </w:pPr>
-      <w:hyperlink w:anchor="_Toc237878329" w:history="1">
+      <w:hyperlink w:anchor="_Toc237879084" w:history="1">
         <w:r>
           <w:rPr>
             <w:rStyle w:val="Hyperlink"/>
@@ -3075,7 +3075,7 @@
             <w:noProof/>
             <w:webHidden/>
           </w:rPr>
-          <w:instrText xml:space="preserve"> PAGEREF _Toc237878329 \h </w:instrText>
+          <w:instrText xml:space="preserve"> PAGEREF _Toc237879084 \h </w:instrText>
         </w:r>
         <w:r>
           <w:rPr>
@@ -3121,7 +3121,7 @@
           <w14:ligatures w14:val="standardContextual"/>
         </w:rPr>
       </w:pPr>
-      <w:hyperlink w:anchor="_Toc237878330" w:history="1">
+      <w:hyperlink w:anchor="_Toc237879085" w:history="1">
         <w:r>
           <w:rPr>
             <w:rStyle w:val="Hyperlink"/>
@@ -3148,7 +3148,7 @@
             <w:noProof/>
             <w:webHidden/>
           </w:rPr>
-          <w:instrText xml:space="preserve"> PAGEREF _Toc237878330 \h </w:instrText>
+          <w:instrText xml:space="preserve"> PAGEREF _Toc237879085 \h </w:instrText>
         </w:r>
         <w:r>
           <w:rPr>
@@ -3194,7 +3194,7 @@
           <w14:ligatures w14:val="standardContextual"/>
         </w:rPr>
       </w:pPr>
-      <w:hyperlink w:anchor="_Toc237878331" w:history="1">
+      <w:hyperlink w:anchor="_Toc237879086" w:history="1">
         <w:r>
           <w:rPr>
             <w:rStyle w:val="Hyperlink"/>
@@ -3221,7 +3221,7 @@
             <w:noProof/>
             <w:webHidden/>
           </w:rPr>
-          <w:instrText xml:space="preserve"> PAGEREF _Toc237878331 \h </w:instrText>
+          <w:instrText xml:space="preserve"> PAGEREF _Toc237879086 \h </w:instrText>
         </w:r>
         <w:r>
           <w:rPr>
@@ -3267,7 +3267,7 @@
           <w14:ligatures w14:val="standardContextual"/>
         </w:rPr>
       </w:pPr>
-      <w:hyperlink w:anchor="_Toc237878332" w:history="1">
+      <w:hyperlink w:anchor="_Toc237879087" w:history="1">
         <w:r>
           <w:rPr>
             <w:rStyle w:val="Hyperlink"/>
@@ -3294,7 +3294,7 @@
             <w:noProof/>
             <w:webHidden/>
           </w:rPr>
-          <w:instrText xml:space="preserve"> PAGEREF _Toc237878332 \h </w:instrText>
+          <w:instrText xml:space="preserve"> PAGEREF _Toc237879087 \h </w:instrText>
         </w:r>
         <w:r>
           <w:rPr>
@@ -3340,7 +3340,7 @@
           <w14:ligatures w14:val="standardContextual"/>
         </w:rPr>
       </w:pPr>
-      <w:hyperlink w:anchor="_Toc237878333" w:history="1">
+      <w:hyperlink w:anchor="_Toc237879088" w:history="1">
         <w:r>
           <w:rPr>
             <w:rStyle w:val="Hyperlink"/>
@@ -3367,7 +3367,7 @@
             <w:noProof/>
             <w:webHidden/>
           </w:rPr>
-          <w:instrText xml:space="preserve"> PAGEREF _Toc237878333 \h </w:instrText>
+          <w:instrText xml:space="preserve"> PAGEREF _Toc237879088 \h </w:instrText>
         </w:r>
         <w:r>
           <w:rPr>
@@ -3413,7 +3413,7 @@
           <w14:ligatures w14:val="standardContextual"/>
         </w:rPr>
       </w:pPr>
-      <w:hyperlink w:anchor="_Toc237878334" w:history="1">
+      <w:hyperlink w:anchor="_Toc237879089" w:history="1">
         <w:r>
           <w:rPr>
             <w:rStyle w:val="Hyperlink"/>
@@ -3440,7 +3440,7 @@
             <w:noProof/>
             <w:webHidden/>
           </w:rPr>
-          <w:instrText xml:space="preserve"> PAGEREF _Toc237878334 \h </w:instrText>
+          <w:instrText xml:space="preserve"> PAGEREF _Toc237879089 \h </w:instrText>
         </w:r>
         <w:r>
           <w:rPr>
@@ -3486,7 +3486,7 @@
           <w14:ligatures w14:val="standardContextual"/>
         </w:rPr>
       </w:pPr>
-      <w:hyperlink w:anchor="_Toc237878335" w:history="1">
+      <w:hyperlink w:anchor="_Toc237879090" w:history="1">
         <w:r>
           <w:rPr>
             <w:rStyle w:val="Hyperlink"/>
@@ -3513,7 +3513,7 @@
             <w:noProof/>
             <w:webHidden/>
           </w:rPr>
-          <w:instrText xml:space="preserve"> PAGEREF _Toc237878335 \h </w:instrText>
+          <w:instrText xml:space="preserve"> PAGEREF _Toc237879090 \h </w:instrText>
         </w:r>
         <w:r>
           <w:rPr>
@@ -3559,7 +3559,7 @@
           <w14:ligatures w14:val="standardContextual"/>
         </w:rPr>
       </w:pPr>
-      <w:hyperlink w:anchor="_Toc237878336" w:history="1">
+      <w:hyperlink w:anchor="_Toc237879091" w:history="1">
         <w:r>
           <w:rPr>
             <w:rStyle w:val="Hyperlink"/>
@@ -3586,7 +3586,7 @@
             <w:noProof/>
             <w:webHidden/>
           </w:rPr>
-          <w:instrText xml:space="preserve"> PAGEREF _Toc237878336 \h </w:instrText>
+          <w:instrText xml:space="preserve"> PAGEREF _Toc237879091 \h </w:instrText>
         </w:r>
         <w:r>
           <w:rPr>
@@ -3632,7 +3632,7 @@
           <w14:ligatures w14:val="standardContextual"/>
         </w:rPr>
       </w:pPr>
-      <w:hyperlink w:anchor="_Toc237878337" w:history="1">
+      <w:hyperlink w:anchor="_Toc237879092" w:history="1">
         <w:r>
           <w:rPr>
             <w:rStyle w:val="Hyperlink"/>
@@ -3659,7 +3659,7 @@
             <w:noProof/>
             <w:webHidden/>
           </w:rPr>
-          <w:instrText xml:space="preserve"> PAGEREF _Toc237878337 \h </w:instrText>
+          <w:instrText xml:space="preserve"> PAGEREF _Toc237879092 \h </w:instrText>
         </w:r>
         <w:r>
           <w:rPr>
@@ -3705,7 +3705,7 @@
           <w14:ligatures w14:val="standardContextual"/>
         </w:rPr>
       </w:pPr>
-      <w:hyperlink w:anchor="_Toc237878338" w:history="1">
+      <w:hyperlink w:anchor="_Toc237879093" w:history="1">
         <w:r>
           <w:rPr>
             <w:rStyle w:val="Hyperlink"/>
@@ -3732,7 +3732,7 @@
             <w:noProof/>
             <w:webHidden/>
           </w:rPr>
-          <w:instrText xml:space="preserve"> PAGEREF _Toc237878338 \h </w:instrText>
+          <w:instrText xml:space="preserve"> PAGEREF _Toc237879093 \h </w:instrText>
         </w:r>
         <w:r>
           <w:rPr>
@@ -3778,7 +3778,7 @@
           <w14:ligatures w14:val="standardContextual"/>
         </w:rPr>
       </w:pPr>
-      <w:hyperlink w:anchor="_Toc237878339" w:history="1">
+      <w:hyperlink w:anchor="_Toc237879094" w:history="1">
         <w:r>
           <w:rPr>
             <w:rStyle w:val="Hyperlink"/>
@@ -3805,7 +3805,7 @@
             <w:noProof/>
             <w:webHidden/>
           </w:rPr>
-          <w:instrText xml:space="preserve"> PAGEREF _Toc237878339 \h </w:instrText>
+          <w:instrText xml:space="preserve"> PAGEREF _Toc237879094 \h </w:instrText>
         </w:r>
         <w:r>
           <w:rPr>
@@ -3852,7 +3852,7 @@
           <w14:ligatures w14:val="standardContextual"/>
         </w:rPr>
       </w:pPr>
-      <w:hyperlink w:anchor="_Toc237878340" w:history="1">
+      <w:hyperlink w:anchor="_Toc237879095" w:history="1">
         <w:r>
           <w:rPr>
             <w:rStyle w:val="Hyperlink"/>
@@ -3879,7 +3879,7 @@
             <w:noProof/>
             <w:webHidden/>
           </w:rPr>
-          <w:instrText xml:space="preserve"> PAGEREF _Toc237878340 \h </w:instrText>
+          <w:instrText xml:space="preserve"> PAGEREF _Toc237879095 \h </w:instrText>
         </w:r>
         <w:r>
           <w:rPr>
@@ -3925,7 +3925,7 @@
           <w14:ligatures w14:val="standardContextual"/>
         </w:rPr>
       </w:pPr>
-      <w:hyperlink w:anchor="_Toc237878341" w:history="1">
+      <w:hyperlink w:anchor="_Toc237879096" w:history="1">
         <w:r>
           <w:rPr>
             <w:rStyle w:val="Hyperlink"/>
@@ -3952,7 +3952,7 @@
             <w:noProof/>
             <w:webHidden/>
           </w:rPr>
-          <w:instrText xml:space="preserve"> PAGEREF _Toc237878341 \h </w:instrText>
+          <w:instrText xml:space="preserve"> PAGEREF _Toc237879096 \h </w:instrText>
         </w:r>
         <w:r>
           <w:rPr>
@@ -3998,7 +3998,7 @@
           <w14:ligatures w14:val="standardContextual"/>
         </w:rPr>
       </w:pPr>
-      <w:hyperlink w:anchor="_Toc237878342" w:history="1">
+      <w:hyperlink w:anchor="_Toc237879097" w:history="1">
         <w:r>
           <w:rPr>
             <w:rStyle w:val="Hyperlink"/>
@@ -4025,7 +4025,7 @@
             <w:noProof/>
             <w:webHidden/>
           </w:rPr>
-          <w:instrText xml:space="preserve"> PAGEREF _Toc237878342 \h </w:instrText>
+          <w:instrText xml:space="preserve"> PAGEREF _Toc237879097 \h </w:instrText>
         </w:r>
         <w:r>
           <w:rPr>
@@ -4071,7 +4071,7 @@
           <w14:ligatures w14:val="standardContextual"/>
         </w:rPr>
       </w:pPr>
-      <w:hyperlink w:anchor="_Toc237878343" w:history="1">
+      <w:hyperlink w:anchor="_Toc237879098" w:history="1">
         <w:r>
           <w:rPr>
             <w:rStyle w:val="Hyperlink"/>
@@ -4098,7 +4098,7 @@
             <w:noProof/>
             <w:webHidden/>
           </w:rPr>
-          <w:instrText xml:space="preserve"> PAGEREF _Toc237878343 \h </w:instrText>
+          <w:instrText xml:space="preserve"> PAGEREF _Toc237879098 \h </w:instrText>
         </w:r>
         <w:r>
           <w:rPr>
@@ -4144,7 +4144,7 @@
           <w14:ligatures w14:val="standardContextual"/>
         </w:rPr>
       </w:pPr>
-      <w:hyperlink w:anchor="_Toc237878344" w:history="1">
+      <w:hyperlink w:anchor="_Toc237879099" w:history="1">
         <w:r>
           <w:rPr>
             <w:rStyle w:val="Hyperlink"/>
@@ -4171,7 +4171,7 @@
             <w:noProof/>
             <w:webHidden/>
           </w:rPr>
-          <w:instrText xml:space="preserve"> PAGEREF _Toc237878344 \h </w:instrText>
+          <w:instrText xml:space="preserve"> PAGEREF _Toc237879099 \h </w:instrText>
         </w:r>
         <w:r>
           <w:rPr>
@@ -4217,7 +4217,7 @@
           <w14:ligatures w14:val="standardContextual"/>
         </w:rPr>
       </w:pPr>
-      <w:hyperlink w:anchor="_Toc237878345" w:history="1">
+      <w:hyperlink w:anchor="_Toc237879100" w:history="1">
         <w:r>
           <w:rPr>
             <w:rStyle w:val="Hyperlink"/>
@@ -4244,7 +4244,7 @@
             <w:noProof/>
             <w:webHidden/>
           </w:rPr>
-          <w:instrText xml:space="preserve"> PAGEREF _Toc237878345 \h </w:instrText>
+          <w:instrText xml:space="preserve"> PAGEREF _Toc237879100 \h </w:instrText>
         </w:r>
         <w:r>
           <w:rPr>
@@ -4290,7 +4290,7 @@
           <w14:ligatures w14:val="standardContextual"/>
         </w:rPr>
       </w:pPr>
-      <w:hyperlink w:anchor="_Toc237878346" w:history="1">
+      <w:hyperlink w:anchor="_Toc237879101" w:history="1">
         <w:r>
           <w:rPr>
             <w:rStyle w:val="Hyperlink"/>
@@ -4317,7 +4317,7 @@
             <w:noProof/>
             <w:webHidden/>
           </w:rPr>
-          <w:instrText xml:space="preserve"> PAGEREF _Toc237878346 \h </w:instrText>
+          <w:instrText xml:space="preserve"> PAGEREF _Toc237879101 \h </w:instrText>
         </w:r>
         <w:r>
           <w:rPr>
@@ -4364,7 +4364,7 @@
           <w14:ligatures w14:val="standardContextual"/>
         </w:rPr>
       </w:pPr>
-      <w:hyperlink w:anchor="_Toc237878347" w:history="1">
+      <w:hyperlink w:anchor="_Toc237879102" w:history="1">
         <w:r>
           <w:rPr>
             <w:rStyle w:val="Hyperlink"/>
@@ -4391,7 +4391,7 @@
             <w:noProof/>
             <w:webHidden/>
           </w:rPr>
-          <w:instrText xml:space="preserve"> PAGEREF _Toc237878347 \h </w:instrText>
+          <w:instrText xml:space="preserve"> PAGEREF _Toc237879102 \h </w:instrText>
         </w:r>
         <w:r>
           <w:rPr>
@@ -4437,7 +4437,7 @@
           <w14:ligatures w14:val="standardContextual"/>
         </w:rPr>
       </w:pPr>
-      <w:hyperlink w:anchor="_Toc237878348" w:history="1">
+      <w:hyperlink w:anchor="_Toc237879103" w:history="1">
         <w:r>
           <w:rPr>
             <w:rStyle w:val="Hyperlink"/>
@@ -4464,7 +4464,7 @@
             <w:noProof/>
             <w:webHidden/>
           </w:rPr>
-          <w:instrText xml:space="preserve"> PAGEREF _Toc237878348 \h </w:instrText>
+          <w:instrText xml:space="preserve"> PAGEREF _Toc237879103 \h </w:instrText>
         </w:r>
         <w:r>
           <w:rPr>
@@ -4510,7 +4510,7 @@
           <w14:ligatures w14:val="standardContextual"/>
         </w:rPr>
       </w:pPr>
-      <w:hyperlink w:anchor="_Toc237878349" w:history="1">
+      <w:hyperlink w:anchor="_Toc237879104" w:history="1">
         <w:r>
           <w:rPr>
             <w:rStyle w:val="Hyperlink"/>
@@ -4537,7 +4537,7 @@
             <w:noProof/>
             <w:webHidden/>
           </w:rPr>
-          <w:instrText xml:space="preserve"> PAGEREF _Toc237878349 \h </w:instrText>
+          <w:instrText xml:space="preserve"> PAGEREF _Toc237879104 \h </w:instrText>
         </w:r>
         <w:r>
           <w:rPr>
@@ -4584,7 +4584,7 @@
           <w14:ligatures w14:val="standardContextual"/>
         </w:rPr>
       </w:pPr>
-      <w:hyperlink w:anchor="_Toc237878350" w:history="1">
+      <w:hyperlink w:anchor="_Toc237879105" w:history="1">
         <w:r>
           <w:rPr>
             <w:rStyle w:val="Hyperlink"/>
@@ -4611,7 +4611,7 @@
             <w:noProof/>
             <w:webHidden/>
           </w:rPr>
-          <w:instrText xml:space="preserve"> PAGEREF _Toc237878350 \h </w:instrText>
+          <w:instrText xml:space="preserve"> PAGEREF _Toc237879105 \h </w:instrText>
         </w:r>
         <w:r>
           <w:rPr>
@@ -4657,7 +4657,7 @@
           <w14:ligatures w14:val="standardContextual"/>
         </w:rPr>
       </w:pPr>
-      <w:hyperlink w:anchor="_Toc237878351" w:history="1">
+      <w:hyperlink w:anchor="_Toc237879106" w:history="1">
         <w:r>
           <w:rPr>
             <w:rStyle w:val="Hyperlink"/>
@@ -4684,7 +4684,7 @@
             <w:noProof/>
             <w:webHidden/>
           </w:rPr>
-          <w:instrText xml:space="preserve"> PAGEREF _Toc237878351 \h </w:instrText>
+          <w:instrText xml:space="preserve"> PAGEREF _Toc237879106 \h </w:instrText>
         </w:r>
         <w:r>
           <w:rPr>
@@ -4730,7 +4730,7 @@
           <w14:ligatures w14:val="standardContextual"/>
         </w:rPr>
       </w:pPr>
-      <w:hyperlink w:anchor="_Toc237878352" w:history="1">
+      <w:hyperlink w:anchor="_Toc237879107" w:history="1">
         <w:r>
           <w:rPr>
             <w:rStyle w:val="Hyperlink"/>
@@ -4757,7 +4757,7 @@
             <w:noProof/>
             <w:webHidden/>
           </w:rPr>
-          <w:instrText xml:space="preserve"> PAGEREF _Toc237878352 \h </w:instrText>
+          <w:instrText xml:space="preserve"> PAGEREF _Toc237879107 \h </w:instrText>
         </w:r>
         <w:r>
           <w:rPr>
@@ -4803,7 +4803,7 @@
           <w14:ligatures w14:val="standardContextual"/>
         </w:rPr>
       </w:pPr>
-      <w:hyperlink w:anchor="_Toc237878353" w:history="1">
+      <w:hyperlink w:anchor="_Toc237879108" w:history="1">
         <w:r>
           <w:rPr>
             <w:rStyle w:val="Hyperlink"/>
@@ -4830,7 +4830,7 @@
             <w:noProof/>
             <w:webHidden/>
           </w:rPr>
-          <w:instrText xml:space="preserve"> PAGEREF _Toc237878353 \h </w:instrText>
+          <w:instrText xml:space="preserve"> PAGEREF _Toc237879108 \h </w:instrText>
         </w:r>
         <w:r>
           <w:rPr>
@@ -4876,7 +4876,7 @@
           <w14:ligatures w14:val="standardContextual"/>
         </w:rPr>
       </w:pPr>
-      <w:hyperlink w:anchor="_Toc237878354" w:history="1">
+      <w:hyperlink w:anchor="_Toc237879109" w:history="1">
         <w:r>
           <w:rPr>
             <w:rStyle w:val="Hyperlink"/>
@@ -4903,7 +4903,7 @@
             <w:noProof/>
             <w:webHidden/>
           </w:rPr>
-          <w:instrText xml:space="preserve"> PAGEREF _Toc237878354 \h </w:instrText>
+          <w:instrText xml:space="preserve"> PAGEREF _Toc237879109 \h </w:instrText>
         </w:r>
         <w:r>
           <w:rPr>
@@ -4944,7 +4944,7 @@
         <w:pStyle w:val="Heading1"/>
         <w:pageBreakBefore/>
       </w:pPr>
-      <w:bookmarkStart w:id="0" w:name="_Toc237878288"/>
+      <w:bookmarkStart w:id="0" w:name="_Toc237879043"/>
       <w:r>
         <w:lastRenderedPageBreak/>
         <w:t>Contest Notes</w:t>
@@ -4960,7 +4960,7 @@
       <w:pPr>
         <w:pStyle w:val="Heading2"/>
       </w:pPr>
-      <w:bookmarkStart w:id="1" w:name="_Toc237878289"/>
+      <w:bookmarkStart w:id="1" w:name="_Toc237879044"/>
       <w:r>
         <w:t>Setup &amp; don't-forget</w:t>
       </w:r>
@@ -5503,7 +5503,7 @@
       <w:pPr>
         <w:pStyle w:val="Heading2"/>
       </w:pPr>
-      <w:bookmarkStart w:id="2" w:name="_Toc237878290"/>
+      <w:bookmarkStart w:id="2" w:name="_Toc237879045"/>
       <w:r>
         <w:t>Number theory</w:t>
       </w:r>
@@ -5667,7 +5667,7 @@
       <w:pPr>
         <w:pStyle w:val="Heading2"/>
       </w:pPr>
-      <w:bookmarkStart w:id="3" w:name="_Toc237878291"/>
+      <w:bookmarkStart w:id="3" w:name="_Toc237879046"/>
       <w:r>
         <w:t>Bits</w:t>
       </w:r>
@@ -5846,7 +5846,7 @@
       <w:pPr>
         <w:pStyle w:val="Heading2"/>
       </w:pPr>
-      <w:bookmarkStart w:id="4" w:name="_Toc237878292"/>
+      <w:bookmarkStart w:id="4" w:name="_Toc237879047"/>
       <w:r>
         <w:t>Games (Grundy)</w:t>
       </w:r>
@@ -6044,7 +6044,7 @@
       <w:pPr>
         <w:pStyle w:val="Heading2"/>
       </w:pPr>
-      <w:bookmarkStart w:id="5" w:name="_Toc237878293"/>
+      <w:bookmarkStart w:id="5" w:name="_Toc237879048"/>
       <w:r>
         <w:t>Expected value</w:t>
       </w:r>
@@ -6230,7 +6230,7 @@
       <w:pPr>
         <w:pStyle w:val="Heading2"/>
       </w:pPr>
-      <w:bookmarkStart w:id="6" w:name="_Toc237878294"/>
+      <w:bookmarkStart w:id="6" w:name="_Toc237879049"/>
       <w:r>
         <w:t>Misc</w:t>
       </w:r>
@@ -6294,7 +6294,7 @@
       <w:pPr>
         <w:pStyle w:val="Heading2"/>
       </w:pPr>
-      <w:bookmarkStart w:id="7" w:name="_Toc237878295"/>
+      <w:bookmarkStart w:id="7" w:name="_Toc237879050"/>
       <w:r>
         <w:t>Tricks</w:t>
       </w:r>
@@ -6905,7 +6905,7 @@
           <w:szCs w:val="72"/>
         </w:rPr>
       </w:pPr>
-      <w:bookmarkStart w:id="8" w:name="_Toc237878296"/>
+      <w:bookmarkStart w:id="8" w:name="_Toc237879051"/>
       <w:r>
         <w:rPr>
           <w:sz w:val="72"/>
@@ -6921,7 +6921,7 @@
         <w:pStyle w:val="TemplateHeading"/>
         <w:pageBreakBefore/>
       </w:pPr>
-      <w:bookmarkStart w:id="9" w:name="_Toc237878297"/>
+      <w:bookmarkStart w:id="9" w:name="_Toc237879052"/>
       <w:r>
         <w:lastRenderedPageBreak/>
         <w:t>divisors.cpp</w:t>
@@ -7332,7 +7332,7 @@
         <w:pStyle w:val="TemplateHeading"/>
         <w:pageBreakBefore/>
       </w:pPr>
-      <w:bookmarkStart w:id="10" w:name="_Toc237878298"/>
+      <w:bookmarkStart w:id="10" w:name="_Toc237879053"/>
       <w:r>
         <w:lastRenderedPageBreak/>
         <w:t>euler-phi.cpp</w:t>
@@ -7610,7 +7610,7 @@
         <w:pStyle w:val="TemplateHeading"/>
         <w:pageBreakBefore/>
       </w:pPr>
-      <w:bookmarkStart w:id="11" w:name="_Toc237878299"/>
+      <w:bookmarkStart w:id="11" w:name="_Toc237879054"/>
       <w:r>
         <w:lastRenderedPageBreak/>
         <w:t>ext-gcd-crt.cpp</w:t>
@@ -7986,7 +7986,7 @@
         <w:pStyle w:val="TemplateHeading"/>
         <w:pageBreakBefore/>
       </w:pPr>
-      <w:bookmarkStart w:id="12" w:name="_Toc237878300"/>
+      <w:bookmarkStart w:id="12" w:name="_Toc237879055"/>
       <w:r>
         <w:lastRenderedPageBreak/>
         <w:t>linear-sieve.cpp</w:t>
@@ -8255,7 +8255,7 @@
         <w:pStyle w:val="TemplateHeading"/>
         <w:pageBreakBefore/>
       </w:pPr>
-      <w:bookmarkStart w:id="13" w:name="_Toc237878301"/>
+      <w:bookmarkStart w:id="13" w:name="_Toc237879056"/>
       <w:r>
         <w:lastRenderedPageBreak/>
         <w:t>miller-rabin.cpp</w:t>
@@ -8674,7 +8674,7 @@
         <w:pStyle w:val="TemplateHeading"/>
         <w:pageBreakBefore/>
       </w:pPr>
-      <w:bookmarkStart w:id="14" w:name="_Toc237878302"/>
+      <w:bookmarkStart w:id="14" w:name="_Toc237879057"/>
       <w:r>
         <w:lastRenderedPageBreak/>
         <w:t>sieve.cpp</w:t>
@@ -8961,7 +8961,7 @@
           <w:szCs w:val="72"/>
         </w:rPr>
       </w:pPr>
-      <w:bookmarkStart w:id="15" w:name="_Toc237878303"/>
+      <w:bookmarkStart w:id="15" w:name="_Toc237879058"/>
       <w:r>
         <w:rPr>
           <w:sz w:val="72"/>
@@ -8977,7 +8977,7 @@
         <w:pStyle w:val="TemplateHeading"/>
         <w:pageBreakBefore/>
       </w:pPr>
-      <w:bookmarkStart w:id="16" w:name="_Toc237878304"/>
+      <w:bookmarkStart w:id="16" w:name="_Toc237879059"/>
       <w:r>
         <w:lastRenderedPageBreak/>
         <w:t>combinatorics.cpp</w:t>
@@ -9519,7 +9519,7 @@
         <w:pStyle w:val="TemplateHeading"/>
         <w:pageBreakBefore/>
       </w:pPr>
-      <w:bookmarkStart w:id="17" w:name="_Toc237878305"/>
+      <w:bookmarkStart w:id="17" w:name="_Toc237879060"/>
       <w:r>
         <w:lastRenderedPageBreak/>
         <w:t>euler-pentagonal-partitions.cpp</w:t>
@@ -9769,7 +9769,7 @@
         <w:pStyle w:val="TemplateHeading"/>
         <w:pageBreakBefore/>
       </w:pPr>
-      <w:bookmarkStart w:id="18" w:name="_Toc237878306"/>
+      <w:bookmarkStart w:id="18" w:name="_Toc237879061"/>
       <w:r>
         <w:lastRenderedPageBreak/>
         <w:t>ncr-pascal.cpp</w:t>
@@ -9976,7 +9976,7 @@
           <w:szCs w:val="72"/>
         </w:rPr>
       </w:pPr>
-      <w:bookmarkStart w:id="19" w:name="_Toc237878307"/>
+      <w:bookmarkStart w:id="19" w:name="_Toc237879062"/>
       <w:r>
         <w:rPr>
           <w:sz w:val="72"/>
@@ -9992,7 +9992,7 @@
         <w:pStyle w:val="TemplateHeading"/>
         <w:pageBreakBefore/>
       </w:pPr>
-      <w:bookmarkStart w:id="20" w:name="_Toc237878308"/>
+      <w:bookmarkStart w:id="20" w:name="_Toc237879063"/>
       <w:r>
         <w:lastRenderedPageBreak/>
         <w:t>digit-dp.cpp</w:t>
@@ -10420,7 +10420,7 @@
         <w:pStyle w:val="TemplateHeading"/>
         <w:pageBreakBefore/>
       </w:pPr>
-      <w:bookmarkStart w:id="21" w:name="_Toc237878309"/>
+      <w:bookmarkStart w:id="21" w:name="_Toc237879064"/>
       <w:r>
         <w:lastRenderedPageBreak/>
         <w:t>lis.cpp</w:t>
@@ -10663,7 +10663,7 @@
         <w:pStyle w:val="TemplateHeading"/>
         <w:pageBreakBefore/>
       </w:pPr>
-      <w:bookmarkStart w:id="22" w:name="_Toc237878310"/>
+      <w:bookmarkStart w:id="22" w:name="_Toc237879065"/>
       <w:r>
         <w:lastRenderedPageBreak/>
         <w:t>matrix-exponentiation.cpp</w:t>
@@ -11014,7 +11014,7 @@
         <w:pStyle w:val="TemplateHeading"/>
         <w:pageBreakBefore/>
       </w:pPr>
-      <w:bookmarkStart w:id="23" w:name="_Toc237878311"/>
+      <w:bookmarkStart w:id="23" w:name="_Toc237879066"/>
       <w:r>
         <w:lastRenderedPageBreak/>
         <w:t>rerooting.cpp</w:t>
@@ -11382,7 +11382,7 @@
         <w:pStyle w:val="TemplateHeading"/>
         <w:pageBreakBefore/>
       </w:pPr>
-      <w:bookmarkStart w:id="24" w:name="_Toc237878312"/>
+      <w:bookmarkStart w:id="24" w:name="_Toc237879067"/>
       <w:r>
         <w:lastRenderedPageBreak/>
         <w:t>sos-dp.cpp</w:t>
@@ -11625,7 +11625,7 @@
         <w:pStyle w:val="TemplateHeading"/>
         <w:pageBreakBefore/>
       </w:pPr>
-      <w:bookmarkStart w:id="25" w:name="_Toc237878313"/>
+      <w:bookmarkStart w:id="25" w:name="_Toc237879068"/>
       <w:r>
         <w:lastRenderedPageBreak/>
         <w:t>tree-knapsack.cpp</w:t>
@@ -11957,7 +11957,7 @@
           <w:szCs w:val="72"/>
         </w:rPr>
       </w:pPr>
-      <w:bookmarkStart w:id="26" w:name="_Toc237878314"/>
+      <w:bookmarkStart w:id="26" w:name="_Toc237879069"/>
       <w:r>
         <w:rPr>
           <w:sz w:val="72"/>
@@ -11973,7 +11973,7 @@
         <w:pStyle w:val="TemplateHeading"/>
         <w:pageBreakBefore/>
       </w:pPr>
-      <w:bookmarkStart w:id="27" w:name="_Toc237878315"/>
+      <w:bookmarkStart w:id="27" w:name="_Toc237879070"/>
       <w:r>
         <w:lastRenderedPageBreak/>
         <w:t>articulation-points.cpp</w:t>
@@ -12285,7 +12285,7 @@
         <w:pStyle w:val="TemplateHeading"/>
         <w:pageBreakBefore/>
       </w:pPr>
-      <w:bookmarkStart w:id="28" w:name="_Toc237878316"/>
+      <w:bookmarkStart w:id="28" w:name="_Toc237879071"/>
       <w:r>
         <w:lastRenderedPageBreak/>
         <w:t>bellman-ford.cpp</w:t>
@@ -12607,7 +12607,7 @@
         <w:pStyle w:val="TemplateHeading"/>
         <w:pageBreakBefore/>
       </w:pPr>
-      <w:bookmarkStart w:id="29" w:name="_Toc237878317"/>
+      <w:bookmarkStart w:id="29" w:name="_Toc237879072"/>
       <w:r>
         <w:lastRenderedPageBreak/>
         <w:t>bridges-using-tarjan.cpp</w:t>
@@ -12900,7 +12900,7 @@
         <w:pStyle w:val="TemplateHeading"/>
         <w:pageBreakBefore/>
       </w:pPr>
-      <w:bookmarkStart w:id="30" w:name="_Toc237878318"/>
+      <w:bookmarkStart w:id="30" w:name="_Toc237879073"/>
       <w:r>
         <w:lastRenderedPageBreak/>
         <w:t>bridge-tree.cpp</w:t>
@@ -13462,7 +13462,7 @@
         <w:pStyle w:val="TemplateHeading"/>
         <w:pageBreakBefore/>
       </w:pPr>
-      <w:bookmarkStart w:id="31" w:name="_Toc237878319"/>
+      <w:bookmarkStart w:id="31" w:name="_Toc237879074"/>
       <w:r>
         <w:lastRenderedPageBreak/>
         <w:t>dijkstra.cpp</w:t>
@@ -13763,7 +13763,7 @@
         <w:pStyle w:val="TemplateHeading"/>
         <w:pageBreakBefore/>
       </w:pPr>
-      <w:bookmarkStart w:id="32" w:name="_Toc237878320"/>
+      <w:bookmarkStart w:id="32" w:name="_Toc237879075"/>
       <w:r>
         <w:lastRenderedPageBreak/>
         <w:t>dsu.cpp</w:t>
@@ -14096,7 +14096,7 @@
         <w:pStyle w:val="TemplateHeading"/>
         <w:pageBreakBefore/>
       </w:pPr>
-      <w:bookmarkStart w:id="33" w:name="_Toc237878321"/>
+      <w:bookmarkStart w:id="33" w:name="_Toc237879076"/>
       <w:r>
         <w:lastRenderedPageBreak/>
         <w:t>dsu-rollback.cpp</w:t>
@@ -14512,7 +14512,7 @@
         <w:pStyle w:val="TemplateHeading"/>
         <w:pageBreakBefore/>
       </w:pPr>
-      <w:bookmarkStart w:id="34" w:name="_Toc237878322"/>
+      <w:bookmarkStart w:id="34" w:name="_Toc237879077"/>
       <w:r>
         <w:lastRenderedPageBreak/>
         <w:t>floyd-warshall.cpp</w:t>
@@ -14776,7 +14776,7 @@
         <w:pStyle w:val="TemplateHeading"/>
         <w:pageBreakBefore/>
       </w:pPr>
-      <w:bookmarkStart w:id="35" w:name="_Toc237878323"/>
+      <w:bookmarkStart w:id="35" w:name="_Toc237879078"/>
       <w:r>
         <w:lastRenderedPageBreak/>
         <w:t>hld.cpp</w:t>
@@ -15443,7 +15443,7 @@
         <w:pStyle w:val="TemplateHeading"/>
         <w:pageBreakBefore/>
       </w:pPr>
-      <w:bookmarkStart w:id="36" w:name="_Toc237878324"/>
+      <w:bookmarkStart w:id="36" w:name="_Toc237879079"/>
       <w:r>
         <w:lastRenderedPageBreak/>
         <w:t>lca.cpp</w:t>
@@ -15896,7 +15896,7 @@
         <w:pStyle w:val="TemplateHeading"/>
         <w:pageBreakBefore/>
       </w:pPr>
-      <w:bookmarkStart w:id="37" w:name="_Toc237878325"/>
+      <w:bookmarkStart w:id="37" w:name="_Toc237879080"/>
       <w:r>
         <w:lastRenderedPageBreak/>
         <w:t>mst-kruskal.cpp</w:t>
@@ -16280,7 +16280,7 @@
         <w:pStyle w:val="TemplateHeading"/>
         <w:pageBreakBefore/>
       </w:pPr>
-      <w:bookmarkStart w:id="38" w:name="_Toc237878326"/>
+      <w:bookmarkStart w:id="38" w:name="_Toc237879081"/>
       <w:r>
         <w:lastRenderedPageBreak/>
         <w:t>scc.cpp</w:t>
@@ -16915,7 +16915,7 @@
         <w:pStyle w:val="TemplateHeading"/>
         <w:pageBreakBefore/>
       </w:pPr>
-      <w:bookmarkStart w:id="39" w:name="_Toc237878327"/>
+      <w:bookmarkStart w:id="39" w:name="_Toc237879082"/>
       <w:r>
         <w:lastRenderedPageBreak/>
         <w:t>topological-sort.cpp</w:t>
@@ -17178,7 +17178,7 @@
           <w:szCs w:val="72"/>
         </w:rPr>
       </w:pPr>
-      <w:bookmarkStart w:id="40" w:name="_Toc237878328"/>
+      <w:bookmarkStart w:id="40" w:name="_Toc237879083"/>
       <w:r>
         <w:rPr>
           <w:sz w:val="72"/>
@@ -17194,7 +17194,7 @@
         <w:pStyle w:val="TemplateHeading"/>
         <w:pageBreakBefore/>
       </w:pPr>
-      <w:bookmarkStart w:id="41" w:name="_Toc237878329"/>
+      <w:bookmarkStart w:id="41" w:name="_Toc237879084"/>
       <w:r>
         <w:lastRenderedPageBreak/>
         <w:t>fenwick-tree-updatepoint-queryrange.cpp</w:t>
@@ -17536,7 +17536,7 @@
         <w:pStyle w:val="TemplateHeading"/>
         <w:pageBreakBefore/>
       </w:pPr>
-      <w:bookmarkStart w:id="42" w:name="_Toc237878330"/>
+      <w:bookmarkStart w:id="42" w:name="_Toc237879085"/>
       <w:r>
         <w:lastRenderedPageBreak/>
         <w:t>fenwick-tree-updaterange-querypoint.cpp</w:t>
@@ -17827,7 +17827,7 @@
         <w:pStyle w:val="TemplateHeading"/>
         <w:pageBreakBefore/>
       </w:pPr>
-      <w:bookmarkStart w:id="43" w:name="_Toc237878331"/>
+      <w:bookmarkStart w:id="43" w:name="_Toc237879086"/>
       <w:r>
         <w:lastRenderedPageBreak/>
         <w:t>lazy-seg-tree.cpp</w:t>
@@ -18778,7 +18778,7 @@
         <w:pStyle w:val="TemplateHeading"/>
         <w:pageBreakBefore/>
       </w:pPr>
-      <w:bookmarkStart w:id="44" w:name="_Toc237878332"/>
+      <w:bookmarkStart w:id="44" w:name="_Toc237879087"/>
       <w:r>
         <w:lastRenderedPageBreak/>
         <w:t>mo.cpp</w:t>
@@ -19266,7 +19266,7 @@
         <w:pStyle w:val="TemplateHeading"/>
         <w:pageBreakBefore/>
       </w:pPr>
-      <w:bookmarkStart w:id="45" w:name="_Toc237878333"/>
+      <w:bookmarkStart w:id="45" w:name="_Toc237879088"/>
       <w:r>
         <w:lastRenderedPageBreak/>
         <w:t>mo-on-tree.cpp</w:t>
@@ -20289,7 +20289,7 @@
         <w:pStyle w:val="TemplateHeading"/>
         <w:pageBreakBefore/>
       </w:pPr>
-      <w:bookmarkStart w:id="46" w:name="_Toc237878334"/>
+      <w:bookmarkStart w:id="46" w:name="_Toc237879089"/>
       <w:r>
         <w:lastRenderedPageBreak/>
         <w:t>mo-with-rollback.cpp</w:t>
@@ -20903,7 +20903,7 @@
         <w:pStyle w:val="Code"/>
       </w:pPr>
       <w:r>
-        <w:t xml:space="preserve">                    answer[iq] = ret;</w:t>
+        <w:t xml:space="preserve">                    answer[iq] = ans;</w:t>
       </w:r>
     </w:p>
     <w:p>
@@ -21050,7 +21050,7 @@
         <w:pStyle w:val="TemplateHeading"/>
         <w:pageBreakBefore/>
       </w:pPr>
-      <w:bookmarkStart w:id="47" w:name="_Toc237878335"/>
+      <w:bookmarkStart w:id="47" w:name="_Toc237879090"/>
       <w:r>
         <w:lastRenderedPageBreak/>
         <w:t>seg-tree.cpp</w:t>
@@ -21574,7 +21574,7 @@
         <w:pStyle w:val="TemplateHeading"/>
         <w:pageBreakBefore/>
       </w:pPr>
-      <w:bookmarkStart w:id="48" w:name="_Toc237878336"/>
+      <w:bookmarkStart w:id="48" w:name="_Toc237879091"/>
       <w:r>
         <w:lastRenderedPageBreak/>
         <w:t>seg-tree-iterative.cpp</w:t>
@@ -22059,7 +22059,7 @@
         <w:pStyle w:val="TemplateHeading"/>
         <w:pageBreakBefore/>
       </w:pPr>
-      <w:bookmarkStart w:id="49" w:name="_Toc237878337"/>
+      <w:bookmarkStart w:id="49" w:name="_Toc237879092"/>
       <w:r>
         <w:lastRenderedPageBreak/>
         <w:t>sliding-window-minmax.cpp</w:t>
@@ -22313,7 +22313,7 @@
         <w:pStyle w:val="TemplateHeading"/>
         <w:pageBreakBefore/>
       </w:pPr>
-      <w:bookmarkStart w:id="50" w:name="_Toc237878338"/>
+      <w:bookmarkStart w:id="50" w:name="_Toc237879093"/>
       <w:r>
         <w:lastRenderedPageBreak/>
         <w:t>sparse-table.cpp</w:t>
@@ -22660,7 +22660,7 @@
         <w:pStyle w:val="TemplateHeading"/>
         <w:pageBreakBefore/>
       </w:pPr>
-      <w:bookmarkStart w:id="51" w:name="_Toc237878339"/>
+      <w:bookmarkStart w:id="51" w:name="_Toc237879094"/>
       <w:r>
         <w:lastRenderedPageBreak/>
         <w:t>sqrt-decomposition.cpp</w:t>
@@ -22976,7 +22976,7 @@
           <w:szCs w:val="72"/>
         </w:rPr>
       </w:pPr>
-      <w:bookmarkStart w:id="52" w:name="_Toc237878340"/>
+      <w:bookmarkStart w:id="52" w:name="_Toc237879095"/>
       <w:r>
         <w:rPr>
           <w:sz w:val="72"/>
@@ -22992,7 +22992,7 @@
         <w:pStyle w:val="TemplateHeading"/>
         <w:pageBreakBefore/>
       </w:pPr>
-      <w:bookmarkStart w:id="53" w:name="_Toc237878341"/>
+      <w:bookmarkStart w:id="53" w:name="_Toc237879096"/>
       <w:r>
         <w:lastRenderedPageBreak/>
         <w:t>binary-trie.cpp</w:t>
@@ -23613,7 +23613,7 @@
         <w:pStyle w:val="TemplateHeading"/>
         <w:pageBreakBefore/>
       </w:pPr>
-      <w:bookmarkStart w:id="54" w:name="_Toc237878342"/>
+      <w:bookmarkStart w:id="54" w:name="_Toc237879097"/>
       <w:r>
         <w:lastRenderedPageBreak/>
         <w:t>hashing.cpp</w:t>
@@ -24073,7 +24073,7 @@
         <w:pStyle w:val="TemplateHeading"/>
         <w:pageBreakBefore/>
       </w:pPr>
-      <w:bookmarkStart w:id="55" w:name="_Toc237878343"/>
+      <w:bookmarkStart w:id="55" w:name="_Toc237879098"/>
       <w:r>
         <w:lastRenderedPageBreak/>
         <w:t>kmp.cpp</w:t>
@@ -24369,7 +24369,7 @@
         <w:pStyle w:val="TemplateHeading"/>
         <w:pageBreakBefore/>
       </w:pPr>
-      <w:bookmarkStart w:id="56" w:name="_Toc237878344"/>
+      <w:bookmarkStart w:id="56" w:name="_Toc237879099"/>
       <w:r>
         <w:lastRenderedPageBreak/>
         <w:t>manacher.cpp</w:t>
@@ -24670,7 +24670,7 @@
         <w:pStyle w:val="TemplateHeading"/>
         <w:pageBreakBefore/>
       </w:pPr>
-      <w:bookmarkStart w:id="57" w:name="_Toc237878345"/>
+      <w:bookmarkStart w:id="57" w:name="_Toc237879100"/>
       <w:r>
         <w:lastRenderedPageBreak/>
         <w:t>multiset-hashing.cpp</w:t>
@@ -25062,7 +25062,7 @@
         <w:pStyle w:val="TemplateHeading"/>
         <w:pageBreakBefore/>
       </w:pPr>
-      <w:bookmarkStart w:id="58" w:name="_Toc237878346"/>
+      <w:bookmarkStart w:id="58" w:name="_Toc237879101"/>
       <w:r>
         <w:lastRenderedPageBreak/>
         <w:t>trie.cpp</w:t>
@@ -25688,7 +25688,7 @@
           <w:szCs w:val="72"/>
         </w:rPr>
       </w:pPr>
-      <w:bookmarkStart w:id="59" w:name="_Toc237878347"/>
+      <w:bookmarkStart w:id="59" w:name="_Toc237879102"/>
       <w:r>
         <w:rPr>
           <w:sz w:val="72"/>
@@ -25704,7 +25704,7 @@
         <w:pStyle w:val="TemplateHeading"/>
         <w:pageBreakBefore/>
       </w:pPr>
-      <w:bookmarkStart w:id="60" w:name="_Toc237878348"/>
+      <w:bookmarkStart w:id="60" w:name="_Toc237879103"/>
       <w:r>
         <w:lastRenderedPageBreak/>
         <w:t>closest-pair.cpp</w:t>
@@ -25952,7 +25952,7 @@
         <w:pStyle w:val="TemplateHeading"/>
         <w:pageBreakBefore/>
       </w:pPr>
-      <w:bookmarkStart w:id="61" w:name="_Toc237878349"/>
+      <w:bookmarkStart w:id="61" w:name="_Toc237879104"/>
       <w:r>
         <w:lastRenderedPageBreak/>
         <w:t>geometry-basics.cpp</w:t>
@@ -26507,7 +26507,7 @@
           <w:szCs w:val="72"/>
         </w:rPr>
       </w:pPr>
-      <w:bookmarkStart w:id="62" w:name="_Toc237878350"/>
+      <w:bookmarkStart w:id="62" w:name="_Toc237879105"/>
       <w:r>
         <w:rPr>
           <w:sz w:val="72"/>
@@ -26523,7 +26523,7 @@
         <w:pStyle w:val="TemplateHeading"/>
         <w:pageBreakBefore/>
       </w:pPr>
-      <w:bookmarkStart w:id="63" w:name="_Toc237878351"/>
+      <w:bookmarkStart w:id="63" w:name="_Toc237879106"/>
       <w:r>
         <w:lastRenderedPageBreak/>
         <w:t>bit-tricks.cpp</w:t>
@@ -26771,7 +26771,7 @@
         <w:pStyle w:val="TemplateHeading"/>
         <w:pageBreakBefore/>
       </w:pPr>
-      <w:bookmarkStart w:id="64" w:name="_Toc237878352"/>
+      <w:bookmarkStart w:id="64" w:name="_Toc237879107"/>
       <w:r>
         <w:lastRenderedPageBreak/>
         <w:t>coordinate-compression.cpp</w:t>
@@ -26929,7 +26929,7 @@
         <w:pStyle w:val="TemplateHeading"/>
         <w:pageBreakBefore/>
       </w:pPr>
-      <w:bookmarkStart w:id="65" w:name="_Toc237878353"/>
+      <w:bookmarkStart w:id="65" w:name="_Toc237879108"/>
       <w:r>
         <w:lastRenderedPageBreak/>
         <w:t>ordered-multiset.cpp</w:t>
@@ -27163,7 +27163,7 @@
         <w:pStyle w:val="TemplateHeading"/>
         <w:pageBreakBefore/>
       </w:pPr>
-      <w:bookmarkStart w:id="66" w:name="_Toc237878354"/>
+      <w:bookmarkStart w:id="66" w:name="_Toc237879109"/>
       <w:r>
         <w:lastRenderedPageBreak/>
         <w:t>random.cpp</w:t>

</xml_diff>

<commit_message>
Use human topic titles in the notebook (16pt underlined headings)
'hld.cpp' -> 'Heavy-Light Decomposition (HLD)' etc. across all 51
templates; TOC and page layout re-verified (67/67 entries, one topic
per page, 4 accepted two-pagers).

Co-Authored-By: Claude Fable 5 <noreply@anthropic.com>
</commit_message>
<xml_diff>
--- a/CP-Reference.docx
+++ b/CP-Reference.docx
@@ -50,7 +50,7 @@
       <w:r>
         <w:fldChar w:fldCharType="separate"/>
       </w:r>
-      <w:hyperlink w:anchor="_Toc237879043" w:history="1">
+      <w:hyperlink w:anchor="_Toc237879721" w:history="1">
         <w:r>
           <w:rPr>
             <w:rStyle w:val="Hyperlink"/>
@@ -77,7 +77,7 @@
             <w:noProof/>
             <w:webHidden/>
           </w:rPr>
-          <w:instrText xml:space="preserve"> PAGEREF _Toc237879043 \h </w:instrText>
+          <w:instrText xml:space="preserve"> PAGEREF _Toc237879721 \h </w:instrText>
         </w:r>
         <w:r>
           <w:rPr>
@@ -123,7 +123,7 @@
           <w14:ligatures w14:val="standardContextual"/>
         </w:rPr>
       </w:pPr>
-      <w:hyperlink w:anchor="_Toc237879044" w:history="1">
+      <w:hyperlink w:anchor="_Toc237879722" w:history="1">
         <w:r>
           <w:rPr>
             <w:rStyle w:val="Hyperlink"/>
@@ -150,7 +150,7 @@
             <w:noProof/>
             <w:webHidden/>
           </w:rPr>
-          <w:instrText xml:space="preserve"> PAGEREF _Toc237879044 \h </w:instrText>
+          <w:instrText xml:space="preserve"> PAGEREF _Toc237879722 \h </w:instrText>
         </w:r>
         <w:r>
           <w:rPr>
@@ -196,7 +196,7 @@
           <w14:ligatures w14:val="standardContextual"/>
         </w:rPr>
       </w:pPr>
-      <w:hyperlink w:anchor="_Toc237879045" w:history="1">
+      <w:hyperlink w:anchor="_Toc237879723" w:history="1">
         <w:r>
           <w:rPr>
             <w:rStyle w:val="Hyperlink"/>
@@ -223,7 +223,7 @@
             <w:noProof/>
             <w:webHidden/>
           </w:rPr>
-          <w:instrText xml:space="preserve"> PAGEREF _Toc237879045 \h </w:instrText>
+          <w:instrText xml:space="preserve"> PAGEREF _Toc237879723 \h </w:instrText>
         </w:r>
         <w:r>
           <w:rPr>
@@ -269,7 +269,7 @@
           <w14:ligatures w14:val="standardContextual"/>
         </w:rPr>
       </w:pPr>
-      <w:hyperlink w:anchor="_Toc237879046" w:history="1">
+      <w:hyperlink w:anchor="_Toc237879724" w:history="1">
         <w:r>
           <w:rPr>
             <w:rStyle w:val="Hyperlink"/>
@@ -296,7 +296,7 @@
             <w:noProof/>
             <w:webHidden/>
           </w:rPr>
-          <w:instrText xml:space="preserve"> PAGEREF _Toc237879046 \h </w:instrText>
+          <w:instrText xml:space="preserve"> PAGEREF _Toc237879724 \h </w:instrText>
         </w:r>
         <w:r>
           <w:rPr>
@@ -342,7 +342,7 @@
           <w14:ligatures w14:val="standardContextual"/>
         </w:rPr>
       </w:pPr>
-      <w:hyperlink w:anchor="_Toc237879047" w:history="1">
+      <w:hyperlink w:anchor="_Toc237879725" w:history="1">
         <w:r>
           <w:rPr>
             <w:rStyle w:val="Hyperlink"/>
@@ -369,7 +369,7 @@
             <w:noProof/>
             <w:webHidden/>
           </w:rPr>
-          <w:instrText xml:space="preserve"> PAGEREF _Toc237879047 \h </w:instrText>
+          <w:instrText xml:space="preserve"> PAGEREF _Toc237879725 \h </w:instrText>
         </w:r>
         <w:r>
           <w:rPr>
@@ -415,7 +415,7 @@
           <w14:ligatures w14:val="standardContextual"/>
         </w:rPr>
       </w:pPr>
-      <w:hyperlink w:anchor="_Toc237879048" w:history="1">
+      <w:hyperlink w:anchor="_Toc237879726" w:history="1">
         <w:r>
           <w:rPr>
             <w:rStyle w:val="Hyperlink"/>
@@ -442,7 +442,7 @@
             <w:noProof/>
             <w:webHidden/>
           </w:rPr>
-          <w:instrText xml:space="preserve"> PAGEREF _Toc237879048 \h </w:instrText>
+          <w:instrText xml:space="preserve"> PAGEREF _Toc237879726 \h </w:instrText>
         </w:r>
         <w:r>
           <w:rPr>
@@ -488,7 +488,7 @@
           <w14:ligatures w14:val="standardContextual"/>
         </w:rPr>
       </w:pPr>
-      <w:hyperlink w:anchor="_Toc237879049" w:history="1">
+      <w:hyperlink w:anchor="_Toc237879727" w:history="1">
         <w:r>
           <w:rPr>
             <w:rStyle w:val="Hyperlink"/>
@@ -515,7 +515,7 @@
             <w:noProof/>
             <w:webHidden/>
           </w:rPr>
-          <w:instrText xml:space="preserve"> PAGEREF _Toc237879049 \h </w:instrText>
+          <w:instrText xml:space="preserve"> PAGEREF _Toc237879727 \h </w:instrText>
         </w:r>
         <w:r>
           <w:rPr>
@@ -561,7 +561,7 @@
           <w14:ligatures w14:val="standardContextual"/>
         </w:rPr>
       </w:pPr>
-      <w:hyperlink w:anchor="_Toc237879050" w:history="1">
+      <w:hyperlink w:anchor="_Toc237879728" w:history="1">
         <w:r>
           <w:rPr>
             <w:rStyle w:val="Hyperlink"/>
@@ -588,7 +588,7 @@
             <w:noProof/>
             <w:webHidden/>
           </w:rPr>
-          <w:instrText xml:space="preserve"> PAGEREF _Toc237879050 \h </w:instrText>
+          <w:instrText xml:space="preserve"> PAGEREF _Toc237879728 \h </w:instrText>
         </w:r>
         <w:r>
           <w:rPr>
@@ -635,7 +635,7 @@
           <w14:ligatures w14:val="standardContextual"/>
         </w:rPr>
       </w:pPr>
-      <w:hyperlink w:anchor="_Toc237879051" w:history="1">
+      <w:hyperlink w:anchor="_Toc237879729" w:history="1">
         <w:r>
           <w:rPr>
             <w:rStyle w:val="Hyperlink"/>
@@ -662,7 +662,7 @@
             <w:noProof/>
             <w:webHidden/>
           </w:rPr>
-          <w:instrText xml:space="preserve"> PAGEREF _Toc237879051 \h </w:instrText>
+          <w:instrText xml:space="preserve"> PAGEREF _Toc237879729 \h </w:instrText>
         </w:r>
         <w:r>
           <w:rPr>
@@ -708,13 +708,13 @@
           <w14:ligatures w14:val="standardContextual"/>
         </w:rPr>
       </w:pPr>
-      <w:hyperlink w:anchor="_Toc237879052" w:history="1">
+      <w:hyperlink w:anchor="_Toc237879730" w:history="1">
         <w:r>
           <w:rPr>
             <w:rStyle w:val="Hyperlink"/>
             <w:noProof/>
           </w:rPr>
-          <w:t>divisors.cpp</w:t>
+          <w:t>Divisors</w:t>
         </w:r>
         <w:r>
           <w:rPr>
@@ -735,7 +735,7 @@
             <w:noProof/>
             <w:webHidden/>
           </w:rPr>
-          <w:instrText xml:space="preserve"> PAGEREF _Toc237879052 \h </w:instrText>
+          <w:instrText xml:space="preserve"> PAGEREF _Toc237879730 \h </w:instrText>
         </w:r>
         <w:r>
           <w:rPr>
@@ -781,13 +781,13 @@
           <w14:ligatures w14:val="standardContextual"/>
         </w:rPr>
       </w:pPr>
-      <w:hyperlink w:anchor="_Toc237879053" w:history="1">
+      <w:hyperlink w:anchor="_Toc237879731" w:history="1">
         <w:r>
           <w:rPr>
             <w:rStyle w:val="Hyperlink"/>
             <w:noProof/>
           </w:rPr>
-          <w:t>euler-phi.cpp</w:t>
+          <w:t>Euler's Phi (Totient)</w:t>
         </w:r>
         <w:r>
           <w:rPr>
@@ -808,7 +808,7 @@
             <w:noProof/>
             <w:webHidden/>
           </w:rPr>
-          <w:instrText xml:space="preserve"> PAGEREF _Toc237879053 \h </w:instrText>
+          <w:instrText xml:space="preserve"> PAGEREF _Toc237879731 \h </w:instrText>
         </w:r>
         <w:r>
           <w:rPr>
@@ -854,13 +854,13 @@
           <w14:ligatures w14:val="standardContextual"/>
         </w:rPr>
       </w:pPr>
-      <w:hyperlink w:anchor="_Toc237879054" w:history="1">
+      <w:hyperlink w:anchor="_Toc237879732" w:history="1">
         <w:r>
           <w:rPr>
             <w:rStyle w:val="Hyperlink"/>
             <w:noProof/>
           </w:rPr>
-          <w:t>ext-gcd-crt.cpp</w:t>
+          <w:t>Extended GCD &amp; CRT</w:t>
         </w:r>
         <w:r>
           <w:rPr>
@@ -881,7 +881,7 @@
             <w:noProof/>
             <w:webHidden/>
           </w:rPr>
-          <w:instrText xml:space="preserve"> PAGEREF _Toc237879054 \h </w:instrText>
+          <w:instrText xml:space="preserve"> PAGEREF _Toc237879732 \h </w:instrText>
         </w:r>
         <w:r>
           <w:rPr>
@@ -927,13 +927,13 @@
           <w14:ligatures w14:val="standardContextual"/>
         </w:rPr>
       </w:pPr>
-      <w:hyperlink w:anchor="_Toc237879055" w:history="1">
+      <w:hyperlink w:anchor="_Toc237879733" w:history="1">
         <w:r>
           <w:rPr>
             <w:rStyle w:val="Hyperlink"/>
             <w:noProof/>
           </w:rPr>
-          <w:t>linear-sieve.cpp</w:t>
+          <w:t>Linear Sieve</w:t>
         </w:r>
         <w:r>
           <w:rPr>
@@ -954,7 +954,7 @@
             <w:noProof/>
             <w:webHidden/>
           </w:rPr>
-          <w:instrText xml:space="preserve"> PAGEREF _Toc237879055 \h </w:instrText>
+          <w:instrText xml:space="preserve"> PAGEREF _Toc237879733 \h </w:instrText>
         </w:r>
         <w:r>
           <w:rPr>
@@ -1000,13 +1000,13 @@
           <w14:ligatures w14:val="standardContextual"/>
         </w:rPr>
       </w:pPr>
-      <w:hyperlink w:anchor="_Toc237879056" w:history="1">
+      <w:hyperlink w:anchor="_Toc237879734" w:history="1">
         <w:r>
           <w:rPr>
             <w:rStyle w:val="Hyperlink"/>
             <w:noProof/>
           </w:rPr>
-          <w:t>miller-rabin.cpp</w:t>
+          <w:t>Miller-Rabin Primality</w:t>
         </w:r>
         <w:r>
           <w:rPr>
@@ -1027,7 +1027,7 @@
             <w:noProof/>
             <w:webHidden/>
           </w:rPr>
-          <w:instrText xml:space="preserve"> PAGEREF _Toc237879056 \h </w:instrText>
+          <w:instrText xml:space="preserve"> PAGEREF _Toc237879734 \h </w:instrText>
         </w:r>
         <w:r>
           <w:rPr>
@@ -1073,13 +1073,13 @@
           <w14:ligatures w14:val="standardContextual"/>
         </w:rPr>
       </w:pPr>
-      <w:hyperlink w:anchor="_Toc237879057" w:history="1">
+      <w:hyperlink w:anchor="_Toc237879735" w:history="1">
         <w:r>
           <w:rPr>
             <w:rStyle w:val="Hyperlink"/>
             <w:noProof/>
           </w:rPr>
-          <w:t>sieve.cpp</w:t>
+          <w:t>Sieve of Eratosthenes</w:t>
         </w:r>
         <w:r>
           <w:rPr>
@@ -1100,7 +1100,7 @@
             <w:noProof/>
             <w:webHidden/>
           </w:rPr>
-          <w:instrText xml:space="preserve"> PAGEREF _Toc237879057 \h </w:instrText>
+          <w:instrText xml:space="preserve"> PAGEREF _Toc237879735 \h </w:instrText>
         </w:r>
         <w:r>
           <w:rPr>
@@ -1147,7 +1147,7 @@
           <w14:ligatures w14:val="standardContextual"/>
         </w:rPr>
       </w:pPr>
-      <w:hyperlink w:anchor="_Toc237879058" w:history="1">
+      <w:hyperlink w:anchor="_Toc237879736" w:history="1">
         <w:r>
           <w:rPr>
             <w:rStyle w:val="Hyperlink"/>
@@ -1174,7 +1174,7 @@
             <w:noProof/>
             <w:webHidden/>
           </w:rPr>
-          <w:instrText xml:space="preserve"> PAGEREF _Toc237879058 \h </w:instrText>
+          <w:instrText xml:space="preserve"> PAGEREF _Toc237879736 \h </w:instrText>
         </w:r>
         <w:r>
           <w:rPr>
@@ -1220,13 +1220,13 @@
           <w14:ligatures w14:val="standardContextual"/>
         </w:rPr>
       </w:pPr>
-      <w:hyperlink w:anchor="_Toc237879059" w:history="1">
+      <w:hyperlink w:anchor="_Toc237879737" w:history="1">
         <w:r>
           <w:rPr>
             <w:rStyle w:val="Hyperlink"/>
             <w:noProof/>
           </w:rPr>
-          <w:t>combinatorics.cpp</w:t>
+          <w:t>Combinatorics Toolkit</w:t>
         </w:r>
         <w:r>
           <w:rPr>
@@ -1247,7 +1247,7 @@
             <w:noProof/>
             <w:webHidden/>
           </w:rPr>
-          <w:instrText xml:space="preserve"> PAGEREF _Toc237879059 \h </w:instrText>
+          <w:instrText xml:space="preserve"> PAGEREF _Toc237879737 \h </w:instrText>
         </w:r>
         <w:r>
           <w:rPr>
@@ -1293,13 +1293,13 @@
           <w14:ligatures w14:val="standardContextual"/>
         </w:rPr>
       </w:pPr>
-      <w:hyperlink w:anchor="_Toc237879060" w:history="1">
+      <w:hyperlink w:anchor="_Toc237879738" w:history="1">
         <w:r>
           <w:rPr>
             <w:rStyle w:val="Hyperlink"/>
             <w:noProof/>
           </w:rPr>
-          <w:t>euler-pentagonal-partitions.cpp</w:t>
+          <w:t>Partitions (Pentagonal Theorem)</w:t>
         </w:r>
         <w:r>
           <w:rPr>
@@ -1320,7 +1320,7 @@
             <w:noProof/>
             <w:webHidden/>
           </w:rPr>
-          <w:instrText xml:space="preserve"> PAGEREF _Toc237879060 \h </w:instrText>
+          <w:instrText xml:space="preserve"> PAGEREF _Toc237879738 \h </w:instrText>
         </w:r>
         <w:r>
           <w:rPr>
@@ -1366,13 +1366,13 @@
           <w14:ligatures w14:val="standardContextual"/>
         </w:rPr>
       </w:pPr>
-      <w:hyperlink w:anchor="_Toc237879061" w:history="1">
+      <w:hyperlink w:anchor="_Toc237879739" w:history="1">
         <w:r>
           <w:rPr>
             <w:rStyle w:val="Hyperlink"/>
             <w:noProof/>
           </w:rPr>
-          <w:t>ncr-pascal.cpp</w:t>
+          <w:t>nCr - Pascal's Triangle</w:t>
         </w:r>
         <w:r>
           <w:rPr>
@@ -1393,7 +1393,7 @@
             <w:noProof/>
             <w:webHidden/>
           </w:rPr>
-          <w:instrText xml:space="preserve"> PAGEREF _Toc237879061 \h </w:instrText>
+          <w:instrText xml:space="preserve"> PAGEREF _Toc237879739 \h </w:instrText>
         </w:r>
         <w:r>
           <w:rPr>
@@ -1440,7 +1440,7 @@
           <w14:ligatures w14:val="standardContextual"/>
         </w:rPr>
       </w:pPr>
-      <w:hyperlink w:anchor="_Toc237879062" w:history="1">
+      <w:hyperlink w:anchor="_Toc237879740" w:history="1">
         <w:r>
           <w:rPr>
             <w:rStyle w:val="Hyperlink"/>
@@ -1467,7 +1467,7 @@
             <w:noProof/>
             <w:webHidden/>
           </w:rPr>
-          <w:instrText xml:space="preserve"> PAGEREF _Toc237879062 \h </w:instrText>
+          <w:instrText xml:space="preserve"> PAGEREF _Toc237879740 \h </w:instrText>
         </w:r>
         <w:r>
           <w:rPr>
@@ -1513,13 +1513,13 @@
           <w14:ligatures w14:val="standardContextual"/>
         </w:rPr>
       </w:pPr>
-      <w:hyperlink w:anchor="_Toc237879063" w:history="1">
+      <w:hyperlink w:anchor="_Toc237879741" w:history="1">
         <w:r>
           <w:rPr>
             <w:rStyle w:val="Hyperlink"/>
             <w:noProof/>
           </w:rPr>
-          <w:t>digit-dp.cpp</w:t>
+          <w:t>Digit DP</w:t>
         </w:r>
         <w:r>
           <w:rPr>
@@ -1540,7 +1540,7 @@
             <w:noProof/>
             <w:webHidden/>
           </w:rPr>
-          <w:instrText xml:space="preserve"> PAGEREF _Toc237879063 \h </w:instrText>
+          <w:instrText xml:space="preserve"> PAGEREF _Toc237879741 \h </w:instrText>
         </w:r>
         <w:r>
           <w:rPr>
@@ -1586,13 +1586,13 @@
           <w14:ligatures w14:val="standardContextual"/>
         </w:rPr>
       </w:pPr>
-      <w:hyperlink w:anchor="_Toc237879064" w:history="1">
+      <w:hyperlink w:anchor="_Toc237879742" w:history="1">
         <w:r>
           <w:rPr>
             <w:rStyle w:val="Hyperlink"/>
             <w:noProof/>
           </w:rPr>
-          <w:t>lis.cpp</w:t>
+          <w:t>Longest Increasing Subsequence (LIS)</w:t>
         </w:r>
         <w:r>
           <w:rPr>
@@ -1613,7 +1613,7 @@
             <w:noProof/>
             <w:webHidden/>
           </w:rPr>
-          <w:instrText xml:space="preserve"> PAGEREF _Toc237879064 \h </w:instrText>
+          <w:instrText xml:space="preserve"> PAGEREF _Toc237879742 \h </w:instrText>
         </w:r>
         <w:r>
           <w:rPr>
@@ -1659,13 +1659,13 @@
           <w14:ligatures w14:val="standardContextual"/>
         </w:rPr>
       </w:pPr>
-      <w:hyperlink w:anchor="_Toc237879065" w:history="1">
+      <w:hyperlink w:anchor="_Toc237879743" w:history="1">
         <w:r>
           <w:rPr>
             <w:rStyle w:val="Hyperlink"/>
             <w:noProof/>
           </w:rPr>
-          <w:t>matrix-exponentiation.cpp</w:t>
+          <w:t>Matrix Exponentiation</w:t>
         </w:r>
         <w:r>
           <w:rPr>
@@ -1686,7 +1686,7 @@
             <w:noProof/>
             <w:webHidden/>
           </w:rPr>
-          <w:instrText xml:space="preserve"> PAGEREF _Toc237879065 \h </w:instrText>
+          <w:instrText xml:space="preserve"> PAGEREF _Toc237879743 \h </w:instrText>
         </w:r>
         <w:r>
           <w:rPr>
@@ -1732,13 +1732,13 @@
           <w14:ligatures w14:val="standardContextual"/>
         </w:rPr>
       </w:pPr>
-      <w:hyperlink w:anchor="_Toc237879066" w:history="1">
+      <w:hyperlink w:anchor="_Toc237879744" w:history="1">
         <w:r>
           <w:rPr>
             <w:rStyle w:val="Hyperlink"/>
             <w:noProof/>
           </w:rPr>
-          <w:t>rerooting.cpp</w:t>
+          <w:t>Rerooting</w:t>
         </w:r>
         <w:r>
           <w:rPr>
@@ -1759,7 +1759,7 @@
             <w:noProof/>
             <w:webHidden/>
           </w:rPr>
-          <w:instrText xml:space="preserve"> PAGEREF _Toc237879066 \h </w:instrText>
+          <w:instrText xml:space="preserve"> PAGEREF _Toc237879744 \h </w:instrText>
         </w:r>
         <w:r>
           <w:rPr>
@@ -1805,13 +1805,13 @@
           <w14:ligatures w14:val="standardContextual"/>
         </w:rPr>
       </w:pPr>
-      <w:hyperlink w:anchor="_Toc237879067" w:history="1">
+      <w:hyperlink w:anchor="_Toc237879745" w:history="1">
         <w:r>
           <w:rPr>
             <w:rStyle w:val="Hyperlink"/>
             <w:noProof/>
           </w:rPr>
-          <w:t>sos-dp.cpp</w:t>
+          <w:t>SOS DP (Sum over Subsets)</w:t>
         </w:r>
         <w:r>
           <w:rPr>
@@ -1832,7 +1832,7 @@
             <w:noProof/>
             <w:webHidden/>
           </w:rPr>
-          <w:instrText xml:space="preserve"> PAGEREF _Toc237879067 \h </w:instrText>
+          <w:instrText xml:space="preserve"> PAGEREF _Toc237879745 \h </w:instrText>
         </w:r>
         <w:r>
           <w:rPr>
@@ -1878,13 +1878,13 @@
           <w14:ligatures w14:val="standardContextual"/>
         </w:rPr>
       </w:pPr>
-      <w:hyperlink w:anchor="_Toc237879068" w:history="1">
+      <w:hyperlink w:anchor="_Toc237879746" w:history="1">
         <w:r>
           <w:rPr>
             <w:rStyle w:val="Hyperlink"/>
             <w:noProof/>
           </w:rPr>
-          <w:t>tree-knapsack.cpp</w:t>
+          <w:t>Tree Knapsack</w:t>
         </w:r>
         <w:r>
           <w:rPr>
@@ -1905,7 +1905,7 @@
             <w:noProof/>
             <w:webHidden/>
           </w:rPr>
-          <w:instrText xml:space="preserve"> PAGEREF _Toc237879068 \h </w:instrText>
+          <w:instrText xml:space="preserve"> PAGEREF _Toc237879746 \h </w:instrText>
         </w:r>
         <w:r>
           <w:rPr>
@@ -1952,7 +1952,7 @@
           <w14:ligatures w14:val="standardContextual"/>
         </w:rPr>
       </w:pPr>
-      <w:hyperlink w:anchor="_Toc237879069" w:history="1">
+      <w:hyperlink w:anchor="_Toc237879747" w:history="1">
         <w:r>
           <w:rPr>
             <w:rStyle w:val="Hyperlink"/>
@@ -1979,7 +1979,7 @@
             <w:noProof/>
             <w:webHidden/>
           </w:rPr>
-          <w:instrText xml:space="preserve"> PAGEREF _Toc237879069 \h </w:instrText>
+          <w:instrText xml:space="preserve"> PAGEREF _Toc237879747 \h </w:instrText>
         </w:r>
         <w:r>
           <w:rPr>
@@ -2025,13 +2025,13 @@
           <w14:ligatures w14:val="standardContextual"/>
         </w:rPr>
       </w:pPr>
-      <w:hyperlink w:anchor="_Toc237879070" w:history="1">
+      <w:hyperlink w:anchor="_Toc237879748" w:history="1">
         <w:r>
           <w:rPr>
             <w:rStyle w:val="Hyperlink"/>
             <w:noProof/>
           </w:rPr>
-          <w:t>articulation-points.cpp</w:t>
+          <w:t>Articulation Points</w:t>
         </w:r>
         <w:r>
           <w:rPr>
@@ -2052,7 +2052,7 @@
             <w:noProof/>
             <w:webHidden/>
           </w:rPr>
-          <w:instrText xml:space="preserve"> PAGEREF _Toc237879070 \h </w:instrText>
+          <w:instrText xml:space="preserve"> PAGEREF _Toc237879748 \h </w:instrText>
         </w:r>
         <w:r>
           <w:rPr>
@@ -2098,13 +2098,13 @@
           <w14:ligatures w14:val="standardContextual"/>
         </w:rPr>
       </w:pPr>
-      <w:hyperlink w:anchor="_Toc237879071" w:history="1">
+      <w:hyperlink w:anchor="_Toc237879749" w:history="1">
         <w:r>
           <w:rPr>
             <w:rStyle w:val="Hyperlink"/>
             <w:noProof/>
           </w:rPr>
-          <w:t>bellman-ford.cpp</w:t>
+          <w:t>Bellman-Ford</w:t>
         </w:r>
         <w:r>
           <w:rPr>
@@ -2125,7 +2125,7 @@
             <w:noProof/>
             <w:webHidden/>
           </w:rPr>
-          <w:instrText xml:space="preserve"> PAGEREF _Toc237879071 \h </w:instrText>
+          <w:instrText xml:space="preserve"> PAGEREF _Toc237879749 \h </w:instrText>
         </w:r>
         <w:r>
           <w:rPr>
@@ -2171,13 +2171,13 @@
           <w14:ligatures w14:val="standardContextual"/>
         </w:rPr>
       </w:pPr>
-      <w:hyperlink w:anchor="_Toc237879072" w:history="1">
+      <w:hyperlink w:anchor="_Toc237879750" w:history="1">
         <w:r>
           <w:rPr>
             <w:rStyle w:val="Hyperlink"/>
             <w:noProof/>
           </w:rPr>
-          <w:t>bridges-using-tarjan.cpp</w:t>
+          <w:t>Bridges (Tarjan)</w:t>
         </w:r>
         <w:r>
           <w:rPr>
@@ -2198,7 +2198,7 @@
             <w:noProof/>
             <w:webHidden/>
           </w:rPr>
-          <w:instrText xml:space="preserve"> PAGEREF _Toc237879072 \h </w:instrText>
+          <w:instrText xml:space="preserve"> PAGEREF _Toc237879750 \h </w:instrText>
         </w:r>
         <w:r>
           <w:rPr>
@@ -2244,13 +2244,13 @@
           <w14:ligatures w14:val="standardContextual"/>
         </w:rPr>
       </w:pPr>
-      <w:hyperlink w:anchor="_Toc237879073" w:history="1">
+      <w:hyperlink w:anchor="_Toc237879751" w:history="1">
         <w:r>
           <w:rPr>
             <w:rStyle w:val="Hyperlink"/>
             <w:noProof/>
           </w:rPr>
-          <w:t>bridge-tree.cpp</w:t>
+          <w:t>Bridge Tree</w:t>
         </w:r>
         <w:r>
           <w:rPr>
@@ -2271,7 +2271,7 @@
             <w:noProof/>
             <w:webHidden/>
           </w:rPr>
-          <w:instrText xml:space="preserve"> PAGEREF _Toc237879073 \h </w:instrText>
+          <w:instrText xml:space="preserve"> PAGEREF _Toc237879751 \h </w:instrText>
         </w:r>
         <w:r>
           <w:rPr>
@@ -2317,13 +2317,13 @@
           <w14:ligatures w14:val="standardContextual"/>
         </w:rPr>
       </w:pPr>
-      <w:hyperlink w:anchor="_Toc237879074" w:history="1">
+      <w:hyperlink w:anchor="_Toc237879752" w:history="1">
         <w:r>
           <w:rPr>
             <w:rStyle w:val="Hyperlink"/>
             <w:noProof/>
           </w:rPr>
-          <w:t>dijkstra.cpp</w:t>
+          <w:t>Dijkstra</w:t>
         </w:r>
         <w:r>
           <w:rPr>
@@ -2344,7 +2344,7 @@
             <w:noProof/>
             <w:webHidden/>
           </w:rPr>
-          <w:instrText xml:space="preserve"> PAGEREF _Toc237879074 \h </w:instrText>
+          <w:instrText xml:space="preserve"> PAGEREF _Toc237879752 \h </w:instrText>
         </w:r>
         <w:r>
           <w:rPr>
@@ -2390,13 +2390,13 @@
           <w14:ligatures w14:val="standardContextual"/>
         </w:rPr>
       </w:pPr>
-      <w:hyperlink w:anchor="_Toc237879075" w:history="1">
+      <w:hyperlink w:anchor="_Toc237879753" w:history="1">
         <w:r>
           <w:rPr>
             <w:rStyle w:val="Hyperlink"/>
             <w:noProof/>
           </w:rPr>
-          <w:t>dsu.cpp</w:t>
+          <w:t>DSU (Union-Find)</w:t>
         </w:r>
         <w:r>
           <w:rPr>
@@ -2417,7 +2417,7 @@
             <w:noProof/>
             <w:webHidden/>
           </w:rPr>
-          <w:instrText xml:space="preserve"> PAGEREF _Toc237879075 \h </w:instrText>
+          <w:instrText xml:space="preserve"> PAGEREF _Toc237879753 \h </w:instrText>
         </w:r>
         <w:r>
           <w:rPr>
@@ -2463,13 +2463,13 @@
           <w14:ligatures w14:val="standardContextual"/>
         </w:rPr>
       </w:pPr>
-      <w:hyperlink w:anchor="_Toc237879076" w:history="1">
+      <w:hyperlink w:anchor="_Toc237879754" w:history="1">
         <w:r>
           <w:rPr>
             <w:rStyle w:val="Hyperlink"/>
             <w:noProof/>
           </w:rPr>
-          <w:t>dsu-rollback.cpp</w:t>
+          <w:t>DSU with Rollback</w:t>
         </w:r>
         <w:r>
           <w:rPr>
@@ -2490,7 +2490,7 @@
             <w:noProof/>
             <w:webHidden/>
           </w:rPr>
-          <w:instrText xml:space="preserve"> PAGEREF _Toc237879076 \h </w:instrText>
+          <w:instrText xml:space="preserve"> PAGEREF _Toc237879754 \h </w:instrText>
         </w:r>
         <w:r>
           <w:rPr>
@@ -2536,13 +2536,13 @@
           <w14:ligatures w14:val="standardContextual"/>
         </w:rPr>
       </w:pPr>
-      <w:hyperlink w:anchor="_Toc237879077" w:history="1">
+      <w:hyperlink w:anchor="_Toc237879755" w:history="1">
         <w:r>
           <w:rPr>
             <w:rStyle w:val="Hyperlink"/>
             <w:noProof/>
           </w:rPr>
-          <w:t>floyd-warshall.cpp</w:t>
+          <w:t>Floyd-Warshall</w:t>
         </w:r>
         <w:r>
           <w:rPr>
@@ -2563,7 +2563,7 @@
             <w:noProof/>
             <w:webHidden/>
           </w:rPr>
-          <w:instrText xml:space="preserve"> PAGEREF _Toc237879077 \h </w:instrText>
+          <w:instrText xml:space="preserve"> PAGEREF _Toc237879755 \h </w:instrText>
         </w:r>
         <w:r>
           <w:rPr>
@@ -2609,13 +2609,13 @@
           <w14:ligatures w14:val="standardContextual"/>
         </w:rPr>
       </w:pPr>
-      <w:hyperlink w:anchor="_Toc237879078" w:history="1">
+      <w:hyperlink w:anchor="_Toc237879756" w:history="1">
         <w:r>
           <w:rPr>
             <w:rStyle w:val="Hyperlink"/>
             <w:noProof/>
           </w:rPr>
-          <w:t>hld.cpp</w:t>
+          <w:t>Heavy-Light Decomposition (HLD)</w:t>
         </w:r>
         <w:r>
           <w:rPr>
@@ -2636,7 +2636,7 @@
             <w:noProof/>
             <w:webHidden/>
           </w:rPr>
-          <w:instrText xml:space="preserve"> PAGEREF _Toc237879078 \h </w:instrText>
+          <w:instrText xml:space="preserve"> PAGEREF _Toc237879756 \h </w:instrText>
         </w:r>
         <w:r>
           <w:rPr>
@@ -2682,13 +2682,13 @@
           <w14:ligatures w14:val="standardContextual"/>
         </w:rPr>
       </w:pPr>
-      <w:hyperlink w:anchor="_Toc237879079" w:history="1">
+      <w:hyperlink w:anchor="_Toc237879757" w:history="1">
         <w:r>
           <w:rPr>
             <w:rStyle w:val="Hyperlink"/>
             <w:noProof/>
           </w:rPr>
-          <w:t>lca.cpp</w:t>
+          <w:t>LCA (Binary Lifting)</w:t>
         </w:r>
         <w:r>
           <w:rPr>
@@ -2709,7 +2709,7 @@
             <w:noProof/>
             <w:webHidden/>
           </w:rPr>
-          <w:instrText xml:space="preserve"> PAGEREF _Toc237879079 \h </w:instrText>
+          <w:instrText xml:space="preserve"> PAGEREF _Toc237879757 \h </w:instrText>
         </w:r>
         <w:r>
           <w:rPr>
@@ -2755,13 +2755,13 @@
           <w14:ligatures w14:val="standardContextual"/>
         </w:rPr>
       </w:pPr>
-      <w:hyperlink w:anchor="_Toc237879080" w:history="1">
+      <w:hyperlink w:anchor="_Toc237879758" w:history="1">
         <w:r>
           <w:rPr>
             <w:rStyle w:val="Hyperlink"/>
             <w:noProof/>
           </w:rPr>
-          <w:t>mst-kruskal.cpp</w:t>
+          <w:t>MST (Kruskal)</w:t>
         </w:r>
         <w:r>
           <w:rPr>
@@ -2782,7 +2782,7 @@
             <w:noProof/>
             <w:webHidden/>
           </w:rPr>
-          <w:instrText xml:space="preserve"> PAGEREF _Toc237879080 \h </w:instrText>
+          <w:instrText xml:space="preserve"> PAGEREF _Toc237879758 \h </w:instrText>
         </w:r>
         <w:r>
           <w:rPr>
@@ -2828,13 +2828,13 @@
           <w14:ligatures w14:val="standardContextual"/>
         </w:rPr>
       </w:pPr>
-      <w:hyperlink w:anchor="_Toc237879081" w:history="1">
+      <w:hyperlink w:anchor="_Toc237879759" w:history="1">
         <w:r>
           <w:rPr>
             <w:rStyle w:val="Hyperlink"/>
             <w:noProof/>
           </w:rPr>
-          <w:t>scc.cpp</w:t>
+          <w:t>Strongly Connected Components (SCC)</w:t>
         </w:r>
         <w:r>
           <w:rPr>
@@ -2855,7 +2855,7 @@
             <w:noProof/>
             <w:webHidden/>
           </w:rPr>
-          <w:instrText xml:space="preserve"> PAGEREF _Toc237879081 \h </w:instrText>
+          <w:instrText xml:space="preserve"> PAGEREF _Toc237879759 \h </w:instrText>
         </w:r>
         <w:r>
           <w:rPr>
@@ -2901,13 +2901,13 @@
           <w14:ligatures w14:val="standardContextual"/>
         </w:rPr>
       </w:pPr>
-      <w:hyperlink w:anchor="_Toc237879082" w:history="1">
+      <w:hyperlink w:anchor="_Toc237879760" w:history="1">
         <w:r>
           <w:rPr>
             <w:rStyle w:val="Hyperlink"/>
             <w:noProof/>
           </w:rPr>
-          <w:t>topological-sort.cpp</w:t>
+          <w:t>Topological Sort</w:t>
         </w:r>
         <w:r>
           <w:rPr>
@@ -2928,7 +2928,7 @@
             <w:noProof/>
             <w:webHidden/>
           </w:rPr>
-          <w:instrText xml:space="preserve"> PAGEREF _Toc237879082 \h </w:instrText>
+          <w:instrText xml:space="preserve"> PAGEREF _Toc237879760 \h </w:instrText>
         </w:r>
         <w:r>
           <w:rPr>
@@ -2975,7 +2975,7 @@
           <w14:ligatures w14:val="standardContextual"/>
         </w:rPr>
       </w:pPr>
-      <w:hyperlink w:anchor="_Toc237879083" w:history="1">
+      <w:hyperlink w:anchor="_Toc237879761" w:history="1">
         <w:r>
           <w:rPr>
             <w:rStyle w:val="Hyperlink"/>
@@ -3002,7 +3002,7 @@
             <w:noProof/>
             <w:webHidden/>
           </w:rPr>
-          <w:instrText xml:space="preserve"> PAGEREF _Toc237879083 \h </w:instrText>
+          <w:instrText xml:space="preserve"> PAGEREF _Toc237879761 \h </w:instrText>
         </w:r>
         <w:r>
           <w:rPr>
@@ -3048,13 +3048,13 @@
           <w14:ligatures w14:val="standardContextual"/>
         </w:rPr>
       </w:pPr>
-      <w:hyperlink w:anchor="_Toc237879084" w:history="1">
+      <w:hyperlink w:anchor="_Toc237879762" w:history="1">
         <w:r>
           <w:rPr>
             <w:rStyle w:val="Hyperlink"/>
             <w:noProof/>
           </w:rPr>
-          <w:t>fenwick-tree-updatepoint-queryrange.cpp</w:t>
+          <w:t>Fenwick Tree (Point Update, Range Query)</w:t>
         </w:r>
         <w:r>
           <w:rPr>
@@ -3075,7 +3075,7 @@
             <w:noProof/>
             <w:webHidden/>
           </w:rPr>
-          <w:instrText xml:space="preserve"> PAGEREF _Toc237879084 \h </w:instrText>
+          <w:instrText xml:space="preserve"> PAGEREF _Toc237879762 \h </w:instrText>
         </w:r>
         <w:r>
           <w:rPr>
@@ -3121,13 +3121,13 @@
           <w14:ligatures w14:val="standardContextual"/>
         </w:rPr>
       </w:pPr>
-      <w:hyperlink w:anchor="_Toc237879085" w:history="1">
+      <w:hyperlink w:anchor="_Toc237879763" w:history="1">
         <w:r>
           <w:rPr>
             <w:rStyle w:val="Hyperlink"/>
             <w:noProof/>
           </w:rPr>
-          <w:t>fenwick-tree-updaterange-querypoint.cpp</w:t>
+          <w:t>Fenwick Tree (Range Update, Point Query)</w:t>
         </w:r>
         <w:r>
           <w:rPr>
@@ -3148,7 +3148,7 @@
             <w:noProof/>
             <w:webHidden/>
           </w:rPr>
-          <w:instrText xml:space="preserve"> PAGEREF _Toc237879085 \h </w:instrText>
+          <w:instrText xml:space="preserve"> PAGEREF _Toc237879763 \h </w:instrText>
         </w:r>
         <w:r>
           <w:rPr>
@@ -3194,13 +3194,13 @@
           <w14:ligatures w14:val="standardContextual"/>
         </w:rPr>
       </w:pPr>
-      <w:hyperlink w:anchor="_Toc237879086" w:history="1">
+      <w:hyperlink w:anchor="_Toc237879764" w:history="1">
         <w:r>
           <w:rPr>
             <w:rStyle w:val="Hyperlink"/>
             <w:noProof/>
           </w:rPr>
-          <w:t>lazy-seg-tree.cpp</w:t>
+          <w:t>Lazy Segment Tree</w:t>
         </w:r>
         <w:r>
           <w:rPr>
@@ -3221,7 +3221,7 @@
             <w:noProof/>
             <w:webHidden/>
           </w:rPr>
-          <w:instrText xml:space="preserve"> PAGEREF _Toc237879086 \h </w:instrText>
+          <w:instrText xml:space="preserve"> PAGEREF _Toc237879764 \h </w:instrText>
         </w:r>
         <w:r>
           <w:rPr>
@@ -3267,13 +3267,13 @@
           <w14:ligatures w14:val="standardContextual"/>
         </w:rPr>
       </w:pPr>
-      <w:hyperlink w:anchor="_Toc237879087" w:history="1">
+      <w:hyperlink w:anchor="_Toc237879765" w:history="1">
         <w:r>
           <w:rPr>
             <w:rStyle w:val="Hyperlink"/>
             <w:noProof/>
           </w:rPr>
-          <w:t>mo.cpp</w:t>
+          <w:t>Mo's Algorithm</w:t>
         </w:r>
         <w:r>
           <w:rPr>
@@ -3294,7 +3294,7 @@
             <w:noProof/>
             <w:webHidden/>
           </w:rPr>
-          <w:instrText xml:space="preserve"> PAGEREF _Toc237879087 \h </w:instrText>
+          <w:instrText xml:space="preserve"> PAGEREF _Toc237879765 \h </w:instrText>
         </w:r>
         <w:r>
           <w:rPr>
@@ -3340,13 +3340,13 @@
           <w14:ligatures w14:val="standardContextual"/>
         </w:rPr>
       </w:pPr>
-      <w:hyperlink w:anchor="_Toc237879088" w:history="1">
+      <w:hyperlink w:anchor="_Toc237879766" w:history="1">
         <w:r>
           <w:rPr>
             <w:rStyle w:val="Hyperlink"/>
             <w:noProof/>
           </w:rPr>
-          <w:t>mo-on-tree.cpp</w:t>
+          <w:t>Mo on Tree</w:t>
         </w:r>
         <w:r>
           <w:rPr>
@@ -3367,7 +3367,7 @@
             <w:noProof/>
             <w:webHidden/>
           </w:rPr>
-          <w:instrText xml:space="preserve"> PAGEREF _Toc237879088 \h </w:instrText>
+          <w:instrText xml:space="preserve"> PAGEREF _Toc237879766 \h </w:instrText>
         </w:r>
         <w:r>
           <w:rPr>
@@ -3413,13 +3413,13 @@
           <w14:ligatures w14:val="standardContextual"/>
         </w:rPr>
       </w:pPr>
-      <w:hyperlink w:anchor="_Toc237879089" w:history="1">
+      <w:hyperlink w:anchor="_Toc237879767" w:history="1">
         <w:r>
           <w:rPr>
             <w:rStyle w:val="Hyperlink"/>
             <w:noProof/>
           </w:rPr>
-          <w:t>mo-with-rollback.cpp</w:t>
+          <w:t>Mo with Rollback</w:t>
         </w:r>
         <w:r>
           <w:rPr>
@@ -3440,7 +3440,7 @@
             <w:noProof/>
             <w:webHidden/>
           </w:rPr>
-          <w:instrText xml:space="preserve"> PAGEREF _Toc237879089 \h </w:instrText>
+          <w:instrText xml:space="preserve"> PAGEREF _Toc237879767 \h </w:instrText>
         </w:r>
         <w:r>
           <w:rPr>
@@ -3486,13 +3486,13 @@
           <w14:ligatures w14:val="standardContextual"/>
         </w:rPr>
       </w:pPr>
-      <w:hyperlink w:anchor="_Toc237879090" w:history="1">
+      <w:hyperlink w:anchor="_Toc237879768" w:history="1">
         <w:r>
           <w:rPr>
             <w:rStyle w:val="Hyperlink"/>
             <w:noProof/>
           </w:rPr>
-          <w:t>seg-tree.cpp</w:t>
+          <w:t>Segment Tree</w:t>
         </w:r>
         <w:r>
           <w:rPr>
@@ -3513,7 +3513,7 @@
             <w:noProof/>
             <w:webHidden/>
           </w:rPr>
-          <w:instrText xml:space="preserve"> PAGEREF _Toc237879090 \h </w:instrText>
+          <w:instrText xml:space="preserve"> PAGEREF _Toc237879768 \h </w:instrText>
         </w:r>
         <w:r>
           <w:rPr>
@@ -3559,13 +3559,13 @@
           <w14:ligatures w14:val="standardContextual"/>
         </w:rPr>
       </w:pPr>
-      <w:hyperlink w:anchor="_Toc237879091" w:history="1">
+      <w:hyperlink w:anchor="_Toc237879769" w:history="1">
         <w:r>
           <w:rPr>
             <w:rStyle w:val="Hyperlink"/>
             <w:noProof/>
           </w:rPr>
-          <w:t>seg-tree-iterative.cpp</w:t>
+          <w:t>Segment Tree (Iterative)</w:t>
         </w:r>
         <w:r>
           <w:rPr>
@@ -3586,7 +3586,7 @@
             <w:noProof/>
             <w:webHidden/>
           </w:rPr>
-          <w:instrText xml:space="preserve"> PAGEREF _Toc237879091 \h </w:instrText>
+          <w:instrText xml:space="preserve"> PAGEREF _Toc237879769 \h </w:instrText>
         </w:r>
         <w:r>
           <w:rPr>
@@ -3632,13 +3632,13 @@
           <w14:ligatures w14:val="standardContextual"/>
         </w:rPr>
       </w:pPr>
-      <w:hyperlink w:anchor="_Toc237879092" w:history="1">
+      <w:hyperlink w:anchor="_Toc237879770" w:history="1">
         <w:r>
           <w:rPr>
             <w:rStyle w:val="Hyperlink"/>
             <w:noProof/>
           </w:rPr>
-          <w:t>sliding-window-minmax.cpp</w:t>
+          <w:t>Sliding Window Min/Max</w:t>
         </w:r>
         <w:r>
           <w:rPr>
@@ -3659,7 +3659,7 @@
             <w:noProof/>
             <w:webHidden/>
           </w:rPr>
-          <w:instrText xml:space="preserve"> PAGEREF _Toc237879092 \h </w:instrText>
+          <w:instrText xml:space="preserve"> PAGEREF _Toc237879770 \h </w:instrText>
         </w:r>
         <w:r>
           <w:rPr>
@@ -3705,13 +3705,13 @@
           <w14:ligatures w14:val="standardContextual"/>
         </w:rPr>
       </w:pPr>
-      <w:hyperlink w:anchor="_Toc237879093" w:history="1">
+      <w:hyperlink w:anchor="_Toc237879771" w:history="1">
         <w:r>
           <w:rPr>
             <w:rStyle w:val="Hyperlink"/>
             <w:noProof/>
           </w:rPr>
-          <w:t>sparse-table.cpp</w:t>
+          <w:t>Sparse Table</w:t>
         </w:r>
         <w:r>
           <w:rPr>
@@ -3732,7 +3732,7 @@
             <w:noProof/>
             <w:webHidden/>
           </w:rPr>
-          <w:instrText xml:space="preserve"> PAGEREF _Toc237879093 \h </w:instrText>
+          <w:instrText xml:space="preserve"> PAGEREF _Toc237879771 \h </w:instrText>
         </w:r>
         <w:r>
           <w:rPr>
@@ -3778,13 +3778,13 @@
           <w14:ligatures w14:val="standardContextual"/>
         </w:rPr>
       </w:pPr>
-      <w:hyperlink w:anchor="_Toc237879094" w:history="1">
+      <w:hyperlink w:anchor="_Toc237879772" w:history="1">
         <w:r>
           <w:rPr>
             <w:rStyle w:val="Hyperlink"/>
             <w:noProof/>
           </w:rPr>
-          <w:t>sqrt-decomposition.cpp</w:t>
+          <w:t>Sqrt Decomposition</w:t>
         </w:r>
         <w:r>
           <w:rPr>
@@ -3805,7 +3805,7 @@
             <w:noProof/>
             <w:webHidden/>
           </w:rPr>
-          <w:instrText xml:space="preserve"> PAGEREF _Toc237879094 \h </w:instrText>
+          <w:instrText xml:space="preserve"> PAGEREF _Toc237879772 \h </w:instrText>
         </w:r>
         <w:r>
           <w:rPr>
@@ -3852,7 +3852,7 @@
           <w14:ligatures w14:val="standardContextual"/>
         </w:rPr>
       </w:pPr>
-      <w:hyperlink w:anchor="_Toc237879095" w:history="1">
+      <w:hyperlink w:anchor="_Toc237879773" w:history="1">
         <w:r>
           <w:rPr>
             <w:rStyle w:val="Hyperlink"/>
@@ -3879,7 +3879,7 @@
             <w:noProof/>
             <w:webHidden/>
           </w:rPr>
-          <w:instrText xml:space="preserve"> PAGEREF _Toc237879095 \h </w:instrText>
+          <w:instrText xml:space="preserve"> PAGEREF _Toc237879773 \h </w:instrText>
         </w:r>
         <w:r>
           <w:rPr>
@@ -3925,13 +3925,13 @@
           <w14:ligatures w14:val="standardContextual"/>
         </w:rPr>
       </w:pPr>
-      <w:hyperlink w:anchor="_Toc237879096" w:history="1">
+      <w:hyperlink w:anchor="_Toc237879774" w:history="1">
         <w:r>
           <w:rPr>
             <w:rStyle w:val="Hyperlink"/>
             <w:noProof/>
           </w:rPr>
-          <w:t>binary-trie.cpp</w:t>
+          <w:t>Binary Trie (XOR)</w:t>
         </w:r>
         <w:r>
           <w:rPr>
@@ -3952,7 +3952,7 @@
             <w:noProof/>
             <w:webHidden/>
           </w:rPr>
-          <w:instrText xml:space="preserve"> PAGEREF _Toc237879096 \h </w:instrText>
+          <w:instrText xml:space="preserve"> PAGEREF _Toc237879774 \h </w:instrText>
         </w:r>
         <w:r>
           <w:rPr>
@@ -3998,13 +3998,13 @@
           <w14:ligatures w14:val="standardContextual"/>
         </w:rPr>
       </w:pPr>
-      <w:hyperlink w:anchor="_Toc237879097" w:history="1">
+      <w:hyperlink w:anchor="_Toc237879775" w:history="1">
         <w:r>
           <w:rPr>
             <w:rStyle w:val="Hyperlink"/>
             <w:noProof/>
           </w:rPr>
-          <w:t>hashing.cpp</w:t>
+          <w:t>String Hashing</w:t>
         </w:r>
         <w:r>
           <w:rPr>
@@ -4025,7 +4025,7 @@
             <w:noProof/>
             <w:webHidden/>
           </w:rPr>
-          <w:instrText xml:space="preserve"> PAGEREF _Toc237879097 \h </w:instrText>
+          <w:instrText xml:space="preserve"> PAGEREF _Toc237879775 \h </w:instrText>
         </w:r>
         <w:r>
           <w:rPr>
@@ -4071,13 +4071,13 @@
           <w14:ligatures w14:val="standardContextual"/>
         </w:rPr>
       </w:pPr>
-      <w:hyperlink w:anchor="_Toc237879098" w:history="1">
+      <w:hyperlink w:anchor="_Toc237879776" w:history="1">
         <w:r>
           <w:rPr>
             <w:rStyle w:val="Hyperlink"/>
             <w:noProof/>
           </w:rPr>
-          <w:t>kmp.cpp</w:t>
+          <w:t>KMP (Prefix Function)</w:t>
         </w:r>
         <w:r>
           <w:rPr>
@@ -4098,7 +4098,7 @@
             <w:noProof/>
             <w:webHidden/>
           </w:rPr>
-          <w:instrText xml:space="preserve"> PAGEREF _Toc237879098 \h </w:instrText>
+          <w:instrText xml:space="preserve"> PAGEREF _Toc237879776 \h </w:instrText>
         </w:r>
         <w:r>
           <w:rPr>
@@ -4144,13 +4144,13 @@
           <w14:ligatures w14:val="standardContextual"/>
         </w:rPr>
       </w:pPr>
-      <w:hyperlink w:anchor="_Toc237879099" w:history="1">
+      <w:hyperlink w:anchor="_Toc237879777" w:history="1">
         <w:r>
           <w:rPr>
             <w:rStyle w:val="Hyperlink"/>
             <w:noProof/>
           </w:rPr>
-          <w:t>manacher.cpp</w:t>
+          <w:t>Manacher (Palindromes)</w:t>
         </w:r>
         <w:r>
           <w:rPr>
@@ -4171,7 +4171,7 @@
             <w:noProof/>
             <w:webHidden/>
           </w:rPr>
-          <w:instrText xml:space="preserve"> PAGEREF _Toc237879099 \h </w:instrText>
+          <w:instrText xml:space="preserve"> PAGEREF _Toc237879777 \h </w:instrText>
         </w:r>
         <w:r>
           <w:rPr>
@@ -4217,13 +4217,13 @@
           <w14:ligatures w14:val="standardContextual"/>
         </w:rPr>
       </w:pPr>
-      <w:hyperlink w:anchor="_Toc237879100" w:history="1">
+      <w:hyperlink w:anchor="_Toc237879778" w:history="1">
         <w:r>
           <w:rPr>
             <w:rStyle w:val="Hyperlink"/>
             <w:noProof/>
           </w:rPr>
-          <w:t>multiset-hashing.cpp</w:t>
+          <w:t>Multiset Hashing</w:t>
         </w:r>
         <w:r>
           <w:rPr>
@@ -4244,7 +4244,7 @@
             <w:noProof/>
             <w:webHidden/>
           </w:rPr>
-          <w:instrText xml:space="preserve"> PAGEREF _Toc237879100 \h </w:instrText>
+          <w:instrText xml:space="preserve"> PAGEREF _Toc237879778 \h </w:instrText>
         </w:r>
         <w:r>
           <w:rPr>
@@ -4290,13 +4290,13 @@
           <w14:ligatures w14:val="standardContextual"/>
         </w:rPr>
       </w:pPr>
-      <w:hyperlink w:anchor="_Toc237879101" w:history="1">
+      <w:hyperlink w:anchor="_Toc237879779" w:history="1">
         <w:r>
           <w:rPr>
             <w:rStyle w:val="Hyperlink"/>
             <w:noProof/>
           </w:rPr>
-          <w:t>trie.cpp</w:t>
+          <w:t>Trie</w:t>
         </w:r>
         <w:r>
           <w:rPr>
@@ -4317,7 +4317,7 @@
             <w:noProof/>
             <w:webHidden/>
           </w:rPr>
-          <w:instrText xml:space="preserve"> PAGEREF _Toc237879101 \h </w:instrText>
+          <w:instrText xml:space="preserve"> PAGEREF _Toc237879779 \h </w:instrText>
         </w:r>
         <w:r>
           <w:rPr>
@@ -4364,7 +4364,7 @@
           <w14:ligatures w14:val="standardContextual"/>
         </w:rPr>
       </w:pPr>
-      <w:hyperlink w:anchor="_Toc237879102" w:history="1">
+      <w:hyperlink w:anchor="_Toc237879780" w:history="1">
         <w:r>
           <w:rPr>
             <w:rStyle w:val="Hyperlink"/>
@@ -4391,7 +4391,7 @@
             <w:noProof/>
             <w:webHidden/>
           </w:rPr>
-          <w:instrText xml:space="preserve"> PAGEREF _Toc237879102 \h </w:instrText>
+          <w:instrText xml:space="preserve"> PAGEREF _Toc237879780 \h </w:instrText>
         </w:r>
         <w:r>
           <w:rPr>
@@ -4437,13 +4437,13 @@
           <w14:ligatures w14:val="standardContextual"/>
         </w:rPr>
       </w:pPr>
-      <w:hyperlink w:anchor="_Toc237879103" w:history="1">
+      <w:hyperlink w:anchor="_Toc237879781" w:history="1">
         <w:r>
           <w:rPr>
             <w:rStyle w:val="Hyperlink"/>
             <w:noProof/>
           </w:rPr>
-          <w:t>closest-pair.cpp</w:t>
+          <w:t>Closest Pair of Points</w:t>
         </w:r>
         <w:r>
           <w:rPr>
@@ -4464,7 +4464,7 @@
             <w:noProof/>
             <w:webHidden/>
           </w:rPr>
-          <w:instrText xml:space="preserve"> PAGEREF _Toc237879103 \h </w:instrText>
+          <w:instrText xml:space="preserve"> PAGEREF _Toc237879781 \h </w:instrText>
         </w:r>
         <w:r>
           <w:rPr>
@@ -4510,13 +4510,13 @@
           <w14:ligatures w14:val="standardContextual"/>
         </w:rPr>
       </w:pPr>
-      <w:hyperlink w:anchor="_Toc237879104" w:history="1">
+      <w:hyperlink w:anchor="_Toc237879782" w:history="1">
         <w:r>
           <w:rPr>
             <w:rStyle w:val="Hyperlink"/>
             <w:noProof/>
           </w:rPr>
-          <w:t>geometry-basics.cpp</w:t>
+          <w:t>Geometry Basics</w:t>
         </w:r>
         <w:r>
           <w:rPr>
@@ -4537,7 +4537,7 @@
             <w:noProof/>
             <w:webHidden/>
           </w:rPr>
-          <w:instrText xml:space="preserve"> PAGEREF _Toc237879104 \h </w:instrText>
+          <w:instrText xml:space="preserve"> PAGEREF _Toc237879782 \h </w:instrText>
         </w:r>
         <w:r>
           <w:rPr>
@@ -4584,7 +4584,7 @@
           <w14:ligatures w14:val="standardContextual"/>
         </w:rPr>
       </w:pPr>
-      <w:hyperlink w:anchor="_Toc237879105" w:history="1">
+      <w:hyperlink w:anchor="_Toc237879783" w:history="1">
         <w:r>
           <w:rPr>
             <w:rStyle w:val="Hyperlink"/>
@@ -4611,7 +4611,7 @@
             <w:noProof/>
             <w:webHidden/>
           </w:rPr>
-          <w:instrText xml:space="preserve"> PAGEREF _Toc237879105 \h </w:instrText>
+          <w:instrText xml:space="preserve"> PAGEREF _Toc237879783 \h </w:instrText>
         </w:r>
         <w:r>
           <w:rPr>
@@ -4657,13 +4657,13 @@
           <w14:ligatures w14:val="standardContextual"/>
         </w:rPr>
       </w:pPr>
-      <w:hyperlink w:anchor="_Toc237879106" w:history="1">
+      <w:hyperlink w:anchor="_Toc237879784" w:history="1">
         <w:r>
           <w:rPr>
             <w:rStyle w:val="Hyperlink"/>
             <w:noProof/>
           </w:rPr>
-          <w:t>bit-tricks.cpp</w:t>
+          <w:t>Bit Tricks</w:t>
         </w:r>
         <w:r>
           <w:rPr>
@@ -4684,7 +4684,7 @@
             <w:noProof/>
             <w:webHidden/>
           </w:rPr>
-          <w:instrText xml:space="preserve"> PAGEREF _Toc237879106 \h </w:instrText>
+          <w:instrText xml:space="preserve"> PAGEREF _Toc237879784 \h </w:instrText>
         </w:r>
         <w:r>
           <w:rPr>
@@ -4730,13 +4730,13 @@
           <w14:ligatures w14:val="standardContextual"/>
         </w:rPr>
       </w:pPr>
-      <w:hyperlink w:anchor="_Toc237879107" w:history="1">
+      <w:hyperlink w:anchor="_Toc237879785" w:history="1">
         <w:r>
           <w:rPr>
             <w:rStyle w:val="Hyperlink"/>
             <w:noProof/>
           </w:rPr>
-          <w:t>coordinate-compression.cpp</w:t>
+          <w:t>Coordinate Compression</w:t>
         </w:r>
         <w:r>
           <w:rPr>
@@ -4757,7 +4757,7 @@
             <w:noProof/>
             <w:webHidden/>
           </w:rPr>
-          <w:instrText xml:space="preserve"> PAGEREF _Toc237879107 \h </w:instrText>
+          <w:instrText xml:space="preserve"> PAGEREF _Toc237879785 \h </w:instrText>
         </w:r>
         <w:r>
           <w:rPr>
@@ -4803,13 +4803,13 @@
           <w14:ligatures w14:val="standardContextual"/>
         </w:rPr>
       </w:pPr>
-      <w:hyperlink w:anchor="_Toc237879108" w:history="1">
+      <w:hyperlink w:anchor="_Toc237879786" w:history="1">
         <w:r>
           <w:rPr>
             <w:rStyle w:val="Hyperlink"/>
             <w:noProof/>
           </w:rPr>
-          <w:t>ordered-multiset.cpp</w:t>
+          <w:t>Ordered Multiset (PBDS)</w:t>
         </w:r>
         <w:r>
           <w:rPr>
@@ -4830,7 +4830,7 @@
             <w:noProof/>
             <w:webHidden/>
           </w:rPr>
-          <w:instrText xml:space="preserve"> PAGEREF _Toc237879108 \h </w:instrText>
+          <w:instrText xml:space="preserve"> PAGEREF _Toc237879786 \h </w:instrText>
         </w:r>
         <w:r>
           <w:rPr>
@@ -4876,13 +4876,13 @@
           <w14:ligatures w14:val="standardContextual"/>
         </w:rPr>
       </w:pPr>
-      <w:hyperlink w:anchor="_Toc237879109" w:history="1">
+      <w:hyperlink w:anchor="_Toc237879787" w:history="1">
         <w:r>
           <w:rPr>
             <w:rStyle w:val="Hyperlink"/>
             <w:noProof/>
           </w:rPr>
-          <w:t>random.cpp</w:t>
+          <w:t>Random (RNG)</w:t>
         </w:r>
         <w:r>
           <w:rPr>
@@ -4903,7 +4903,7 @@
             <w:noProof/>
             <w:webHidden/>
           </w:rPr>
-          <w:instrText xml:space="preserve"> PAGEREF _Toc237879109 \h </w:instrText>
+          <w:instrText xml:space="preserve"> PAGEREF _Toc237879787 \h </w:instrText>
         </w:r>
         <w:r>
           <w:rPr>
@@ -4944,7 +4944,7 @@
         <w:pStyle w:val="Heading1"/>
         <w:pageBreakBefore/>
       </w:pPr>
-      <w:bookmarkStart w:id="0" w:name="_Toc237879043"/>
+      <w:bookmarkStart w:id="0" w:name="_Toc237879721"/>
       <w:r>
         <w:lastRenderedPageBreak/>
         <w:t>Contest Notes</w:t>
@@ -4960,7 +4960,7 @@
       <w:pPr>
         <w:pStyle w:val="Heading2"/>
       </w:pPr>
-      <w:bookmarkStart w:id="1" w:name="_Toc237879044"/>
+      <w:bookmarkStart w:id="1" w:name="_Toc237879722"/>
       <w:r>
         <w:t>Setup &amp; don't-forget</w:t>
       </w:r>
@@ -5503,7 +5503,7 @@
       <w:pPr>
         <w:pStyle w:val="Heading2"/>
       </w:pPr>
-      <w:bookmarkStart w:id="2" w:name="_Toc237879045"/>
+      <w:bookmarkStart w:id="2" w:name="_Toc237879723"/>
       <w:r>
         <w:t>Number theory</w:t>
       </w:r>
@@ -5667,7 +5667,7 @@
       <w:pPr>
         <w:pStyle w:val="Heading2"/>
       </w:pPr>
-      <w:bookmarkStart w:id="3" w:name="_Toc237879046"/>
+      <w:bookmarkStart w:id="3" w:name="_Toc237879724"/>
       <w:r>
         <w:t>Bits</w:t>
       </w:r>
@@ -5846,7 +5846,7 @@
       <w:pPr>
         <w:pStyle w:val="Heading2"/>
       </w:pPr>
-      <w:bookmarkStart w:id="4" w:name="_Toc237879047"/>
+      <w:bookmarkStart w:id="4" w:name="_Toc237879725"/>
       <w:r>
         <w:t>Games (Grundy)</w:t>
       </w:r>
@@ -6044,7 +6044,7 @@
       <w:pPr>
         <w:pStyle w:val="Heading2"/>
       </w:pPr>
-      <w:bookmarkStart w:id="5" w:name="_Toc237879048"/>
+      <w:bookmarkStart w:id="5" w:name="_Toc237879726"/>
       <w:r>
         <w:t>Expected value</w:t>
       </w:r>
@@ -6230,7 +6230,7 @@
       <w:pPr>
         <w:pStyle w:val="Heading2"/>
       </w:pPr>
-      <w:bookmarkStart w:id="6" w:name="_Toc237879049"/>
+      <w:bookmarkStart w:id="6" w:name="_Toc237879727"/>
       <w:r>
         <w:t>Misc</w:t>
       </w:r>
@@ -6294,7 +6294,7 @@
       <w:pPr>
         <w:pStyle w:val="Heading2"/>
       </w:pPr>
-      <w:bookmarkStart w:id="7" w:name="_Toc237879050"/>
+      <w:bookmarkStart w:id="7" w:name="_Toc237879728"/>
       <w:r>
         <w:t>Tricks</w:t>
       </w:r>
@@ -6905,7 +6905,7 @@
           <w:szCs w:val="72"/>
         </w:rPr>
       </w:pPr>
-      <w:bookmarkStart w:id="8" w:name="_Toc237879051"/>
+      <w:bookmarkStart w:id="8" w:name="_Toc237879729"/>
       <w:r>
         <w:rPr>
           <w:sz w:val="72"/>
@@ -6921,10 +6921,10 @@
         <w:pStyle w:val="TemplateHeading"/>
         <w:pageBreakBefore/>
       </w:pPr>
-      <w:bookmarkStart w:id="9" w:name="_Toc237879052"/>
+      <w:bookmarkStart w:id="9" w:name="_Toc237879730"/>
       <w:r>
         <w:lastRenderedPageBreak/>
-        <w:t>divisors.cpp</w:t>
+        <w:t>Divisors</w:t>
       </w:r>
       <w:bookmarkEnd w:id="9"/>
     </w:p>
@@ -7332,10 +7332,10 @@
         <w:pStyle w:val="TemplateHeading"/>
         <w:pageBreakBefore/>
       </w:pPr>
-      <w:bookmarkStart w:id="10" w:name="_Toc237879053"/>
+      <w:bookmarkStart w:id="10" w:name="_Toc237879731"/>
       <w:r>
         <w:lastRenderedPageBreak/>
-        <w:t>euler-phi.cpp</w:t>
+        <w:t>Euler's Phi (Totient)</w:t>
       </w:r>
       <w:bookmarkEnd w:id="10"/>
     </w:p>
@@ -7610,10 +7610,10 @@
         <w:pStyle w:val="TemplateHeading"/>
         <w:pageBreakBefore/>
       </w:pPr>
-      <w:bookmarkStart w:id="11" w:name="_Toc237879054"/>
+      <w:bookmarkStart w:id="11" w:name="_Toc237879732"/>
       <w:r>
         <w:lastRenderedPageBreak/>
-        <w:t>ext-gcd-crt.cpp</w:t>
+        <w:t>Extended GCD &amp; CRT</w:t>
       </w:r>
       <w:bookmarkEnd w:id="11"/>
     </w:p>
@@ -7986,10 +7986,10 @@
         <w:pStyle w:val="TemplateHeading"/>
         <w:pageBreakBefore/>
       </w:pPr>
-      <w:bookmarkStart w:id="12" w:name="_Toc237879055"/>
+      <w:bookmarkStart w:id="12" w:name="_Toc237879733"/>
       <w:r>
         <w:lastRenderedPageBreak/>
-        <w:t>linear-sieve.cpp</w:t>
+        <w:t>Linear Sieve</w:t>
       </w:r>
       <w:bookmarkEnd w:id="12"/>
     </w:p>
@@ -8255,10 +8255,10 @@
         <w:pStyle w:val="TemplateHeading"/>
         <w:pageBreakBefore/>
       </w:pPr>
-      <w:bookmarkStart w:id="13" w:name="_Toc237879056"/>
+      <w:bookmarkStart w:id="13" w:name="_Toc237879734"/>
       <w:r>
         <w:lastRenderedPageBreak/>
-        <w:t>miller-rabin.cpp</w:t>
+        <w:t>Miller-Rabin Primality</w:t>
       </w:r>
       <w:bookmarkEnd w:id="13"/>
     </w:p>
@@ -8674,10 +8674,10 @@
         <w:pStyle w:val="TemplateHeading"/>
         <w:pageBreakBefore/>
       </w:pPr>
-      <w:bookmarkStart w:id="14" w:name="_Toc237879057"/>
+      <w:bookmarkStart w:id="14" w:name="_Toc237879735"/>
       <w:r>
         <w:lastRenderedPageBreak/>
-        <w:t>sieve.cpp</w:t>
+        <w:t>Sieve of Eratosthenes</w:t>
       </w:r>
       <w:bookmarkEnd w:id="14"/>
     </w:p>
@@ -8961,7 +8961,7 @@
           <w:szCs w:val="72"/>
         </w:rPr>
       </w:pPr>
-      <w:bookmarkStart w:id="15" w:name="_Toc237879058"/>
+      <w:bookmarkStart w:id="15" w:name="_Toc237879736"/>
       <w:r>
         <w:rPr>
           <w:sz w:val="72"/>
@@ -8977,10 +8977,10 @@
         <w:pStyle w:val="TemplateHeading"/>
         <w:pageBreakBefore/>
       </w:pPr>
-      <w:bookmarkStart w:id="16" w:name="_Toc237879059"/>
+      <w:bookmarkStart w:id="16" w:name="_Toc237879737"/>
       <w:r>
         <w:lastRenderedPageBreak/>
-        <w:t>combinatorics.cpp</w:t>
+        <w:t>Combinatorics Toolkit</w:t>
       </w:r>
       <w:bookmarkEnd w:id="16"/>
     </w:p>
@@ -9519,10 +9519,10 @@
         <w:pStyle w:val="TemplateHeading"/>
         <w:pageBreakBefore/>
       </w:pPr>
-      <w:bookmarkStart w:id="17" w:name="_Toc237879060"/>
+      <w:bookmarkStart w:id="17" w:name="_Toc237879738"/>
       <w:r>
         <w:lastRenderedPageBreak/>
-        <w:t>euler-pentagonal-partitions.cpp</w:t>
+        <w:t>Partitions (Pentagonal Theorem)</w:t>
       </w:r>
       <w:bookmarkEnd w:id="17"/>
     </w:p>
@@ -9769,10 +9769,10 @@
         <w:pStyle w:val="TemplateHeading"/>
         <w:pageBreakBefore/>
       </w:pPr>
-      <w:bookmarkStart w:id="18" w:name="_Toc237879061"/>
+      <w:bookmarkStart w:id="18" w:name="_Toc237879739"/>
       <w:r>
         <w:lastRenderedPageBreak/>
-        <w:t>ncr-pascal.cpp</w:t>
+        <w:t>nCr - Pascal's Triangle</w:t>
       </w:r>
       <w:bookmarkEnd w:id="18"/>
     </w:p>
@@ -9976,7 +9976,7 @@
           <w:szCs w:val="72"/>
         </w:rPr>
       </w:pPr>
-      <w:bookmarkStart w:id="19" w:name="_Toc237879062"/>
+      <w:bookmarkStart w:id="19" w:name="_Toc237879740"/>
       <w:r>
         <w:rPr>
           <w:sz w:val="72"/>
@@ -9992,10 +9992,10 @@
         <w:pStyle w:val="TemplateHeading"/>
         <w:pageBreakBefore/>
       </w:pPr>
-      <w:bookmarkStart w:id="20" w:name="_Toc237879063"/>
+      <w:bookmarkStart w:id="20" w:name="_Toc237879741"/>
       <w:r>
         <w:lastRenderedPageBreak/>
-        <w:t>digit-dp.cpp</w:t>
+        <w:t>Digit DP</w:t>
       </w:r>
       <w:bookmarkEnd w:id="20"/>
     </w:p>
@@ -10420,10 +10420,10 @@
         <w:pStyle w:val="TemplateHeading"/>
         <w:pageBreakBefore/>
       </w:pPr>
-      <w:bookmarkStart w:id="21" w:name="_Toc237879064"/>
+      <w:bookmarkStart w:id="21" w:name="_Toc237879742"/>
       <w:r>
         <w:lastRenderedPageBreak/>
-        <w:t>lis.cpp</w:t>
+        <w:t>Longest Increasing Subsequence (LIS)</w:t>
       </w:r>
       <w:bookmarkEnd w:id="21"/>
     </w:p>
@@ -10663,10 +10663,10 @@
         <w:pStyle w:val="TemplateHeading"/>
         <w:pageBreakBefore/>
       </w:pPr>
-      <w:bookmarkStart w:id="22" w:name="_Toc237879065"/>
+      <w:bookmarkStart w:id="22" w:name="_Toc237879743"/>
       <w:r>
         <w:lastRenderedPageBreak/>
-        <w:t>matrix-exponentiation.cpp</w:t>
+        <w:t>Matrix Exponentiation</w:t>
       </w:r>
       <w:bookmarkEnd w:id="22"/>
     </w:p>
@@ -11014,10 +11014,10 @@
         <w:pStyle w:val="TemplateHeading"/>
         <w:pageBreakBefore/>
       </w:pPr>
-      <w:bookmarkStart w:id="23" w:name="_Toc237879066"/>
+      <w:bookmarkStart w:id="23" w:name="_Toc237879744"/>
       <w:r>
         <w:lastRenderedPageBreak/>
-        <w:t>rerooting.cpp</w:t>
+        <w:t>Rerooting</w:t>
       </w:r>
       <w:bookmarkEnd w:id="23"/>
     </w:p>
@@ -11382,10 +11382,10 @@
         <w:pStyle w:val="TemplateHeading"/>
         <w:pageBreakBefore/>
       </w:pPr>
-      <w:bookmarkStart w:id="24" w:name="_Toc237879067"/>
+      <w:bookmarkStart w:id="24" w:name="_Toc237879745"/>
       <w:r>
         <w:lastRenderedPageBreak/>
-        <w:t>sos-dp.cpp</w:t>
+        <w:t>SOS DP (Sum over Subsets)</w:t>
       </w:r>
       <w:bookmarkEnd w:id="24"/>
     </w:p>
@@ -11625,10 +11625,10 @@
         <w:pStyle w:val="TemplateHeading"/>
         <w:pageBreakBefore/>
       </w:pPr>
-      <w:bookmarkStart w:id="25" w:name="_Toc237879068"/>
+      <w:bookmarkStart w:id="25" w:name="_Toc237879746"/>
       <w:r>
         <w:lastRenderedPageBreak/>
-        <w:t>tree-knapsack.cpp</w:t>
+        <w:t>Tree Knapsack</w:t>
       </w:r>
       <w:bookmarkEnd w:id="25"/>
     </w:p>
@@ -11957,7 +11957,7 @@
           <w:szCs w:val="72"/>
         </w:rPr>
       </w:pPr>
-      <w:bookmarkStart w:id="26" w:name="_Toc237879069"/>
+      <w:bookmarkStart w:id="26" w:name="_Toc237879747"/>
       <w:r>
         <w:rPr>
           <w:sz w:val="72"/>
@@ -11973,10 +11973,10 @@
         <w:pStyle w:val="TemplateHeading"/>
         <w:pageBreakBefore/>
       </w:pPr>
-      <w:bookmarkStart w:id="27" w:name="_Toc237879070"/>
+      <w:bookmarkStart w:id="27" w:name="_Toc237879748"/>
       <w:r>
         <w:lastRenderedPageBreak/>
-        <w:t>articulation-points.cpp</w:t>
+        <w:t>Articulation Points</w:t>
       </w:r>
       <w:bookmarkEnd w:id="27"/>
     </w:p>
@@ -12285,10 +12285,10 @@
         <w:pStyle w:val="TemplateHeading"/>
         <w:pageBreakBefore/>
       </w:pPr>
-      <w:bookmarkStart w:id="28" w:name="_Toc237879071"/>
+      <w:bookmarkStart w:id="28" w:name="_Toc237879749"/>
       <w:r>
         <w:lastRenderedPageBreak/>
-        <w:t>bellman-ford.cpp</w:t>
+        <w:t>Bellman-Ford</w:t>
       </w:r>
       <w:bookmarkEnd w:id="28"/>
     </w:p>
@@ -12607,10 +12607,10 @@
         <w:pStyle w:val="TemplateHeading"/>
         <w:pageBreakBefore/>
       </w:pPr>
-      <w:bookmarkStart w:id="29" w:name="_Toc237879072"/>
+      <w:bookmarkStart w:id="29" w:name="_Toc237879750"/>
       <w:r>
         <w:lastRenderedPageBreak/>
-        <w:t>bridges-using-tarjan.cpp</w:t>
+        <w:t>Bridges (Tarjan)</w:t>
       </w:r>
       <w:bookmarkEnd w:id="29"/>
     </w:p>
@@ -12900,10 +12900,10 @@
         <w:pStyle w:val="TemplateHeading"/>
         <w:pageBreakBefore/>
       </w:pPr>
-      <w:bookmarkStart w:id="30" w:name="_Toc237879073"/>
+      <w:bookmarkStart w:id="30" w:name="_Toc237879751"/>
       <w:r>
         <w:lastRenderedPageBreak/>
-        <w:t>bridge-tree.cpp</w:t>
+        <w:t>Bridge Tree</w:t>
       </w:r>
       <w:bookmarkEnd w:id="30"/>
     </w:p>
@@ -13462,10 +13462,10 @@
         <w:pStyle w:val="TemplateHeading"/>
         <w:pageBreakBefore/>
       </w:pPr>
-      <w:bookmarkStart w:id="31" w:name="_Toc237879074"/>
+      <w:bookmarkStart w:id="31" w:name="_Toc237879752"/>
       <w:r>
         <w:lastRenderedPageBreak/>
-        <w:t>dijkstra.cpp</w:t>
+        <w:t>Dijkstra</w:t>
       </w:r>
       <w:bookmarkEnd w:id="31"/>
     </w:p>
@@ -13763,10 +13763,10 @@
         <w:pStyle w:val="TemplateHeading"/>
         <w:pageBreakBefore/>
       </w:pPr>
-      <w:bookmarkStart w:id="32" w:name="_Toc237879075"/>
+      <w:bookmarkStart w:id="32" w:name="_Toc237879753"/>
       <w:r>
         <w:lastRenderedPageBreak/>
-        <w:t>dsu.cpp</w:t>
+        <w:t>DSU (Union-Find)</w:t>
       </w:r>
       <w:bookmarkEnd w:id="32"/>
     </w:p>
@@ -14096,10 +14096,10 @@
         <w:pStyle w:val="TemplateHeading"/>
         <w:pageBreakBefore/>
       </w:pPr>
-      <w:bookmarkStart w:id="33" w:name="_Toc237879076"/>
+      <w:bookmarkStart w:id="33" w:name="_Toc237879754"/>
       <w:r>
         <w:lastRenderedPageBreak/>
-        <w:t>dsu-rollback.cpp</w:t>
+        <w:t>DSU with Rollback</w:t>
       </w:r>
       <w:bookmarkEnd w:id="33"/>
     </w:p>
@@ -14512,10 +14512,10 @@
         <w:pStyle w:val="TemplateHeading"/>
         <w:pageBreakBefore/>
       </w:pPr>
-      <w:bookmarkStart w:id="34" w:name="_Toc237879077"/>
+      <w:bookmarkStart w:id="34" w:name="_Toc237879755"/>
       <w:r>
         <w:lastRenderedPageBreak/>
-        <w:t>floyd-warshall.cpp</w:t>
+        <w:t>Floyd-Warshall</w:t>
       </w:r>
       <w:bookmarkEnd w:id="34"/>
     </w:p>
@@ -14776,10 +14776,10 @@
         <w:pStyle w:val="TemplateHeading"/>
         <w:pageBreakBefore/>
       </w:pPr>
-      <w:bookmarkStart w:id="35" w:name="_Toc237879078"/>
+      <w:bookmarkStart w:id="35" w:name="_Toc237879756"/>
       <w:r>
         <w:lastRenderedPageBreak/>
-        <w:t>hld.cpp</w:t>
+        <w:t>Heavy-Light Decomposition (HLD)</w:t>
       </w:r>
       <w:bookmarkEnd w:id="35"/>
     </w:p>
@@ -15374,6 +15374,7 @@
         <w:pStyle w:val="Code"/>
       </w:pPr>
       <w:r>
+        <w:lastRenderedPageBreak/>
         <w:t xml:space="preserve">        }</w:t>
       </w:r>
     </w:p>
@@ -15443,10 +15444,10 @@
         <w:pStyle w:val="TemplateHeading"/>
         <w:pageBreakBefore/>
       </w:pPr>
-      <w:bookmarkStart w:id="36" w:name="_Toc237879079"/>
+      <w:bookmarkStart w:id="36" w:name="_Toc237879757"/>
       <w:r>
         <w:lastRenderedPageBreak/>
-        <w:t>lca.cpp</w:t>
+        <w:t>LCA (Binary Lifting)</w:t>
       </w:r>
       <w:bookmarkEnd w:id="36"/>
     </w:p>
@@ -15896,10 +15897,10 @@
         <w:pStyle w:val="TemplateHeading"/>
         <w:pageBreakBefore/>
       </w:pPr>
-      <w:bookmarkStart w:id="37" w:name="_Toc237879080"/>
+      <w:bookmarkStart w:id="37" w:name="_Toc237879758"/>
       <w:r>
         <w:lastRenderedPageBreak/>
-        <w:t>mst-kruskal.cpp</w:t>
+        <w:t>MST (Kruskal)</w:t>
       </w:r>
       <w:bookmarkEnd w:id="37"/>
     </w:p>
@@ -16280,10 +16281,10 @@
         <w:pStyle w:val="TemplateHeading"/>
         <w:pageBreakBefore/>
       </w:pPr>
-      <w:bookmarkStart w:id="38" w:name="_Toc237879081"/>
+      <w:bookmarkStart w:id="38" w:name="_Toc237879759"/>
       <w:r>
         <w:lastRenderedPageBreak/>
-        <w:t>scc.cpp</w:t>
+        <w:t>Strongly Connected Components (SCC)</w:t>
       </w:r>
       <w:bookmarkEnd w:id="38"/>
     </w:p>
@@ -16915,10 +16916,10 @@
         <w:pStyle w:val="TemplateHeading"/>
         <w:pageBreakBefore/>
       </w:pPr>
-      <w:bookmarkStart w:id="39" w:name="_Toc237879082"/>
+      <w:bookmarkStart w:id="39" w:name="_Toc237879760"/>
       <w:r>
         <w:lastRenderedPageBreak/>
-        <w:t>topological-sort.cpp</w:t>
+        <w:t>Topological Sort</w:t>
       </w:r>
       <w:bookmarkEnd w:id="39"/>
     </w:p>
@@ -17178,7 +17179,7 @@
           <w:szCs w:val="72"/>
         </w:rPr>
       </w:pPr>
-      <w:bookmarkStart w:id="40" w:name="_Toc237879083"/>
+      <w:bookmarkStart w:id="40" w:name="_Toc237879761"/>
       <w:r>
         <w:rPr>
           <w:sz w:val="72"/>
@@ -17194,10 +17195,10 @@
         <w:pStyle w:val="TemplateHeading"/>
         <w:pageBreakBefore/>
       </w:pPr>
-      <w:bookmarkStart w:id="41" w:name="_Toc237879084"/>
+      <w:bookmarkStart w:id="41" w:name="_Toc237879762"/>
       <w:r>
         <w:lastRenderedPageBreak/>
-        <w:t>fenwick-tree-updatepoint-queryrange.cpp</w:t>
+        <w:t>Fenwick Tree (Point Update, Range Query)</w:t>
       </w:r>
       <w:bookmarkEnd w:id="41"/>
     </w:p>
@@ -17536,10 +17537,10 @@
         <w:pStyle w:val="TemplateHeading"/>
         <w:pageBreakBefore/>
       </w:pPr>
-      <w:bookmarkStart w:id="42" w:name="_Toc237879085"/>
+      <w:bookmarkStart w:id="42" w:name="_Toc237879763"/>
       <w:r>
         <w:lastRenderedPageBreak/>
-        <w:t>fenwick-tree-updaterange-querypoint.cpp</w:t>
+        <w:t>Fenwick Tree (Range Update, Point Query)</w:t>
       </w:r>
       <w:bookmarkEnd w:id="42"/>
     </w:p>
@@ -17827,10 +17828,10 @@
         <w:pStyle w:val="TemplateHeading"/>
         <w:pageBreakBefore/>
       </w:pPr>
-      <w:bookmarkStart w:id="43" w:name="_Toc237879086"/>
+      <w:bookmarkStart w:id="43" w:name="_Toc237879764"/>
       <w:r>
         <w:lastRenderedPageBreak/>
-        <w:t>lazy-seg-tree.cpp</w:t>
+        <w:t>Lazy Segment Tree</w:t>
       </w:r>
       <w:bookmarkEnd w:id="43"/>
     </w:p>
@@ -18421,7 +18422,6 @@
         <w:pStyle w:val="Code"/>
       </w:pPr>
       <w:r>
-        <w:lastRenderedPageBreak/>
         <w:t xml:space="preserve">        int mid = (lx + rx) &gt;&gt; 1;</w:t>
       </w:r>
     </w:p>
@@ -18778,10 +18778,10 @@
         <w:pStyle w:val="TemplateHeading"/>
         <w:pageBreakBefore/>
       </w:pPr>
-      <w:bookmarkStart w:id="44" w:name="_Toc237879087"/>
+      <w:bookmarkStart w:id="44" w:name="_Toc237879765"/>
       <w:r>
         <w:lastRenderedPageBreak/>
-        <w:t>mo.cpp</w:t>
+        <w:t>Mo's Algorithm</w:t>
       </w:r>
       <w:bookmarkEnd w:id="44"/>
     </w:p>
@@ -19266,10 +19266,10 @@
         <w:pStyle w:val="TemplateHeading"/>
         <w:pageBreakBefore/>
       </w:pPr>
-      <w:bookmarkStart w:id="45" w:name="_Toc237879088"/>
+      <w:bookmarkStart w:id="45" w:name="_Toc237879766"/>
       <w:r>
         <w:lastRenderedPageBreak/>
-        <w:t>mo-on-tree.cpp</w:t>
+        <w:t>Mo on Tree</w:t>
       </w:r>
       <w:bookmarkEnd w:id="45"/>
     </w:p>
@@ -19872,6 +19872,7 @@
         <w:pStyle w:val="Code"/>
       </w:pPr>
       <w:r>
+        <w:lastRenderedPageBreak/>
         <w:t xml:space="preserve">        return anc[0][u];</w:t>
       </w:r>
     </w:p>
@@ -19880,7 +19881,6 @@
         <w:pStyle w:val="Code"/>
       </w:pPr>
       <w:r>
-        <w:lastRenderedPageBreak/>
         <w:t xml:space="preserve">    };</w:t>
       </w:r>
     </w:p>
@@ -20289,10 +20289,10 @@
         <w:pStyle w:val="TemplateHeading"/>
         <w:pageBreakBefore/>
       </w:pPr>
-      <w:bookmarkStart w:id="46" w:name="_Toc237879089"/>
+      <w:bookmarkStart w:id="46" w:name="_Toc237879767"/>
       <w:r>
         <w:lastRenderedPageBreak/>
-        <w:t>mo-with-rollback.cpp</w:t>
+        <w:t>Mo with Rollback</w:t>
       </w:r>
       <w:bookmarkEnd w:id="46"/>
     </w:p>
@@ -20877,6 +20877,7 @@
         <w:pStyle w:val="Code"/>
       </w:pPr>
       <w:r>
+        <w:lastRenderedPageBreak/>
         <w:t xml:space="preserve">                if (r &lt;= rBlock) {            // tiny query, lives inside the block</w:t>
       </w:r>
     </w:p>
@@ -21050,10 +21051,10 @@
         <w:pStyle w:val="TemplateHeading"/>
         <w:pageBreakBefore/>
       </w:pPr>
-      <w:bookmarkStart w:id="47" w:name="_Toc237879090"/>
+      <w:bookmarkStart w:id="47" w:name="_Toc237879768"/>
       <w:r>
         <w:lastRenderedPageBreak/>
-        <w:t>seg-tree.cpp</w:t>
+        <w:t>Segment Tree</w:t>
       </w:r>
       <w:bookmarkEnd w:id="47"/>
     </w:p>
@@ -21574,10 +21575,10 @@
         <w:pStyle w:val="TemplateHeading"/>
         <w:pageBreakBefore/>
       </w:pPr>
-      <w:bookmarkStart w:id="48" w:name="_Toc237879091"/>
+      <w:bookmarkStart w:id="48" w:name="_Toc237879769"/>
       <w:r>
         <w:lastRenderedPageBreak/>
-        <w:t>seg-tree-iterative.cpp</w:t>
+        <w:t>Segment Tree (Iterative)</w:t>
       </w:r>
       <w:bookmarkEnd w:id="48"/>
     </w:p>
@@ -22059,10 +22060,10 @@
         <w:pStyle w:val="TemplateHeading"/>
         <w:pageBreakBefore/>
       </w:pPr>
-      <w:bookmarkStart w:id="49" w:name="_Toc237879092"/>
+      <w:bookmarkStart w:id="49" w:name="_Toc237879770"/>
       <w:r>
         <w:lastRenderedPageBreak/>
-        <w:t>sliding-window-minmax.cpp</w:t>
+        <w:t>Sliding Window Min/Max</w:t>
       </w:r>
       <w:bookmarkEnd w:id="49"/>
     </w:p>
@@ -22313,10 +22314,10 @@
         <w:pStyle w:val="TemplateHeading"/>
         <w:pageBreakBefore/>
       </w:pPr>
-      <w:bookmarkStart w:id="50" w:name="_Toc237879093"/>
+      <w:bookmarkStart w:id="50" w:name="_Toc237879771"/>
       <w:r>
         <w:lastRenderedPageBreak/>
-        <w:t>sparse-table.cpp</w:t>
+        <w:t>Sparse Table</w:t>
       </w:r>
       <w:bookmarkEnd w:id="50"/>
     </w:p>
@@ -22660,10 +22661,10 @@
         <w:pStyle w:val="TemplateHeading"/>
         <w:pageBreakBefore/>
       </w:pPr>
-      <w:bookmarkStart w:id="51" w:name="_Toc237879094"/>
+      <w:bookmarkStart w:id="51" w:name="_Toc237879772"/>
       <w:r>
         <w:lastRenderedPageBreak/>
-        <w:t>sqrt-decomposition.cpp</w:t>
+        <w:t>Sqrt Decomposition</w:t>
       </w:r>
       <w:bookmarkEnd w:id="51"/>
     </w:p>
@@ -22976,7 +22977,7 @@
           <w:szCs w:val="72"/>
         </w:rPr>
       </w:pPr>
-      <w:bookmarkStart w:id="52" w:name="_Toc237879095"/>
+      <w:bookmarkStart w:id="52" w:name="_Toc237879773"/>
       <w:r>
         <w:rPr>
           <w:sz w:val="72"/>
@@ -22992,10 +22993,10 @@
         <w:pStyle w:val="TemplateHeading"/>
         <w:pageBreakBefore/>
       </w:pPr>
-      <w:bookmarkStart w:id="53" w:name="_Toc237879096"/>
+      <w:bookmarkStart w:id="53" w:name="_Toc237879774"/>
       <w:r>
         <w:lastRenderedPageBreak/>
-        <w:t>binary-trie.cpp</w:t>
+        <w:t>Binary Trie (XOR)</w:t>
       </w:r>
       <w:bookmarkEnd w:id="53"/>
     </w:p>
@@ -23613,10 +23614,10 @@
         <w:pStyle w:val="TemplateHeading"/>
         <w:pageBreakBefore/>
       </w:pPr>
-      <w:bookmarkStart w:id="54" w:name="_Toc237879097"/>
+      <w:bookmarkStart w:id="54" w:name="_Toc237879775"/>
       <w:r>
         <w:lastRenderedPageBreak/>
-        <w:t>hashing.cpp</w:t>
+        <w:t>String Hashing</w:t>
       </w:r>
       <w:bookmarkEnd w:id="54"/>
     </w:p>
@@ -24073,10 +24074,10 @@
         <w:pStyle w:val="TemplateHeading"/>
         <w:pageBreakBefore/>
       </w:pPr>
-      <w:bookmarkStart w:id="55" w:name="_Toc237879098"/>
+      <w:bookmarkStart w:id="55" w:name="_Toc237879776"/>
       <w:r>
         <w:lastRenderedPageBreak/>
-        <w:t>kmp.cpp</w:t>
+        <w:t>KMP (Prefix Function)</w:t>
       </w:r>
       <w:bookmarkEnd w:id="55"/>
     </w:p>
@@ -24369,10 +24370,10 @@
         <w:pStyle w:val="TemplateHeading"/>
         <w:pageBreakBefore/>
       </w:pPr>
-      <w:bookmarkStart w:id="56" w:name="_Toc237879099"/>
+      <w:bookmarkStart w:id="56" w:name="_Toc237879777"/>
       <w:r>
         <w:lastRenderedPageBreak/>
-        <w:t>manacher.cpp</w:t>
+        <w:t>Manacher (Palindromes)</w:t>
       </w:r>
       <w:bookmarkEnd w:id="56"/>
     </w:p>
@@ -24670,10 +24671,10 @@
         <w:pStyle w:val="TemplateHeading"/>
         <w:pageBreakBefore/>
       </w:pPr>
-      <w:bookmarkStart w:id="57" w:name="_Toc237879100"/>
+      <w:bookmarkStart w:id="57" w:name="_Toc237879778"/>
       <w:r>
         <w:lastRenderedPageBreak/>
-        <w:t>multiset-hashing.cpp</w:t>
+        <w:t>Multiset Hashing</w:t>
       </w:r>
       <w:bookmarkEnd w:id="57"/>
     </w:p>
@@ -25062,10 +25063,10 @@
         <w:pStyle w:val="TemplateHeading"/>
         <w:pageBreakBefore/>
       </w:pPr>
-      <w:bookmarkStart w:id="58" w:name="_Toc237879101"/>
+      <w:bookmarkStart w:id="58" w:name="_Toc237879779"/>
       <w:r>
         <w:lastRenderedPageBreak/>
-        <w:t>trie.cpp</w:t>
+        <w:t>Trie</w:t>
       </w:r>
       <w:bookmarkEnd w:id="58"/>
     </w:p>
@@ -25688,7 +25689,7 @@
           <w:szCs w:val="72"/>
         </w:rPr>
       </w:pPr>
-      <w:bookmarkStart w:id="59" w:name="_Toc237879102"/>
+      <w:bookmarkStart w:id="59" w:name="_Toc237879780"/>
       <w:r>
         <w:rPr>
           <w:sz w:val="72"/>
@@ -25704,10 +25705,10 @@
         <w:pStyle w:val="TemplateHeading"/>
         <w:pageBreakBefore/>
       </w:pPr>
-      <w:bookmarkStart w:id="60" w:name="_Toc237879103"/>
+      <w:bookmarkStart w:id="60" w:name="_Toc237879781"/>
       <w:r>
         <w:lastRenderedPageBreak/>
-        <w:t>closest-pair.cpp</w:t>
+        <w:t>Closest Pair of Points</w:t>
       </w:r>
       <w:bookmarkEnd w:id="60"/>
     </w:p>
@@ -25952,10 +25953,10 @@
         <w:pStyle w:val="TemplateHeading"/>
         <w:pageBreakBefore/>
       </w:pPr>
-      <w:bookmarkStart w:id="61" w:name="_Toc237879104"/>
+      <w:bookmarkStart w:id="61" w:name="_Toc237879782"/>
       <w:r>
         <w:lastRenderedPageBreak/>
-        <w:t>geometry-basics.cpp</w:t>
+        <w:t>Geometry Basics</w:t>
       </w:r>
       <w:bookmarkEnd w:id="61"/>
     </w:p>
@@ -26507,7 +26508,7 @@
           <w:szCs w:val="72"/>
         </w:rPr>
       </w:pPr>
-      <w:bookmarkStart w:id="62" w:name="_Toc237879105"/>
+      <w:bookmarkStart w:id="62" w:name="_Toc237879783"/>
       <w:r>
         <w:rPr>
           <w:sz w:val="72"/>
@@ -26523,10 +26524,10 @@
         <w:pStyle w:val="TemplateHeading"/>
         <w:pageBreakBefore/>
       </w:pPr>
-      <w:bookmarkStart w:id="63" w:name="_Toc237879106"/>
+      <w:bookmarkStart w:id="63" w:name="_Toc237879784"/>
       <w:r>
         <w:lastRenderedPageBreak/>
-        <w:t>bit-tricks.cpp</w:t>
+        <w:t>Bit Tricks</w:t>
       </w:r>
       <w:bookmarkEnd w:id="63"/>
     </w:p>
@@ -26771,10 +26772,10 @@
         <w:pStyle w:val="TemplateHeading"/>
         <w:pageBreakBefore/>
       </w:pPr>
-      <w:bookmarkStart w:id="64" w:name="_Toc237879107"/>
+      <w:bookmarkStart w:id="64" w:name="_Toc237879785"/>
       <w:r>
         <w:lastRenderedPageBreak/>
-        <w:t>coordinate-compression.cpp</w:t>
+        <w:t>Coordinate Compression</w:t>
       </w:r>
       <w:bookmarkEnd w:id="64"/>
     </w:p>
@@ -26929,10 +26930,10 @@
         <w:pStyle w:val="TemplateHeading"/>
         <w:pageBreakBefore/>
       </w:pPr>
-      <w:bookmarkStart w:id="65" w:name="_Toc237879108"/>
+      <w:bookmarkStart w:id="65" w:name="_Toc237879786"/>
       <w:r>
         <w:lastRenderedPageBreak/>
-        <w:t>ordered-multiset.cpp</w:t>
+        <w:t>Ordered Multiset (PBDS)</w:t>
       </w:r>
       <w:bookmarkEnd w:id="65"/>
     </w:p>
@@ -27163,10 +27164,10 @@
         <w:pStyle w:val="TemplateHeading"/>
         <w:pageBreakBefore/>
       </w:pPr>
-      <w:bookmarkStart w:id="66" w:name="_Toc237879109"/>
+      <w:bookmarkStart w:id="66" w:name="_Toc237879787"/>
       <w:r>
         <w:lastRenderedPageBreak/>
-        <w:t>random.cpp</w:t>
+        <w:t>Random (RNG)</w:t>
       </w:r>
       <w:bookmarkEnd w:id="66"/>
     </w:p>
@@ -27976,13 +27977,16 @@
     <w:qFormat/>
     <w:pPr>
       <w:keepNext/>
-      <w:spacing w:after="40"/>
+      <w:pBdr>
+        <w:bottom w:val="single" w:sz="8" w:space="2" w:color="404040"/>
+      </w:pBdr>
+      <w:spacing w:after="80"/>
       <w:outlineLvl w:val="1"/>
     </w:pPr>
     <w:rPr>
       <w:b/>
-      <w:sz w:val="22"/>
-      <w:szCs w:val="22"/>
+      <w:sz w:val="32"/>
+      <w:szCs w:val="32"/>
     </w:rPr>
   </w:style>
   <w:style w:type="paragraph" w:customStyle="1" w:styleId="Code">

</xml_diff>

<commit_message>
Add subarray max/min contribution trick to notes
Co-Authored-By: Claude Fable 5 <noreply@anthropic.com>
</commit_message>
<xml_diff>
--- a/CP-Reference.docx
+++ b/CP-Reference.docx
@@ -50,7 +50,7 @@
       <w:r>
         <w:fldChar w:fldCharType="separate"/>
       </w:r>
-      <w:hyperlink w:anchor="_Toc237879721" w:history="1">
+      <w:hyperlink w:anchor="_Toc237946024" w:history="1">
         <w:r>
           <w:rPr>
             <w:rStyle w:val="Hyperlink"/>
@@ -77,7 +77,7 @@
             <w:noProof/>
             <w:webHidden/>
           </w:rPr>
-          <w:instrText xml:space="preserve"> PAGEREF _Toc237879721 \h </w:instrText>
+          <w:instrText xml:space="preserve"> PAGEREF _Toc237946024 \h </w:instrText>
         </w:r>
         <w:r>
           <w:rPr>
@@ -123,7 +123,7 @@
           <w14:ligatures w14:val="standardContextual"/>
         </w:rPr>
       </w:pPr>
-      <w:hyperlink w:anchor="_Toc237879722" w:history="1">
+      <w:hyperlink w:anchor="_Toc237946025" w:history="1">
         <w:r>
           <w:rPr>
             <w:rStyle w:val="Hyperlink"/>
@@ -150,7 +150,7 @@
             <w:noProof/>
             <w:webHidden/>
           </w:rPr>
-          <w:instrText xml:space="preserve"> PAGEREF _Toc237879722 \h </w:instrText>
+          <w:instrText xml:space="preserve"> PAGEREF _Toc237946025 \h </w:instrText>
         </w:r>
         <w:r>
           <w:rPr>
@@ -196,7 +196,7 @@
           <w14:ligatures w14:val="standardContextual"/>
         </w:rPr>
       </w:pPr>
-      <w:hyperlink w:anchor="_Toc237879723" w:history="1">
+      <w:hyperlink w:anchor="_Toc237946026" w:history="1">
         <w:r>
           <w:rPr>
             <w:rStyle w:val="Hyperlink"/>
@@ -223,7 +223,7 @@
             <w:noProof/>
             <w:webHidden/>
           </w:rPr>
-          <w:instrText xml:space="preserve"> PAGEREF _Toc237879723 \h </w:instrText>
+          <w:instrText xml:space="preserve"> PAGEREF _Toc237946026 \h </w:instrText>
         </w:r>
         <w:r>
           <w:rPr>
@@ -269,7 +269,7 @@
           <w14:ligatures w14:val="standardContextual"/>
         </w:rPr>
       </w:pPr>
-      <w:hyperlink w:anchor="_Toc237879724" w:history="1">
+      <w:hyperlink w:anchor="_Toc237946027" w:history="1">
         <w:r>
           <w:rPr>
             <w:rStyle w:val="Hyperlink"/>
@@ -296,7 +296,7 @@
             <w:noProof/>
             <w:webHidden/>
           </w:rPr>
-          <w:instrText xml:space="preserve"> PAGEREF _Toc237879724 \h </w:instrText>
+          <w:instrText xml:space="preserve"> PAGEREF _Toc237946027 \h </w:instrText>
         </w:r>
         <w:r>
           <w:rPr>
@@ -342,7 +342,7 @@
           <w14:ligatures w14:val="standardContextual"/>
         </w:rPr>
       </w:pPr>
-      <w:hyperlink w:anchor="_Toc237879725" w:history="1">
+      <w:hyperlink w:anchor="_Toc237946028" w:history="1">
         <w:r>
           <w:rPr>
             <w:rStyle w:val="Hyperlink"/>
@@ -369,7 +369,7 @@
             <w:noProof/>
             <w:webHidden/>
           </w:rPr>
-          <w:instrText xml:space="preserve"> PAGEREF _Toc237879725 \h </w:instrText>
+          <w:instrText xml:space="preserve"> PAGEREF _Toc237946028 \h </w:instrText>
         </w:r>
         <w:r>
           <w:rPr>
@@ -415,7 +415,7 @@
           <w14:ligatures w14:val="standardContextual"/>
         </w:rPr>
       </w:pPr>
-      <w:hyperlink w:anchor="_Toc237879726" w:history="1">
+      <w:hyperlink w:anchor="_Toc237946029" w:history="1">
         <w:r>
           <w:rPr>
             <w:rStyle w:val="Hyperlink"/>
@@ -442,7 +442,7 @@
             <w:noProof/>
             <w:webHidden/>
           </w:rPr>
-          <w:instrText xml:space="preserve"> PAGEREF _Toc237879726 \h </w:instrText>
+          <w:instrText xml:space="preserve"> PAGEREF _Toc237946029 \h </w:instrText>
         </w:r>
         <w:r>
           <w:rPr>
@@ -488,7 +488,7 @@
           <w14:ligatures w14:val="standardContextual"/>
         </w:rPr>
       </w:pPr>
-      <w:hyperlink w:anchor="_Toc237879727" w:history="1">
+      <w:hyperlink w:anchor="_Toc237946030" w:history="1">
         <w:r>
           <w:rPr>
             <w:rStyle w:val="Hyperlink"/>
@@ -515,7 +515,7 @@
             <w:noProof/>
             <w:webHidden/>
           </w:rPr>
-          <w:instrText xml:space="preserve"> PAGEREF _Toc237879727 \h </w:instrText>
+          <w:instrText xml:space="preserve"> PAGEREF _Toc237946030 \h </w:instrText>
         </w:r>
         <w:r>
           <w:rPr>
@@ -561,7 +561,7 @@
           <w14:ligatures w14:val="standardContextual"/>
         </w:rPr>
       </w:pPr>
-      <w:hyperlink w:anchor="_Toc237879728" w:history="1">
+      <w:hyperlink w:anchor="_Toc237946031" w:history="1">
         <w:r>
           <w:rPr>
             <w:rStyle w:val="Hyperlink"/>
@@ -588,7 +588,7 @@
             <w:noProof/>
             <w:webHidden/>
           </w:rPr>
-          <w:instrText xml:space="preserve"> PAGEREF _Toc237879728 \h </w:instrText>
+          <w:instrText xml:space="preserve"> PAGEREF _Toc237946031 \h </w:instrText>
         </w:r>
         <w:r>
           <w:rPr>
@@ -635,7 +635,7 @@
           <w14:ligatures w14:val="standardContextual"/>
         </w:rPr>
       </w:pPr>
-      <w:hyperlink w:anchor="_Toc237879729" w:history="1">
+      <w:hyperlink w:anchor="_Toc237946032" w:history="1">
         <w:r>
           <w:rPr>
             <w:rStyle w:val="Hyperlink"/>
@@ -662,7 +662,7 @@
             <w:noProof/>
             <w:webHidden/>
           </w:rPr>
-          <w:instrText xml:space="preserve"> PAGEREF _Toc237879729 \h </w:instrText>
+          <w:instrText xml:space="preserve"> PAGEREF _Toc237946032 \h </w:instrText>
         </w:r>
         <w:r>
           <w:rPr>
@@ -708,7 +708,7 @@
           <w14:ligatures w14:val="standardContextual"/>
         </w:rPr>
       </w:pPr>
-      <w:hyperlink w:anchor="_Toc237879730" w:history="1">
+      <w:hyperlink w:anchor="_Toc237946033" w:history="1">
         <w:r>
           <w:rPr>
             <w:rStyle w:val="Hyperlink"/>
@@ -735,7 +735,7 @@
             <w:noProof/>
             <w:webHidden/>
           </w:rPr>
-          <w:instrText xml:space="preserve"> PAGEREF _Toc237879730 \h </w:instrText>
+          <w:instrText xml:space="preserve"> PAGEREF _Toc237946033 \h </w:instrText>
         </w:r>
         <w:r>
           <w:rPr>
@@ -781,7 +781,7 @@
           <w14:ligatures w14:val="standardContextual"/>
         </w:rPr>
       </w:pPr>
-      <w:hyperlink w:anchor="_Toc237879731" w:history="1">
+      <w:hyperlink w:anchor="_Toc237946034" w:history="1">
         <w:r>
           <w:rPr>
             <w:rStyle w:val="Hyperlink"/>
@@ -808,7 +808,7 @@
             <w:noProof/>
             <w:webHidden/>
           </w:rPr>
-          <w:instrText xml:space="preserve"> PAGEREF _Toc237879731 \h </w:instrText>
+          <w:instrText xml:space="preserve"> PAGEREF _Toc237946034 \h </w:instrText>
         </w:r>
         <w:r>
           <w:rPr>
@@ -854,7 +854,7 @@
           <w14:ligatures w14:val="standardContextual"/>
         </w:rPr>
       </w:pPr>
-      <w:hyperlink w:anchor="_Toc237879732" w:history="1">
+      <w:hyperlink w:anchor="_Toc237946035" w:history="1">
         <w:r>
           <w:rPr>
             <w:rStyle w:val="Hyperlink"/>
@@ -881,7 +881,7 @@
             <w:noProof/>
             <w:webHidden/>
           </w:rPr>
-          <w:instrText xml:space="preserve"> PAGEREF _Toc237879732 \h </w:instrText>
+          <w:instrText xml:space="preserve"> PAGEREF _Toc237946035 \h </w:instrText>
         </w:r>
         <w:r>
           <w:rPr>
@@ -927,7 +927,7 @@
           <w14:ligatures w14:val="standardContextual"/>
         </w:rPr>
       </w:pPr>
-      <w:hyperlink w:anchor="_Toc237879733" w:history="1">
+      <w:hyperlink w:anchor="_Toc237946036" w:history="1">
         <w:r>
           <w:rPr>
             <w:rStyle w:val="Hyperlink"/>
@@ -954,7 +954,7 @@
             <w:noProof/>
             <w:webHidden/>
           </w:rPr>
-          <w:instrText xml:space="preserve"> PAGEREF _Toc237879733 \h </w:instrText>
+          <w:instrText xml:space="preserve"> PAGEREF _Toc237946036 \h </w:instrText>
         </w:r>
         <w:r>
           <w:rPr>
@@ -1000,7 +1000,7 @@
           <w14:ligatures w14:val="standardContextual"/>
         </w:rPr>
       </w:pPr>
-      <w:hyperlink w:anchor="_Toc237879734" w:history="1">
+      <w:hyperlink w:anchor="_Toc237946037" w:history="1">
         <w:r>
           <w:rPr>
             <w:rStyle w:val="Hyperlink"/>
@@ -1027,7 +1027,7 @@
             <w:noProof/>
             <w:webHidden/>
           </w:rPr>
-          <w:instrText xml:space="preserve"> PAGEREF _Toc237879734 \h </w:instrText>
+          <w:instrText xml:space="preserve"> PAGEREF _Toc237946037 \h </w:instrText>
         </w:r>
         <w:r>
           <w:rPr>
@@ -1073,7 +1073,7 @@
           <w14:ligatures w14:val="standardContextual"/>
         </w:rPr>
       </w:pPr>
-      <w:hyperlink w:anchor="_Toc237879735" w:history="1">
+      <w:hyperlink w:anchor="_Toc237946038" w:history="1">
         <w:r>
           <w:rPr>
             <w:rStyle w:val="Hyperlink"/>
@@ -1100,7 +1100,7 @@
             <w:noProof/>
             <w:webHidden/>
           </w:rPr>
-          <w:instrText xml:space="preserve"> PAGEREF _Toc237879735 \h </w:instrText>
+          <w:instrText xml:space="preserve"> PAGEREF _Toc237946038 \h </w:instrText>
         </w:r>
         <w:r>
           <w:rPr>
@@ -1147,7 +1147,7 @@
           <w14:ligatures w14:val="standardContextual"/>
         </w:rPr>
       </w:pPr>
-      <w:hyperlink w:anchor="_Toc237879736" w:history="1">
+      <w:hyperlink w:anchor="_Toc237946039" w:history="1">
         <w:r>
           <w:rPr>
             <w:rStyle w:val="Hyperlink"/>
@@ -1174,7 +1174,7 @@
             <w:noProof/>
             <w:webHidden/>
           </w:rPr>
-          <w:instrText xml:space="preserve"> PAGEREF _Toc237879736 \h </w:instrText>
+          <w:instrText xml:space="preserve"> PAGEREF _Toc237946039 \h </w:instrText>
         </w:r>
         <w:r>
           <w:rPr>
@@ -1220,7 +1220,7 @@
           <w14:ligatures w14:val="standardContextual"/>
         </w:rPr>
       </w:pPr>
-      <w:hyperlink w:anchor="_Toc237879737" w:history="1">
+      <w:hyperlink w:anchor="_Toc237946040" w:history="1">
         <w:r>
           <w:rPr>
             <w:rStyle w:val="Hyperlink"/>
@@ -1247,7 +1247,7 @@
             <w:noProof/>
             <w:webHidden/>
           </w:rPr>
-          <w:instrText xml:space="preserve"> PAGEREF _Toc237879737 \h </w:instrText>
+          <w:instrText xml:space="preserve"> PAGEREF _Toc237946040 \h </w:instrText>
         </w:r>
         <w:r>
           <w:rPr>
@@ -1293,7 +1293,7 @@
           <w14:ligatures w14:val="standardContextual"/>
         </w:rPr>
       </w:pPr>
-      <w:hyperlink w:anchor="_Toc237879738" w:history="1">
+      <w:hyperlink w:anchor="_Toc237946041" w:history="1">
         <w:r>
           <w:rPr>
             <w:rStyle w:val="Hyperlink"/>
@@ -1320,7 +1320,7 @@
             <w:noProof/>
             <w:webHidden/>
           </w:rPr>
-          <w:instrText xml:space="preserve"> PAGEREF _Toc237879738 \h </w:instrText>
+          <w:instrText xml:space="preserve"> PAGEREF _Toc237946041 \h </w:instrText>
         </w:r>
         <w:r>
           <w:rPr>
@@ -1366,7 +1366,7 @@
           <w14:ligatures w14:val="standardContextual"/>
         </w:rPr>
       </w:pPr>
-      <w:hyperlink w:anchor="_Toc237879739" w:history="1">
+      <w:hyperlink w:anchor="_Toc237946042" w:history="1">
         <w:r>
           <w:rPr>
             <w:rStyle w:val="Hyperlink"/>
@@ -1393,7 +1393,7 @@
             <w:noProof/>
             <w:webHidden/>
           </w:rPr>
-          <w:instrText xml:space="preserve"> PAGEREF _Toc237879739 \h </w:instrText>
+          <w:instrText xml:space="preserve"> PAGEREF _Toc237946042 \h </w:instrText>
         </w:r>
         <w:r>
           <w:rPr>
@@ -1440,7 +1440,7 @@
           <w14:ligatures w14:val="standardContextual"/>
         </w:rPr>
       </w:pPr>
-      <w:hyperlink w:anchor="_Toc237879740" w:history="1">
+      <w:hyperlink w:anchor="_Toc237946043" w:history="1">
         <w:r>
           <w:rPr>
             <w:rStyle w:val="Hyperlink"/>
@@ -1467,7 +1467,7 @@
             <w:noProof/>
             <w:webHidden/>
           </w:rPr>
-          <w:instrText xml:space="preserve"> PAGEREF _Toc237879740 \h </w:instrText>
+          <w:instrText xml:space="preserve"> PAGEREF _Toc237946043 \h </w:instrText>
         </w:r>
         <w:r>
           <w:rPr>
@@ -1513,7 +1513,7 @@
           <w14:ligatures w14:val="standardContextual"/>
         </w:rPr>
       </w:pPr>
-      <w:hyperlink w:anchor="_Toc237879741" w:history="1">
+      <w:hyperlink w:anchor="_Toc237946044" w:history="1">
         <w:r>
           <w:rPr>
             <w:rStyle w:val="Hyperlink"/>
@@ -1540,7 +1540,7 @@
             <w:noProof/>
             <w:webHidden/>
           </w:rPr>
-          <w:instrText xml:space="preserve"> PAGEREF _Toc237879741 \h </w:instrText>
+          <w:instrText xml:space="preserve"> PAGEREF _Toc237946044 \h </w:instrText>
         </w:r>
         <w:r>
           <w:rPr>
@@ -1586,7 +1586,7 @@
           <w14:ligatures w14:val="standardContextual"/>
         </w:rPr>
       </w:pPr>
-      <w:hyperlink w:anchor="_Toc237879742" w:history="1">
+      <w:hyperlink w:anchor="_Toc237946045" w:history="1">
         <w:r>
           <w:rPr>
             <w:rStyle w:val="Hyperlink"/>
@@ -1613,7 +1613,7 @@
             <w:noProof/>
             <w:webHidden/>
           </w:rPr>
-          <w:instrText xml:space="preserve"> PAGEREF _Toc237879742 \h </w:instrText>
+          <w:instrText xml:space="preserve"> PAGEREF _Toc237946045 \h </w:instrText>
         </w:r>
         <w:r>
           <w:rPr>
@@ -1659,7 +1659,7 @@
           <w14:ligatures w14:val="standardContextual"/>
         </w:rPr>
       </w:pPr>
-      <w:hyperlink w:anchor="_Toc237879743" w:history="1">
+      <w:hyperlink w:anchor="_Toc237946046" w:history="1">
         <w:r>
           <w:rPr>
             <w:rStyle w:val="Hyperlink"/>
@@ -1686,7 +1686,7 @@
             <w:noProof/>
             <w:webHidden/>
           </w:rPr>
-          <w:instrText xml:space="preserve"> PAGEREF _Toc237879743 \h </w:instrText>
+          <w:instrText xml:space="preserve"> PAGEREF _Toc237946046 \h </w:instrText>
         </w:r>
         <w:r>
           <w:rPr>
@@ -1732,7 +1732,7 @@
           <w14:ligatures w14:val="standardContextual"/>
         </w:rPr>
       </w:pPr>
-      <w:hyperlink w:anchor="_Toc237879744" w:history="1">
+      <w:hyperlink w:anchor="_Toc237946047" w:history="1">
         <w:r>
           <w:rPr>
             <w:rStyle w:val="Hyperlink"/>
@@ -1759,7 +1759,7 @@
             <w:noProof/>
             <w:webHidden/>
           </w:rPr>
-          <w:instrText xml:space="preserve"> PAGEREF _Toc237879744 \h </w:instrText>
+          <w:instrText xml:space="preserve"> PAGEREF _Toc237946047 \h </w:instrText>
         </w:r>
         <w:r>
           <w:rPr>
@@ -1805,7 +1805,7 @@
           <w14:ligatures w14:val="standardContextual"/>
         </w:rPr>
       </w:pPr>
-      <w:hyperlink w:anchor="_Toc237879745" w:history="1">
+      <w:hyperlink w:anchor="_Toc237946048" w:history="1">
         <w:r>
           <w:rPr>
             <w:rStyle w:val="Hyperlink"/>
@@ -1832,7 +1832,7 @@
             <w:noProof/>
             <w:webHidden/>
           </w:rPr>
-          <w:instrText xml:space="preserve"> PAGEREF _Toc237879745 \h </w:instrText>
+          <w:instrText xml:space="preserve"> PAGEREF _Toc237946048 \h </w:instrText>
         </w:r>
         <w:r>
           <w:rPr>
@@ -1878,7 +1878,7 @@
           <w14:ligatures w14:val="standardContextual"/>
         </w:rPr>
       </w:pPr>
-      <w:hyperlink w:anchor="_Toc237879746" w:history="1">
+      <w:hyperlink w:anchor="_Toc237946049" w:history="1">
         <w:r>
           <w:rPr>
             <w:rStyle w:val="Hyperlink"/>
@@ -1905,7 +1905,7 @@
             <w:noProof/>
             <w:webHidden/>
           </w:rPr>
-          <w:instrText xml:space="preserve"> PAGEREF _Toc237879746 \h </w:instrText>
+          <w:instrText xml:space="preserve"> PAGEREF _Toc237946049 \h </w:instrText>
         </w:r>
         <w:r>
           <w:rPr>
@@ -1952,7 +1952,7 @@
           <w14:ligatures w14:val="standardContextual"/>
         </w:rPr>
       </w:pPr>
-      <w:hyperlink w:anchor="_Toc237879747" w:history="1">
+      <w:hyperlink w:anchor="_Toc237946050" w:history="1">
         <w:r>
           <w:rPr>
             <w:rStyle w:val="Hyperlink"/>
@@ -1979,7 +1979,7 @@
             <w:noProof/>
             <w:webHidden/>
           </w:rPr>
-          <w:instrText xml:space="preserve"> PAGEREF _Toc237879747 \h </w:instrText>
+          <w:instrText xml:space="preserve"> PAGEREF _Toc237946050 \h </w:instrText>
         </w:r>
         <w:r>
           <w:rPr>
@@ -2025,7 +2025,7 @@
           <w14:ligatures w14:val="standardContextual"/>
         </w:rPr>
       </w:pPr>
-      <w:hyperlink w:anchor="_Toc237879748" w:history="1">
+      <w:hyperlink w:anchor="_Toc237946051" w:history="1">
         <w:r>
           <w:rPr>
             <w:rStyle w:val="Hyperlink"/>
@@ -2052,7 +2052,7 @@
             <w:noProof/>
             <w:webHidden/>
           </w:rPr>
-          <w:instrText xml:space="preserve"> PAGEREF _Toc237879748 \h </w:instrText>
+          <w:instrText xml:space="preserve"> PAGEREF _Toc237946051 \h </w:instrText>
         </w:r>
         <w:r>
           <w:rPr>
@@ -2098,7 +2098,7 @@
           <w14:ligatures w14:val="standardContextual"/>
         </w:rPr>
       </w:pPr>
-      <w:hyperlink w:anchor="_Toc237879749" w:history="1">
+      <w:hyperlink w:anchor="_Toc237946052" w:history="1">
         <w:r>
           <w:rPr>
             <w:rStyle w:val="Hyperlink"/>
@@ -2125,7 +2125,7 @@
             <w:noProof/>
             <w:webHidden/>
           </w:rPr>
-          <w:instrText xml:space="preserve"> PAGEREF _Toc237879749 \h </w:instrText>
+          <w:instrText xml:space="preserve"> PAGEREF _Toc237946052 \h </w:instrText>
         </w:r>
         <w:r>
           <w:rPr>
@@ -2171,7 +2171,7 @@
           <w14:ligatures w14:val="standardContextual"/>
         </w:rPr>
       </w:pPr>
-      <w:hyperlink w:anchor="_Toc237879750" w:history="1">
+      <w:hyperlink w:anchor="_Toc237946053" w:history="1">
         <w:r>
           <w:rPr>
             <w:rStyle w:val="Hyperlink"/>
@@ -2198,7 +2198,7 @@
             <w:noProof/>
             <w:webHidden/>
           </w:rPr>
-          <w:instrText xml:space="preserve"> PAGEREF _Toc237879750 \h </w:instrText>
+          <w:instrText xml:space="preserve"> PAGEREF _Toc237946053 \h </w:instrText>
         </w:r>
         <w:r>
           <w:rPr>
@@ -2244,7 +2244,7 @@
           <w14:ligatures w14:val="standardContextual"/>
         </w:rPr>
       </w:pPr>
-      <w:hyperlink w:anchor="_Toc237879751" w:history="1">
+      <w:hyperlink w:anchor="_Toc237946054" w:history="1">
         <w:r>
           <w:rPr>
             <w:rStyle w:val="Hyperlink"/>
@@ -2271,7 +2271,7 @@
             <w:noProof/>
             <w:webHidden/>
           </w:rPr>
-          <w:instrText xml:space="preserve"> PAGEREF _Toc237879751 \h </w:instrText>
+          <w:instrText xml:space="preserve"> PAGEREF _Toc237946054 \h </w:instrText>
         </w:r>
         <w:r>
           <w:rPr>
@@ -2317,7 +2317,7 @@
           <w14:ligatures w14:val="standardContextual"/>
         </w:rPr>
       </w:pPr>
-      <w:hyperlink w:anchor="_Toc237879752" w:history="1">
+      <w:hyperlink w:anchor="_Toc237946055" w:history="1">
         <w:r>
           <w:rPr>
             <w:rStyle w:val="Hyperlink"/>
@@ -2344,7 +2344,7 @@
             <w:noProof/>
             <w:webHidden/>
           </w:rPr>
-          <w:instrText xml:space="preserve"> PAGEREF _Toc237879752 \h </w:instrText>
+          <w:instrText xml:space="preserve"> PAGEREF _Toc237946055 \h </w:instrText>
         </w:r>
         <w:r>
           <w:rPr>
@@ -2390,7 +2390,7 @@
           <w14:ligatures w14:val="standardContextual"/>
         </w:rPr>
       </w:pPr>
-      <w:hyperlink w:anchor="_Toc237879753" w:history="1">
+      <w:hyperlink w:anchor="_Toc237946056" w:history="1">
         <w:r>
           <w:rPr>
             <w:rStyle w:val="Hyperlink"/>
@@ -2417,7 +2417,7 @@
             <w:noProof/>
             <w:webHidden/>
           </w:rPr>
-          <w:instrText xml:space="preserve"> PAGEREF _Toc237879753 \h </w:instrText>
+          <w:instrText xml:space="preserve"> PAGEREF _Toc237946056 \h </w:instrText>
         </w:r>
         <w:r>
           <w:rPr>
@@ -2463,7 +2463,7 @@
           <w14:ligatures w14:val="standardContextual"/>
         </w:rPr>
       </w:pPr>
-      <w:hyperlink w:anchor="_Toc237879754" w:history="1">
+      <w:hyperlink w:anchor="_Toc237946057" w:history="1">
         <w:r>
           <w:rPr>
             <w:rStyle w:val="Hyperlink"/>
@@ -2490,7 +2490,7 @@
             <w:noProof/>
             <w:webHidden/>
           </w:rPr>
-          <w:instrText xml:space="preserve"> PAGEREF _Toc237879754 \h </w:instrText>
+          <w:instrText xml:space="preserve"> PAGEREF _Toc237946057 \h </w:instrText>
         </w:r>
         <w:r>
           <w:rPr>
@@ -2536,7 +2536,7 @@
           <w14:ligatures w14:val="standardContextual"/>
         </w:rPr>
       </w:pPr>
-      <w:hyperlink w:anchor="_Toc237879755" w:history="1">
+      <w:hyperlink w:anchor="_Toc237946058" w:history="1">
         <w:r>
           <w:rPr>
             <w:rStyle w:val="Hyperlink"/>
@@ -2563,7 +2563,7 @@
             <w:noProof/>
             <w:webHidden/>
           </w:rPr>
-          <w:instrText xml:space="preserve"> PAGEREF _Toc237879755 \h </w:instrText>
+          <w:instrText xml:space="preserve"> PAGEREF _Toc237946058 \h </w:instrText>
         </w:r>
         <w:r>
           <w:rPr>
@@ -2609,7 +2609,7 @@
           <w14:ligatures w14:val="standardContextual"/>
         </w:rPr>
       </w:pPr>
-      <w:hyperlink w:anchor="_Toc237879756" w:history="1">
+      <w:hyperlink w:anchor="_Toc237946059" w:history="1">
         <w:r>
           <w:rPr>
             <w:rStyle w:val="Hyperlink"/>
@@ -2636,7 +2636,7 @@
             <w:noProof/>
             <w:webHidden/>
           </w:rPr>
-          <w:instrText xml:space="preserve"> PAGEREF _Toc237879756 \h </w:instrText>
+          <w:instrText xml:space="preserve"> PAGEREF _Toc237946059 \h </w:instrText>
         </w:r>
         <w:r>
           <w:rPr>
@@ -2682,7 +2682,7 @@
           <w14:ligatures w14:val="standardContextual"/>
         </w:rPr>
       </w:pPr>
-      <w:hyperlink w:anchor="_Toc237879757" w:history="1">
+      <w:hyperlink w:anchor="_Toc237946060" w:history="1">
         <w:r>
           <w:rPr>
             <w:rStyle w:val="Hyperlink"/>
@@ -2709,7 +2709,7 @@
             <w:noProof/>
             <w:webHidden/>
           </w:rPr>
-          <w:instrText xml:space="preserve"> PAGEREF _Toc237879757 \h </w:instrText>
+          <w:instrText xml:space="preserve"> PAGEREF _Toc237946060 \h </w:instrText>
         </w:r>
         <w:r>
           <w:rPr>
@@ -2755,7 +2755,7 @@
           <w14:ligatures w14:val="standardContextual"/>
         </w:rPr>
       </w:pPr>
-      <w:hyperlink w:anchor="_Toc237879758" w:history="1">
+      <w:hyperlink w:anchor="_Toc237946061" w:history="1">
         <w:r>
           <w:rPr>
             <w:rStyle w:val="Hyperlink"/>
@@ -2782,7 +2782,7 @@
             <w:noProof/>
             <w:webHidden/>
           </w:rPr>
-          <w:instrText xml:space="preserve"> PAGEREF _Toc237879758 \h </w:instrText>
+          <w:instrText xml:space="preserve"> PAGEREF _Toc237946061 \h </w:instrText>
         </w:r>
         <w:r>
           <w:rPr>
@@ -2828,7 +2828,7 @@
           <w14:ligatures w14:val="standardContextual"/>
         </w:rPr>
       </w:pPr>
-      <w:hyperlink w:anchor="_Toc237879759" w:history="1">
+      <w:hyperlink w:anchor="_Toc237946062" w:history="1">
         <w:r>
           <w:rPr>
             <w:rStyle w:val="Hyperlink"/>
@@ -2855,7 +2855,7 @@
             <w:noProof/>
             <w:webHidden/>
           </w:rPr>
-          <w:instrText xml:space="preserve"> PAGEREF _Toc237879759 \h </w:instrText>
+          <w:instrText xml:space="preserve"> PAGEREF _Toc237946062 \h </w:instrText>
         </w:r>
         <w:r>
           <w:rPr>
@@ -2901,7 +2901,7 @@
           <w14:ligatures w14:val="standardContextual"/>
         </w:rPr>
       </w:pPr>
-      <w:hyperlink w:anchor="_Toc237879760" w:history="1">
+      <w:hyperlink w:anchor="_Toc237946063" w:history="1">
         <w:r>
           <w:rPr>
             <w:rStyle w:val="Hyperlink"/>
@@ -2928,7 +2928,7 @@
             <w:noProof/>
             <w:webHidden/>
           </w:rPr>
-          <w:instrText xml:space="preserve"> PAGEREF _Toc237879760 \h </w:instrText>
+          <w:instrText xml:space="preserve"> PAGEREF _Toc237946063 \h </w:instrText>
         </w:r>
         <w:r>
           <w:rPr>
@@ -2975,7 +2975,7 @@
           <w14:ligatures w14:val="standardContextual"/>
         </w:rPr>
       </w:pPr>
-      <w:hyperlink w:anchor="_Toc237879761" w:history="1">
+      <w:hyperlink w:anchor="_Toc237946064" w:history="1">
         <w:r>
           <w:rPr>
             <w:rStyle w:val="Hyperlink"/>
@@ -3002,7 +3002,7 @@
             <w:noProof/>
             <w:webHidden/>
           </w:rPr>
-          <w:instrText xml:space="preserve"> PAGEREF _Toc237879761 \h </w:instrText>
+          <w:instrText xml:space="preserve"> PAGEREF _Toc237946064 \h </w:instrText>
         </w:r>
         <w:r>
           <w:rPr>
@@ -3048,7 +3048,7 @@
           <w14:ligatures w14:val="standardContextual"/>
         </w:rPr>
       </w:pPr>
-      <w:hyperlink w:anchor="_Toc237879762" w:history="1">
+      <w:hyperlink w:anchor="_Toc237946065" w:history="1">
         <w:r>
           <w:rPr>
             <w:rStyle w:val="Hyperlink"/>
@@ -3075,7 +3075,7 @@
             <w:noProof/>
             <w:webHidden/>
           </w:rPr>
-          <w:instrText xml:space="preserve"> PAGEREF _Toc237879762 \h </w:instrText>
+          <w:instrText xml:space="preserve"> PAGEREF _Toc237946065 \h </w:instrText>
         </w:r>
         <w:r>
           <w:rPr>
@@ -3121,7 +3121,7 @@
           <w14:ligatures w14:val="standardContextual"/>
         </w:rPr>
       </w:pPr>
-      <w:hyperlink w:anchor="_Toc237879763" w:history="1">
+      <w:hyperlink w:anchor="_Toc237946066" w:history="1">
         <w:r>
           <w:rPr>
             <w:rStyle w:val="Hyperlink"/>
@@ -3148,7 +3148,7 @@
             <w:noProof/>
             <w:webHidden/>
           </w:rPr>
-          <w:instrText xml:space="preserve"> PAGEREF _Toc237879763 \h </w:instrText>
+          <w:instrText xml:space="preserve"> PAGEREF _Toc237946066 \h </w:instrText>
         </w:r>
         <w:r>
           <w:rPr>
@@ -3194,7 +3194,7 @@
           <w14:ligatures w14:val="standardContextual"/>
         </w:rPr>
       </w:pPr>
-      <w:hyperlink w:anchor="_Toc237879764" w:history="1">
+      <w:hyperlink w:anchor="_Toc237946067" w:history="1">
         <w:r>
           <w:rPr>
             <w:rStyle w:val="Hyperlink"/>
@@ -3221,7 +3221,7 @@
             <w:noProof/>
             <w:webHidden/>
           </w:rPr>
-          <w:instrText xml:space="preserve"> PAGEREF _Toc237879764 \h </w:instrText>
+          <w:instrText xml:space="preserve"> PAGEREF _Toc237946067 \h </w:instrText>
         </w:r>
         <w:r>
           <w:rPr>
@@ -3267,7 +3267,7 @@
           <w14:ligatures w14:val="standardContextual"/>
         </w:rPr>
       </w:pPr>
-      <w:hyperlink w:anchor="_Toc237879765" w:history="1">
+      <w:hyperlink w:anchor="_Toc237946068" w:history="1">
         <w:r>
           <w:rPr>
             <w:rStyle w:val="Hyperlink"/>
@@ -3294,7 +3294,7 @@
             <w:noProof/>
             <w:webHidden/>
           </w:rPr>
-          <w:instrText xml:space="preserve"> PAGEREF _Toc237879765 \h </w:instrText>
+          <w:instrText xml:space="preserve"> PAGEREF _Toc237946068 \h </w:instrText>
         </w:r>
         <w:r>
           <w:rPr>
@@ -3340,7 +3340,7 @@
           <w14:ligatures w14:val="standardContextual"/>
         </w:rPr>
       </w:pPr>
-      <w:hyperlink w:anchor="_Toc237879766" w:history="1">
+      <w:hyperlink w:anchor="_Toc237946069" w:history="1">
         <w:r>
           <w:rPr>
             <w:rStyle w:val="Hyperlink"/>
@@ -3367,7 +3367,7 @@
             <w:noProof/>
             <w:webHidden/>
           </w:rPr>
-          <w:instrText xml:space="preserve"> PAGEREF _Toc237879766 \h </w:instrText>
+          <w:instrText xml:space="preserve"> PAGEREF _Toc237946069 \h </w:instrText>
         </w:r>
         <w:r>
           <w:rPr>
@@ -3413,7 +3413,7 @@
           <w14:ligatures w14:val="standardContextual"/>
         </w:rPr>
       </w:pPr>
-      <w:hyperlink w:anchor="_Toc237879767" w:history="1">
+      <w:hyperlink w:anchor="_Toc237946070" w:history="1">
         <w:r>
           <w:rPr>
             <w:rStyle w:val="Hyperlink"/>
@@ -3440,7 +3440,7 @@
             <w:noProof/>
             <w:webHidden/>
           </w:rPr>
-          <w:instrText xml:space="preserve"> PAGEREF _Toc237879767 \h </w:instrText>
+          <w:instrText xml:space="preserve"> PAGEREF _Toc237946070 \h </w:instrText>
         </w:r>
         <w:r>
           <w:rPr>
@@ -3486,7 +3486,7 @@
           <w14:ligatures w14:val="standardContextual"/>
         </w:rPr>
       </w:pPr>
-      <w:hyperlink w:anchor="_Toc237879768" w:history="1">
+      <w:hyperlink w:anchor="_Toc237946071" w:history="1">
         <w:r>
           <w:rPr>
             <w:rStyle w:val="Hyperlink"/>
@@ -3513,7 +3513,7 @@
             <w:noProof/>
             <w:webHidden/>
           </w:rPr>
-          <w:instrText xml:space="preserve"> PAGEREF _Toc237879768 \h </w:instrText>
+          <w:instrText xml:space="preserve"> PAGEREF _Toc237946071 \h </w:instrText>
         </w:r>
         <w:r>
           <w:rPr>
@@ -3559,7 +3559,7 @@
           <w14:ligatures w14:val="standardContextual"/>
         </w:rPr>
       </w:pPr>
-      <w:hyperlink w:anchor="_Toc237879769" w:history="1">
+      <w:hyperlink w:anchor="_Toc237946072" w:history="1">
         <w:r>
           <w:rPr>
             <w:rStyle w:val="Hyperlink"/>
@@ -3586,7 +3586,7 @@
             <w:noProof/>
             <w:webHidden/>
           </w:rPr>
-          <w:instrText xml:space="preserve"> PAGEREF _Toc237879769 \h </w:instrText>
+          <w:instrText xml:space="preserve"> PAGEREF _Toc237946072 \h </w:instrText>
         </w:r>
         <w:r>
           <w:rPr>
@@ -3632,7 +3632,7 @@
           <w14:ligatures w14:val="standardContextual"/>
         </w:rPr>
       </w:pPr>
-      <w:hyperlink w:anchor="_Toc237879770" w:history="1">
+      <w:hyperlink w:anchor="_Toc237946073" w:history="1">
         <w:r>
           <w:rPr>
             <w:rStyle w:val="Hyperlink"/>
@@ -3659,7 +3659,7 @@
             <w:noProof/>
             <w:webHidden/>
           </w:rPr>
-          <w:instrText xml:space="preserve"> PAGEREF _Toc237879770 \h </w:instrText>
+          <w:instrText xml:space="preserve"> PAGEREF _Toc237946073 \h </w:instrText>
         </w:r>
         <w:r>
           <w:rPr>
@@ -3705,7 +3705,7 @@
           <w14:ligatures w14:val="standardContextual"/>
         </w:rPr>
       </w:pPr>
-      <w:hyperlink w:anchor="_Toc237879771" w:history="1">
+      <w:hyperlink w:anchor="_Toc237946074" w:history="1">
         <w:r>
           <w:rPr>
             <w:rStyle w:val="Hyperlink"/>
@@ -3732,7 +3732,7 @@
             <w:noProof/>
             <w:webHidden/>
           </w:rPr>
-          <w:instrText xml:space="preserve"> PAGEREF _Toc237879771 \h </w:instrText>
+          <w:instrText xml:space="preserve"> PAGEREF _Toc237946074 \h </w:instrText>
         </w:r>
         <w:r>
           <w:rPr>
@@ -3778,7 +3778,7 @@
           <w14:ligatures w14:val="standardContextual"/>
         </w:rPr>
       </w:pPr>
-      <w:hyperlink w:anchor="_Toc237879772" w:history="1">
+      <w:hyperlink w:anchor="_Toc237946075" w:history="1">
         <w:r>
           <w:rPr>
             <w:rStyle w:val="Hyperlink"/>
@@ -3805,7 +3805,7 @@
             <w:noProof/>
             <w:webHidden/>
           </w:rPr>
-          <w:instrText xml:space="preserve"> PAGEREF _Toc237879772 \h </w:instrText>
+          <w:instrText xml:space="preserve"> PAGEREF _Toc237946075 \h </w:instrText>
         </w:r>
         <w:r>
           <w:rPr>
@@ -3852,7 +3852,7 @@
           <w14:ligatures w14:val="standardContextual"/>
         </w:rPr>
       </w:pPr>
-      <w:hyperlink w:anchor="_Toc237879773" w:history="1">
+      <w:hyperlink w:anchor="_Toc237946076" w:history="1">
         <w:r>
           <w:rPr>
             <w:rStyle w:val="Hyperlink"/>
@@ -3879,7 +3879,7 @@
             <w:noProof/>
             <w:webHidden/>
           </w:rPr>
-          <w:instrText xml:space="preserve"> PAGEREF _Toc237879773 \h </w:instrText>
+          <w:instrText xml:space="preserve"> PAGEREF _Toc237946076 \h </w:instrText>
         </w:r>
         <w:r>
           <w:rPr>
@@ -3925,7 +3925,7 @@
           <w14:ligatures w14:val="standardContextual"/>
         </w:rPr>
       </w:pPr>
-      <w:hyperlink w:anchor="_Toc237879774" w:history="1">
+      <w:hyperlink w:anchor="_Toc237946077" w:history="1">
         <w:r>
           <w:rPr>
             <w:rStyle w:val="Hyperlink"/>
@@ -3952,7 +3952,7 @@
             <w:noProof/>
             <w:webHidden/>
           </w:rPr>
-          <w:instrText xml:space="preserve"> PAGEREF _Toc237879774 \h </w:instrText>
+          <w:instrText xml:space="preserve"> PAGEREF _Toc237946077 \h </w:instrText>
         </w:r>
         <w:r>
           <w:rPr>
@@ -3998,7 +3998,7 @@
           <w14:ligatures w14:val="standardContextual"/>
         </w:rPr>
       </w:pPr>
-      <w:hyperlink w:anchor="_Toc237879775" w:history="1">
+      <w:hyperlink w:anchor="_Toc237946078" w:history="1">
         <w:r>
           <w:rPr>
             <w:rStyle w:val="Hyperlink"/>
@@ -4025,7 +4025,7 @@
             <w:noProof/>
             <w:webHidden/>
           </w:rPr>
-          <w:instrText xml:space="preserve"> PAGEREF _Toc237879775 \h </w:instrText>
+          <w:instrText xml:space="preserve"> PAGEREF _Toc237946078 \h </w:instrText>
         </w:r>
         <w:r>
           <w:rPr>
@@ -4071,7 +4071,7 @@
           <w14:ligatures w14:val="standardContextual"/>
         </w:rPr>
       </w:pPr>
-      <w:hyperlink w:anchor="_Toc237879776" w:history="1">
+      <w:hyperlink w:anchor="_Toc237946079" w:history="1">
         <w:r>
           <w:rPr>
             <w:rStyle w:val="Hyperlink"/>
@@ -4098,7 +4098,7 @@
             <w:noProof/>
             <w:webHidden/>
           </w:rPr>
-          <w:instrText xml:space="preserve"> PAGEREF _Toc237879776 \h </w:instrText>
+          <w:instrText xml:space="preserve"> PAGEREF _Toc237946079 \h </w:instrText>
         </w:r>
         <w:r>
           <w:rPr>
@@ -4144,7 +4144,7 @@
           <w14:ligatures w14:val="standardContextual"/>
         </w:rPr>
       </w:pPr>
-      <w:hyperlink w:anchor="_Toc237879777" w:history="1">
+      <w:hyperlink w:anchor="_Toc237946080" w:history="1">
         <w:r>
           <w:rPr>
             <w:rStyle w:val="Hyperlink"/>
@@ -4171,7 +4171,7 @@
             <w:noProof/>
             <w:webHidden/>
           </w:rPr>
-          <w:instrText xml:space="preserve"> PAGEREF _Toc237879777 \h </w:instrText>
+          <w:instrText xml:space="preserve"> PAGEREF _Toc237946080 \h </w:instrText>
         </w:r>
         <w:r>
           <w:rPr>
@@ -4217,7 +4217,7 @@
           <w14:ligatures w14:val="standardContextual"/>
         </w:rPr>
       </w:pPr>
-      <w:hyperlink w:anchor="_Toc237879778" w:history="1">
+      <w:hyperlink w:anchor="_Toc237946081" w:history="1">
         <w:r>
           <w:rPr>
             <w:rStyle w:val="Hyperlink"/>
@@ -4244,7 +4244,7 @@
             <w:noProof/>
             <w:webHidden/>
           </w:rPr>
-          <w:instrText xml:space="preserve"> PAGEREF _Toc237879778 \h </w:instrText>
+          <w:instrText xml:space="preserve"> PAGEREF _Toc237946081 \h </w:instrText>
         </w:r>
         <w:r>
           <w:rPr>
@@ -4290,7 +4290,7 @@
           <w14:ligatures w14:val="standardContextual"/>
         </w:rPr>
       </w:pPr>
-      <w:hyperlink w:anchor="_Toc237879779" w:history="1">
+      <w:hyperlink w:anchor="_Toc237946082" w:history="1">
         <w:r>
           <w:rPr>
             <w:rStyle w:val="Hyperlink"/>
@@ -4317,7 +4317,7 @@
             <w:noProof/>
             <w:webHidden/>
           </w:rPr>
-          <w:instrText xml:space="preserve"> PAGEREF _Toc237879779 \h </w:instrText>
+          <w:instrText xml:space="preserve"> PAGEREF _Toc237946082 \h </w:instrText>
         </w:r>
         <w:r>
           <w:rPr>
@@ -4364,7 +4364,7 @@
           <w14:ligatures w14:val="standardContextual"/>
         </w:rPr>
       </w:pPr>
-      <w:hyperlink w:anchor="_Toc237879780" w:history="1">
+      <w:hyperlink w:anchor="_Toc237946083" w:history="1">
         <w:r>
           <w:rPr>
             <w:rStyle w:val="Hyperlink"/>
@@ -4391,7 +4391,7 @@
             <w:noProof/>
             <w:webHidden/>
           </w:rPr>
-          <w:instrText xml:space="preserve"> PAGEREF _Toc237879780 \h </w:instrText>
+          <w:instrText xml:space="preserve"> PAGEREF _Toc237946083 \h </w:instrText>
         </w:r>
         <w:r>
           <w:rPr>
@@ -4437,7 +4437,7 @@
           <w14:ligatures w14:val="standardContextual"/>
         </w:rPr>
       </w:pPr>
-      <w:hyperlink w:anchor="_Toc237879781" w:history="1">
+      <w:hyperlink w:anchor="_Toc237946084" w:history="1">
         <w:r>
           <w:rPr>
             <w:rStyle w:val="Hyperlink"/>
@@ -4464,7 +4464,7 @@
             <w:noProof/>
             <w:webHidden/>
           </w:rPr>
-          <w:instrText xml:space="preserve"> PAGEREF _Toc237879781 \h </w:instrText>
+          <w:instrText xml:space="preserve"> PAGEREF _Toc237946084 \h </w:instrText>
         </w:r>
         <w:r>
           <w:rPr>
@@ -4510,7 +4510,7 @@
           <w14:ligatures w14:val="standardContextual"/>
         </w:rPr>
       </w:pPr>
-      <w:hyperlink w:anchor="_Toc237879782" w:history="1">
+      <w:hyperlink w:anchor="_Toc237946085" w:history="1">
         <w:r>
           <w:rPr>
             <w:rStyle w:val="Hyperlink"/>
@@ -4537,7 +4537,7 @@
             <w:noProof/>
             <w:webHidden/>
           </w:rPr>
-          <w:instrText xml:space="preserve"> PAGEREF _Toc237879782 \h </w:instrText>
+          <w:instrText xml:space="preserve"> PAGEREF _Toc237946085 \h </w:instrText>
         </w:r>
         <w:r>
           <w:rPr>
@@ -4584,7 +4584,7 @@
           <w14:ligatures w14:val="standardContextual"/>
         </w:rPr>
       </w:pPr>
-      <w:hyperlink w:anchor="_Toc237879783" w:history="1">
+      <w:hyperlink w:anchor="_Toc237946086" w:history="1">
         <w:r>
           <w:rPr>
             <w:rStyle w:val="Hyperlink"/>
@@ -4611,7 +4611,7 @@
             <w:noProof/>
             <w:webHidden/>
           </w:rPr>
-          <w:instrText xml:space="preserve"> PAGEREF _Toc237879783 \h </w:instrText>
+          <w:instrText xml:space="preserve"> PAGEREF _Toc237946086 \h </w:instrText>
         </w:r>
         <w:r>
           <w:rPr>
@@ -4657,7 +4657,7 @@
           <w14:ligatures w14:val="standardContextual"/>
         </w:rPr>
       </w:pPr>
-      <w:hyperlink w:anchor="_Toc237879784" w:history="1">
+      <w:hyperlink w:anchor="_Toc237946087" w:history="1">
         <w:r>
           <w:rPr>
             <w:rStyle w:val="Hyperlink"/>
@@ -4684,7 +4684,7 @@
             <w:noProof/>
             <w:webHidden/>
           </w:rPr>
-          <w:instrText xml:space="preserve"> PAGEREF _Toc237879784 \h </w:instrText>
+          <w:instrText xml:space="preserve"> PAGEREF _Toc237946087 \h </w:instrText>
         </w:r>
         <w:r>
           <w:rPr>
@@ -4730,7 +4730,7 @@
           <w14:ligatures w14:val="standardContextual"/>
         </w:rPr>
       </w:pPr>
-      <w:hyperlink w:anchor="_Toc237879785" w:history="1">
+      <w:hyperlink w:anchor="_Toc237946088" w:history="1">
         <w:r>
           <w:rPr>
             <w:rStyle w:val="Hyperlink"/>
@@ -4757,7 +4757,7 @@
             <w:noProof/>
             <w:webHidden/>
           </w:rPr>
-          <w:instrText xml:space="preserve"> PAGEREF _Toc237879785 \h </w:instrText>
+          <w:instrText xml:space="preserve"> PAGEREF _Toc237946088 \h </w:instrText>
         </w:r>
         <w:r>
           <w:rPr>
@@ -4803,7 +4803,7 @@
           <w14:ligatures w14:val="standardContextual"/>
         </w:rPr>
       </w:pPr>
-      <w:hyperlink w:anchor="_Toc237879786" w:history="1">
+      <w:hyperlink w:anchor="_Toc237946089" w:history="1">
         <w:r>
           <w:rPr>
             <w:rStyle w:val="Hyperlink"/>
@@ -4830,7 +4830,7 @@
             <w:noProof/>
             <w:webHidden/>
           </w:rPr>
-          <w:instrText xml:space="preserve"> PAGEREF _Toc237879786 \h </w:instrText>
+          <w:instrText xml:space="preserve"> PAGEREF _Toc237946089 \h </w:instrText>
         </w:r>
         <w:r>
           <w:rPr>
@@ -4876,7 +4876,7 @@
           <w14:ligatures w14:val="standardContextual"/>
         </w:rPr>
       </w:pPr>
-      <w:hyperlink w:anchor="_Toc237879787" w:history="1">
+      <w:hyperlink w:anchor="_Toc237946090" w:history="1">
         <w:r>
           <w:rPr>
             <w:rStyle w:val="Hyperlink"/>
@@ -4903,7 +4903,7 @@
             <w:noProof/>
             <w:webHidden/>
           </w:rPr>
-          <w:instrText xml:space="preserve"> PAGEREF _Toc237879787 \h </w:instrText>
+          <w:instrText xml:space="preserve"> PAGEREF _Toc237946090 \h </w:instrText>
         </w:r>
         <w:r>
           <w:rPr>
@@ -4944,7 +4944,7 @@
         <w:pStyle w:val="Heading1"/>
         <w:pageBreakBefore/>
       </w:pPr>
-      <w:bookmarkStart w:id="0" w:name="_Toc237879721"/>
+      <w:bookmarkStart w:id="0" w:name="_Toc237946024"/>
       <w:r>
         <w:lastRenderedPageBreak/>
         <w:t>Contest Notes</w:t>
@@ -4960,7 +4960,7 @@
       <w:pPr>
         <w:pStyle w:val="Heading2"/>
       </w:pPr>
-      <w:bookmarkStart w:id="1" w:name="_Toc237879722"/>
+      <w:bookmarkStart w:id="1" w:name="_Toc237946025"/>
       <w:r>
         <w:t>Setup &amp; don't-forget</w:t>
       </w:r>
@@ -5503,7 +5503,7 @@
       <w:pPr>
         <w:pStyle w:val="Heading2"/>
       </w:pPr>
-      <w:bookmarkStart w:id="2" w:name="_Toc237879723"/>
+      <w:bookmarkStart w:id="2" w:name="_Toc237946026"/>
       <w:r>
         <w:t>Number theory</w:t>
       </w:r>
@@ -5667,7 +5667,7 @@
       <w:pPr>
         <w:pStyle w:val="Heading2"/>
       </w:pPr>
-      <w:bookmarkStart w:id="3" w:name="_Toc237879724"/>
+      <w:bookmarkStart w:id="3" w:name="_Toc237946027"/>
       <w:r>
         <w:t>Bits</w:t>
       </w:r>
@@ -5846,7 +5846,7 @@
       <w:pPr>
         <w:pStyle w:val="Heading2"/>
       </w:pPr>
-      <w:bookmarkStart w:id="4" w:name="_Toc237879725"/>
+      <w:bookmarkStart w:id="4" w:name="_Toc237946028"/>
       <w:r>
         <w:t>Games (Grundy)</w:t>
       </w:r>
@@ -6044,7 +6044,7 @@
       <w:pPr>
         <w:pStyle w:val="Heading2"/>
       </w:pPr>
-      <w:bookmarkStart w:id="5" w:name="_Toc237879726"/>
+      <w:bookmarkStart w:id="5" w:name="_Toc237946029"/>
       <w:r>
         <w:t>Expected value</w:t>
       </w:r>
@@ -6230,7 +6230,7 @@
       <w:pPr>
         <w:pStyle w:val="Heading2"/>
       </w:pPr>
-      <w:bookmarkStart w:id="6" w:name="_Toc237879727"/>
+      <w:bookmarkStart w:id="6" w:name="_Toc237946030"/>
       <w:r>
         <w:t>Misc</w:t>
       </w:r>
@@ -6294,7 +6294,7 @@
       <w:pPr>
         <w:pStyle w:val="Heading2"/>
       </w:pPr>
-      <w:bookmarkStart w:id="7" w:name="_Toc237879728"/>
+      <w:bookmarkStart w:id="7" w:name="_Toc237946031"/>
       <w:r>
         <w:t>Tricks</w:t>
       </w:r>
@@ -6565,6 +6565,32 @@
         <w:pStyle w:val="Bullet"/>
       </w:pPr>
       <w:r>
+        <w:t xml:space="preserve">• "Sum of max (or max−min) over ALL subarrays" → per-element: a[i] is the max of </w:t>
+      </w:r>
+      <w:r>
+        <w:rPr>
+          <w:b/>
+        </w:rPr>
+        <w:t>(i−L)·(R−i)</w:t>
+      </w:r>
+      <w:r>
+        <w:t xml:space="preserve"> subarrays, L/R = nearest greater neighbors via monotonic stack, O(n). </w:t>
+      </w:r>
+      <w:r>
+        <w:rPr>
+          <w:b/>
+        </w:rPr>
+        <w:t>Duplicates</w:t>
+      </w:r>
+      <w:r>
+        <w:t>: strict compare on one side, ≥ on the other — else equal maxima get counted twice/zero times. Do max and min in separate passes, subtract.</w:t>
+      </w:r>
+    </w:p>
+    <w:p>
+      <w:pPr>
+        <w:pStyle w:val="Bullet"/>
+      </w:pPr>
+      <w:r>
         <w:t xml:space="preserve">• </w:t>
       </w:r>
       <w:r>
@@ -6795,10 +6821,7 @@
         <w:pStyle w:val="Bullet"/>
       </w:pPr>
       <w:r>
-        <w:t xml:space="preserve">• </w:t>
-      </w:r>
-      <w:r>
-        <w:t xml:space="preserve">Each node has exactly one outgoing edge (functional graph) → it's cycles with trees hanging off; k-th successor via binary lifting like </w:t>
+        <w:t xml:space="preserve">• Each node has exactly one outgoing edge (functional graph) → it's cycles with trees hanging off; k-th successor via binary lifting like </w:t>
       </w:r>
       <w:r>
         <w:rPr>
@@ -6905,7 +6928,7 @@
           <w:szCs w:val="72"/>
         </w:rPr>
       </w:pPr>
-      <w:bookmarkStart w:id="8" w:name="_Toc237879729"/>
+      <w:bookmarkStart w:id="8" w:name="_Toc237946032"/>
       <w:r>
         <w:rPr>
           <w:sz w:val="72"/>
@@ -6921,7 +6944,7 @@
         <w:pStyle w:val="TemplateHeading"/>
         <w:pageBreakBefore/>
       </w:pPr>
-      <w:bookmarkStart w:id="9" w:name="_Toc237879730"/>
+      <w:bookmarkStart w:id="9" w:name="_Toc237946033"/>
       <w:r>
         <w:lastRenderedPageBreak/>
         <w:t>Divisors</w:t>
@@ -7332,7 +7355,7 @@
         <w:pStyle w:val="TemplateHeading"/>
         <w:pageBreakBefore/>
       </w:pPr>
-      <w:bookmarkStart w:id="10" w:name="_Toc237879731"/>
+      <w:bookmarkStart w:id="10" w:name="_Toc237946034"/>
       <w:r>
         <w:lastRenderedPageBreak/>
         <w:t>Euler's Phi (Totient)</w:t>
@@ -7610,7 +7633,7 @@
         <w:pStyle w:val="TemplateHeading"/>
         <w:pageBreakBefore/>
       </w:pPr>
-      <w:bookmarkStart w:id="11" w:name="_Toc237879732"/>
+      <w:bookmarkStart w:id="11" w:name="_Toc237946035"/>
       <w:r>
         <w:lastRenderedPageBreak/>
         <w:t>Extended GCD &amp; CRT</w:t>
@@ -7986,7 +8009,7 @@
         <w:pStyle w:val="TemplateHeading"/>
         <w:pageBreakBefore/>
       </w:pPr>
-      <w:bookmarkStart w:id="12" w:name="_Toc237879733"/>
+      <w:bookmarkStart w:id="12" w:name="_Toc237946036"/>
       <w:r>
         <w:lastRenderedPageBreak/>
         <w:t>Linear Sieve</w:t>
@@ -8255,7 +8278,7 @@
         <w:pStyle w:val="TemplateHeading"/>
         <w:pageBreakBefore/>
       </w:pPr>
-      <w:bookmarkStart w:id="13" w:name="_Toc237879734"/>
+      <w:bookmarkStart w:id="13" w:name="_Toc237946037"/>
       <w:r>
         <w:lastRenderedPageBreak/>
         <w:t>Miller-Rabin Primality</w:t>
@@ -8674,7 +8697,7 @@
         <w:pStyle w:val="TemplateHeading"/>
         <w:pageBreakBefore/>
       </w:pPr>
-      <w:bookmarkStart w:id="14" w:name="_Toc237879735"/>
+      <w:bookmarkStart w:id="14" w:name="_Toc237946038"/>
       <w:r>
         <w:lastRenderedPageBreak/>
         <w:t>Sieve of Eratosthenes</w:t>
@@ -8961,7 +8984,7 @@
           <w:szCs w:val="72"/>
         </w:rPr>
       </w:pPr>
-      <w:bookmarkStart w:id="15" w:name="_Toc237879736"/>
+      <w:bookmarkStart w:id="15" w:name="_Toc237946039"/>
       <w:r>
         <w:rPr>
           <w:sz w:val="72"/>
@@ -8977,7 +9000,7 @@
         <w:pStyle w:val="TemplateHeading"/>
         <w:pageBreakBefore/>
       </w:pPr>
-      <w:bookmarkStart w:id="16" w:name="_Toc237879737"/>
+      <w:bookmarkStart w:id="16" w:name="_Toc237946040"/>
       <w:r>
         <w:lastRenderedPageBreak/>
         <w:t>Combinatorics Toolkit</w:t>
@@ -9519,7 +9542,7 @@
         <w:pStyle w:val="TemplateHeading"/>
         <w:pageBreakBefore/>
       </w:pPr>
-      <w:bookmarkStart w:id="17" w:name="_Toc237879738"/>
+      <w:bookmarkStart w:id="17" w:name="_Toc237946041"/>
       <w:r>
         <w:lastRenderedPageBreak/>
         <w:t>Partitions (Pentagonal Theorem)</w:t>
@@ -9769,7 +9792,7 @@
         <w:pStyle w:val="TemplateHeading"/>
         <w:pageBreakBefore/>
       </w:pPr>
-      <w:bookmarkStart w:id="18" w:name="_Toc237879739"/>
+      <w:bookmarkStart w:id="18" w:name="_Toc237946042"/>
       <w:r>
         <w:lastRenderedPageBreak/>
         <w:t>nCr - Pascal's Triangle</w:t>
@@ -9976,7 +9999,7 @@
           <w:szCs w:val="72"/>
         </w:rPr>
       </w:pPr>
-      <w:bookmarkStart w:id="19" w:name="_Toc237879740"/>
+      <w:bookmarkStart w:id="19" w:name="_Toc237946043"/>
       <w:r>
         <w:rPr>
           <w:sz w:val="72"/>
@@ -9992,7 +10015,7 @@
         <w:pStyle w:val="TemplateHeading"/>
         <w:pageBreakBefore/>
       </w:pPr>
-      <w:bookmarkStart w:id="20" w:name="_Toc237879741"/>
+      <w:bookmarkStart w:id="20" w:name="_Toc237946044"/>
       <w:r>
         <w:lastRenderedPageBreak/>
         <w:t>Digit DP</w:t>
@@ -10420,7 +10443,7 @@
         <w:pStyle w:val="TemplateHeading"/>
         <w:pageBreakBefore/>
       </w:pPr>
-      <w:bookmarkStart w:id="21" w:name="_Toc237879742"/>
+      <w:bookmarkStart w:id="21" w:name="_Toc237946045"/>
       <w:r>
         <w:lastRenderedPageBreak/>
         <w:t>Longest Increasing Subsequence (LIS)</w:t>
@@ -10663,7 +10686,7 @@
         <w:pStyle w:val="TemplateHeading"/>
         <w:pageBreakBefore/>
       </w:pPr>
-      <w:bookmarkStart w:id="22" w:name="_Toc237879743"/>
+      <w:bookmarkStart w:id="22" w:name="_Toc237946046"/>
       <w:r>
         <w:lastRenderedPageBreak/>
         <w:t>Matrix Exponentiation</w:t>
@@ -11014,7 +11037,7 @@
         <w:pStyle w:val="TemplateHeading"/>
         <w:pageBreakBefore/>
       </w:pPr>
-      <w:bookmarkStart w:id="23" w:name="_Toc237879744"/>
+      <w:bookmarkStart w:id="23" w:name="_Toc237946047"/>
       <w:r>
         <w:lastRenderedPageBreak/>
         <w:t>Rerooting</w:t>
@@ -11382,7 +11405,7 @@
         <w:pStyle w:val="TemplateHeading"/>
         <w:pageBreakBefore/>
       </w:pPr>
-      <w:bookmarkStart w:id="24" w:name="_Toc237879745"/>
+      <w:bookmarkStart w:id="24" w:name="_Toc237946048"/>
       <w:r>
         <w:lastRenderedPageBreak/>
         <w:t>SOS DP (Sum over Subsets)</w:t>
@@ -11625,7 +11648,7 @@
         <w:pStyle w:val="TemplateHeading"/>
         <w:pageBreakBefore/>
       </w:pPr>
-      <w:bookmarkStart w:id="25" w:name="_Toc237879746"/>
+      <w:bookmarkStart w:id="25" w:name="_Toc237946049"/>
       <w:r>
         <w:lastRenderedPageBreak/>
         <w:t>Tree Knapsack</w:t>
@@ -11957,7 +11980,7 @@
           <w:szCs w:val="72"/>
         </w:rPr>
       </w:pPr>
-      <w:bookmarkStart w:id="26" w:name="_Toc237879747"/>
+      <w:bookmarkStart w:id="26" w:name="_Toc237946050"/>
       <w:r>
         <w:rPr>
           <w:sz w:val="72"/>
@@ -11973,7 +11996,7 @@
         <w:pStyle w:val="TemplateHeading"/>
         <w:pageBreakBefore/>
       </w:pPr>
-      <w:bookmarkStart w:id="27" w:name="_Toc237879748"/>
+      <w:bookmarkStart w:id="27" w:name="_Toc237946051"/>
       <w:r>
         <w:lastRenderedPageBreak/>
         <w:t>Articulation Points</w:t>
@@ -12285,7 +12308,7 @@
         <w:pStyle w:val="TemplateHeading"/>
         <w:pageBreakBefore/>
       </w:pPr>
-      <w:bookmarkStart w:id="28" w:name="_Toc237879749"/>
+      <w:bookmarkStart w:id="28" w:name="_Toc237946052"/>
       <w:r>
         <w:lastRenderedPageBreak/>
         <w:t>Bellman-Ford</w:t>
@@ -12607,7 +12630,7 @@
         <w:pStyle w:val="TemplateHeading"/>
         <w:pageBreakBefore/>
       </w:pPr>
-      <w:bookmarkStart w:id="29" w:name="_Toc237879750"/>
+      <w:bookmarkStart w:id="29" w:name="_Toc237946053"/>
       <w:r>
         <w:lastRenderedPageBreak/>
         <w:t>Bridges (Tarjan)</w:t>
@@ -12900,7 +12923,7 @@
         <w:pStyle w:val="TemplateHeading"/>
         <w:pageBreakBefore/>
       </w:pPr>
-      <w:bookmarkStart w:id="30" w:name="_Toc237879751"/>
+      <w:bookmarkStart w:id="30" w:name="_Toc237946054"/>
       <w:r>
         <w:lastRenderedPageBreak/>
         <w:t>Bridge Tree</w:t>
@@ -13462,7 +13485,7 @@
         <w:pStyle w:val="TemplateHeading"/>
         <w:pageBreakBefore/>
       </w:pPr>
-      <w:bookmarkStart w:id="31" w:name="_Toc237879752"/>
+      <w:bookmarkStart w:id="31" w:name="_Toc237946055"/>
       <w:r>
         <w:lastRenderedPageBreak/>
         <w:t>Dijkstra</w:t>
@@ -13763,7 +13786,7 @@
         <w:pStyle w:val="TemplateHeading"/>
         <w:pageBreakBefore/>
       </w:pPr>
-      <w:bookmarkStart w:id="32" w:name="_Toc237879753"/>
+      <w:bookmarkStart w:id="32" w:name="_Toc237946056"/>
       <w:r>
         <w:lastRenderedPageBreak/>
         <w:t>DSU (Union-Find)</w:t>
@@ -14096,7 +14119,7 @@
         <w:pStyle w:val="TemplateHeading"/>
         <w:pageBreakBefore/>
       </w:pPr>
-      <w:bookmarkStart w:id="33" w:name="_Toc237879754"/>
+      <w:bookmarkStart w:id="33" w:name="_Toc237946057"/>
       <w:r>
         <w:lastRenderedPageBreak/>
         <w:t>DSU with Rollback</w:t>
@@ -14512,7 +14535,7 @@
         <w:pStyle w:val="TemplateHeading"/>
         <w:pageBreakBefore/>
       </w:pPr>
-      <w:bookmarkStart w:id="34" w:name="_Toc237879755"/>
+      <w:bookmarkStart w:id="34" w:name="_Toc237946058"/>
       <w:r>
         <w:lastRenderedPageBreak/>
         <w:t>Floyd-Warshall</w:t>
@@ -14776,7 +14799,7 @@
         <w:pStyle w:val="TemplateHeading"/>
         <w:pageBreakBefore/>
       </w:pPr>
-      <w:bookmarkStart w:id="35" w:name="_Toc237879756"/>
+      <w:bookmarkStart w:id="35" w:name="_Toc237946059"/>
       <w:r>
         <w:lastRenderedPageBreak/>
         <w:t>Heavy-Light Decomposition (HLD)</w:t>
@@ -15444,7 +15467,7 @@
         <w:pStyle w:val="TemplateHeading"/>
         <w:pageBreakBefore/>
       </w:pPr>
-      <w:bookmarkStart w:id="36" w:name="_Toc237879757"/>
+      <w:bookmarkStart w:id="36" w:name="_Toc237946060"/>
       <w:r>
         <w:lastRenderedPageBreak/>
         <w:t>LCA (Binary Lifting)</w:t>
@@ -15897,7 +15920,7 @@
         <w:pStyle w:val="TemplateHeading"/>
         <w:pageBreakBefore/>
       </w:pPr>
-      <w:bookmarkStart w:id="37" w:name="_Toc237879758"/>
+      <w:bookmarkStart w:id="37" w:name="_Toc237946061"/>
       <w:r>
         <w:lastRenderedPageBreak/>
         <w:t>MST (Kruskal)</w:t>
@@ -16281,7 +16304,7 @@
         <w:pStyle w:val="TemplateHeading"/>
         <w:pageBreakBefore/>
       </w:pPr>
-      <w:bookmarkStart w:id="38" w:name="_Toc237879759"/>
+      <w:bookmarkStart w:id="38" w:name="_Toc237946062"/>
       <w:r>
         <w:lastRenderedPageBreak/>
         <w:t>Strongly Connected Components (SCC)</w:t>
@@ -16916,7 +16939,7 @@
         <w:pStyle w:val="TemplateHeading"/>
         <w:pageBreakBefore/>
       </w:pPr>
-      <w:bookmarkStart w:id="39" w:name="_Toc237879760"/>
+      <w:bookmarkStart w:id="39" w:name="_Toc237946063"/>
       <w:r>
         <w:lastRenderedPageBreak/>
         <w:t>Topological Sort</w:t>
@@ -17179,7 +17202,7 @@
           <w:szCs w:val="72"/>
         </w:rPr>
       </w:pPr>
-      <w:bookmarkStart w:id="40" w:name="_Toc237879761"/>
+      <w:bookmarkStart w:id="40" w:name="_Toc237946064"/>
       <w:r>
         <w:rPr>
           <w:sz w:val="72"/>
@@ -17195,7 +17218,7 @@
         <w:pStyle w:val="TemplateHeading"/>
         <w:pageBreakBefore/>
       </w:pPr>
-      <w:bookmarkStart w:id="41" w:name="_Toc237879762"/>
+      <w:bookmarkStart w:id="41" w:name="_Toc237946065"/>
       <w:r>
         <w:lastRenderedPageBreak/>
         <w:t>Fenwick Tree (Point Update, Range Query)</w:t>
@@ -17537,7 +17560,7 @@
         <w:pStyle w:val="TemplateHeading"/>
         <w:pageBreakBefore/>
       </w:pPr>
-      <w:bookmarkStart w:id="42" w:name="_Toc237879763"/>
+      <w:bookmarkStart w:id="42" w:name="_Toc237946066"/>
       <w:r>
         <w:lastRenderedPageBreak/>
         <w:t>Fenwick Tree (Range Update, Point Query)</w:t>
@@ -17828,7 +17851,7 @@
         <w:pStyle w:val="TemplateHeading"/>
         <w:pageBreakBefore/>
       </w:pPr>
-      <w:bookmarkStart w:id="43" w:name="_Toc237879764"/>
+      <w:bookmarkStart w:id="43" w:name="_Toc237946067"/>
       <w:r>
         <w:lastRenderedPageBreak/>
         <w:t>Lazy Segment Tree</w:t>
@@ -18778,7 +18801,7 @@
         <w:pStyle w:val="TemplateHeading"/>
         <w:pageBreakBefore/>
       </w:pPr>
-      <w:bookmarkStart w:id="44" w:name="_Toc237879765"/>
+      <w:bookmarkStart w:id="44" w:name="_Toc237946068"/>
       <w:r>
         <w:lastRenderedPageBreak/>
         <w:t>Mo's Algorithm</w:t>
@@ -19266,7 +19289,7 @@
         <w:pStyle w:val="TemplateHeading"/>
         <w:pageBreakBefore/>
       </w:pPr>
-      <w:bookmarkStart w:id="45" w:name="_Toc237879766"/>
+      <w:bookmarkStart w:id="45" w:name="_Toc237946069"/>
       <w:r>
         <w:lastRenderedPageBreak/>
         <w:t>Mo on Tree</w:t>
@@ -20289,7 +20312,7 @@
         <w:pStyle w:val="TemplateHeading"/>
         <w:pageBreakBefore/>
       </w:pPr>
-      <w:bookmarkStart w:id="46" w:name="_Toc237879767"/>
+      <w:bookmarkStart w:id="46" w:name="_Toc237946070"/>
       <w:r>
         <w:lastRenderedPageBreak/>
         <w:t>Mo with Rollback</w:t>
@@ -21051,7 +21074,7 @@
         <w:pStyle w:val="TemplateHeading"/>
         <w:pageBreakBefore/>
       </w:pPr>
-      <w:bookmarkStart w:id="47" w:name="_Toc237879768"/>
+      <w:bookmarkStart w:id="47" w:name="_Toc237946071"/>
       <w:r>
         <w:lastRenderedPageBreak/>
         <w:t>Segment Tree</w:t>
@@ -21575,7 +21598,7 @@
         <w:pStyle w:val="TemplateHeading"/>
         <w:pageBreakBefore/>
       </w:pPr>
-      <w:bookmarkStart w:id="48" w:name="_Toc237879769"/>
+      <w:bookmarkStart w:id="48" w:name="_Toc237946072"/>
       <w:r>
         <w:lastRenderedPageBreak/>
         <w:t>Segment Tree (Iterative)</w:t>
@@ -22060,7 +22083,7 @@
         <w:pStyle w:val="TemplateHeading"/>
         <w:pageBreakBefore/>
       </w:pPr>
-      <w:bookmarkStart w:id="49" w:name="_Toc237879770"/>
+      <w:bookmarkStart w:id="49" w:name="_Toc237946073"/>
       <w:r>
         <w:lastRenderedPageBreak/>
         <w:t>Sliding Window Min/Max</w:t>
@@ -22314,7 +22337,7 @@
         <w:pStyle w:val="TemplateHeading"/>
         <w:pageBreakBefore/>
       </w:pPr>
-      <w:bookmarkStart w:id="50" w:name="_Toc237879771"/>
+      <w:bookmarkStart w:id="50" w:name="_Toc237946074"/>
       <w:r>
         <w:lastRenderedPageBreak/>
         <w:t>Sparse Table</w:t>
@@ -22661,7 +22684,7 @@
         <w:pStyle w:val="TemplateHeading"/>
         <w:pageBreakBefore/>
       </w:pPr>
-      <w:bookmarkStart w:id="51" w:name="_Toc237879772"/>
+      <w:bookmarkStart w:id="51" w:name="_Toc237946075"/>
       <w:r>
         <w:lastRenderedPageBreak/>
         <w:t>Sqrt Decomposition</w:t>
@@ -22977,7 +23000,7 @@
           <w:szCs w:val="72"/>
         </w:rPr>
       </w:pPr>
-      <w:bookmarkStart w:id="52" w:name="_Toc237879773"/>
+      <w:bookmarkStart w:id="52" w:name="_Toc237946076"/>
       <w:r>
         <w:rPr>
           <w:sz w:val="72"/>
@@ -22993,7 +23016,7 @@
         <w:pStyle w:val="TemplateHeading"/>
         <w:pageBreakBefore/>
       </w:pPr>
-      <w:bookmarkStart w:id="53" w:name="_Toc237879774"/>
+      <w:bookmarkStart w:id="53" w:name="_Toc237946077"/>
       <w:r>
         <w:lastRenderedPageBreak/>
         <w:t>Binary Trie (XOR)</w:t>
@@ -23614,7 +23637,7 @@
         <w:pStyle w:val="TemplateHeading"/>
         <w:pageBreakBefore/>
       </w:pPr>
-      <w:bookmarkStart w:id="54" w:name="_Toc237879775"/>
+      <w:bookmarkStart w:id="54" w:name="_Toc237946078"/>
       <w:r>
         <w:lastRenderedPageBreak/>
         <w:t>String Hashing</w:t>
@@ -24074,7 +24097,7 @@
         <w:pStyle w:val="TemplateHeading"/>
         <w:pageBreakBefore/>
       </w:pPr>
-      <w:bookmarkStart w:id="55" w:name="_Toc237879776"/>
+      <w:bookmarkStart w:id="55" w:name="_Toc237946079"/>
       <w:r>
         <w:lastRenderedPageBreak/>
         <w:t>KMP (Prefix Function)</w:t>
@@ -24370,7 +24393,7 @@
         <w:pStyle w:val="TemplateHeading"/>
         <w:pageBreakBefore/>
       </w:pPr>
-      <w:bookmarkStart w:id="56" w:name="_Toc237879777"/>
+      <w:bookmarkStart w:id="56" w:name="_Toc237946080"/>
       <w:r>
         <w:lastRenderedPageBreak/>
         <w:t>Manacher (Palindromes)</w:t>
@@ -24671,7 +24694,7 @@
         <w:pStyle w:val="TemplateHeading"/>
         <w:pageBreakBefore/>
       </w:pPr>
-      <w:bookmarkStart w:id="57" w:name="_Toc237879778"/>
+      <w:bookmarkStart w:id="57" w:name="_Toc237946081"/>
       <w:r>
         <w:lastRenderedPageBreak/>
         <w:t>Multiset Hashing</w:t>
@@ -25063,7 +25086,7 @@
         <w:pStyle w:val="TemplateHeading"/>
         <w:pageBreakBefore/>
       </w:pPr>
-      <w:bookmarkStart w:id="58" w:name="_Toc237879779"/>
+      <w:bookmarkStart w:id="58" w:name="_Toc237946082"/>
       <w:r>
         <w:lastRenderedPageBreak/>
         <w:t>Trie</w:t>
@@ -25689,7 +25712,7 @@
           <w:szCs w:val="72"/>
         </w:rPr>
       </w:pPr>
-      <w:bookmarkStart w:id="59" w:name="_Toc237879780"/>
+      <w:bookmarkStart w:id="59" w:name="_Toc237946083"/>
       <w:r>
         <w:rPr>
           <w:sz w:val="72"/>
@@ -25705,7 +25728,7 @@
         <w:pStyle w:val="TemplateHeading"/>
         <w:pageBreakBefore/>
       </w:pPr>
-      <w:bookmarkStart w:id="60" w:name="_Toc237879781"/>
+      <w:bookmarkStart w:id="60" w:name="_Toc237946084"/>
       <w:r>
         <w:lastRenderedPageBreak/>
         <w:t>Closest Pair of Points</w:t>
@@ -25953,7 +25976,7 @@
         <w:pStyle w:val="TemplateHeading"/>
         <w:pageBreakBefore/>
       </w:pPr>
-      <w:bookmarkStart w:id="61" w:name="_Toc237879782"/>
+      <w:bookmarkStart w:id="61" w:name="_Toc237946085"/>
       <w:r>
         <w:lastRenderedPageBreak/>
         <w:t>Geometry Basics</w:t>
@@ -26508,7 +26531,7 @@
           <w:szCs w:val="72"/>
         </w:rPr>
       </w:pPr>
-      <w:bookmarkStart w:id="62" w:name="_Toc237879783"/>
+      <w:bookmarkStart w:id="62" w:name="_Toc237946086"/>
       <w:r>
         <w:rPr>
           <w:sz w:val="72"/>
@@ -26524,7 +26547,7 @@
         <w:pStyle w:val="TemplateHeading"/>
         <w:pageBreakBefore/>
       </w:pPr>
-      <w:bookmarkStart w:id="63" w:name="_Toc237879784"/>
+      <w:bookmarkStart w:id="63" w:name="_Toc237946087"/>
       <w:r>
         <w:lastRenderedPageBreak/>
         <w:t>Bit Tricks</w:t>
@@ -26772,7 +26795,7 @@
         <w:pStyle w:val="TemplateHeading"/>
         <w:pageBreakBefore/>
       </w:pPr>
-      <w:bookmarkStart w:id="64" w:name="_Toc237879785"/>
+      <w:bookmarkStart w:id="64" w:name="_Toc237946088"/>
       <w:r>
         <w:lastRenderedPageBreak/>
         <w:t>Coordinate Compression</w:t>
@@ -26930,7 +26953,7 @@
         <w:pStyle w:val="TemplateHeading"/>
         <w:pageBreakBefore/>
       </w:pPr>
-      <w:bookmarkStart w:id="65" w:name="_Toc237879786"/>
+      <w:bookmarkStart w:id="65" w:name="_Toc237946089"/>
       <w:r>
         <w:lastRenderedPageBreak/>
         <w:t>Ordered Multiset (PBDS)</w:t>
@@ -27164,7 +27187,7 @@
         <w:pStyle w:val="TemplateHeading"/>
         <w:pageBreakBefore/>
       </w:pPr>
-      <w:bookmarkStart w:id="66" w:name="_Toc237879787"/>
+      <w:bookmarkStart w:id="66" w:name="_Toc237946090"/>
       <w:r>
         <w:lastRenderedPageBreak/>
         <w:t>Random (RNG)</w:t>

</xml_diff>

<commit_message>
Add subset contribution formulas (n*2^(n-1)) to notes
Co-Authored-By: Claude Fable 5 <noreply@anthropic.com>
</commit_message>
<xml_diff>
--- a/CP-Reference.docx
+++ b/CP-Reference.docx
@@ -50,7 +50,7 @@
       <w:r>
         <w:fldChar w:fldCharType="separate"/>
       </w:r>
-      <w:hyperlink w:anchor="_Toc237946024" w:history="1">
+      <w:hyperlink w:anchor="_Toc237948897" w:history="1">
         <w:r>
           <w:rPr>
             <w:rStyle w:val="Hyperlink"/>
@@ -77,7 +77,7 @@
             <w:noProof/>
             <w:webHidden/>
           </w:rPr>
-          <w:instrText xml:space="preserve"> PAGEREF _Toc237946024 \h </w:instrText>
+          <w:instrText xml:space="preserve"> PAGEREF _Toc237948897 \h </w:instrText>
         </w:r>
         <w:r>
           <w:rPr>
@@ -123,7 +123,7 @@
           <w14:ligatures w14:val="standardContextual"/>
         </w:rPr>
       </w:pPr>
-      <w:hyperlink w:anchor="_Toc237946025" w:history="1">
+      <w:hyperlink w:anchor="_Toc237948898" w:history="1">
         <w:r>
           <w:rPr>
             <w:rStyle w:val="Hyperlink"/>
@@ -150,7 +150,7 @@
             <w:noProof/>
             <w:webHidden/>
           </w:rPr>
-          <w:instrText xml:space="preserve"> PAGEREF _Toc237946025 \h </w:instrText>
+          <w:instrText xml:space="preserve"> PAGEREF _Toc237948898 \h </w:instrText>
         </w:r>
         <w:r>
           <w:rPr>
@@ -196,7 +196,7 @@
           <w14:ligatures w14:val="standardContextual"/>
         </w:rPr>
       </w:pPr>
-      <w:hyperlink w:anchor="_Toc237946026" w:history="1">
+      <w:hyperlink w:anchor="_Toc237948899" w:history="1">
         <w:r>
           <w:rPr>
             <w:rStyle w:val="Hyperlink"/>
@@ -223,7 +223,7 @@
             <w:noProof/>
             <w:webHidden/>
           </w:rPr>
-          <w:instrText xml:space="preserve"> PAGEREF _Toc237946026 \h </w:instrText>
+          <w:instrText xml:space="preserve"> PAGEREF _Toc237948899 \h </w:instrText>
         </w:r>
         <w:r>
           <w:rPr>
@@ -269,7 +269,7 @@
           <w14:ligatures w14:val="standardContextual"/>
         </w:rPr>
       </w:pPr>
-      <w:hyperlink w:anchor="_Toc237946027" w:history="1">
+      <w:hyperlink w:anchor="_Toc237948900" w:history="1">
         <w:r>
           <w:rPr>
             <w:rStyle w:val="Hyperlink"/>
@@ -296,7 +296,7 @@
             <w:noProof/>
             <w:webHidden/>
           </w:rPr>
-          <w:instrText xml:space="preserve"> PAGEREF _Toc237946027 \h </w:instrText>
+          <w:instrText xml:space="preserve"> PAGEREF _Toc237948900 \h </w:instrText>
         </w:r>
         <w:r>
           <w:rPr>
@@ -342,7 +342,7 @@
           <w14:ligatures w14:val="standardContextual"/>
         </w:rPr>
       </w:pPr>
-      <w:hyperlink w:anchor="_Toc237946028" w:history="1">
+      <w:hyperlink w:anchor="_Toc237948901" w:history="1">
         <w:r>
           <w:rPr>
             <w:rStyle w:val="Hyperlink"/>
@@ -369,7 +369,7 @@
             <w:noProof/>
             <w:webHidden/>
           </w:rPr>
-          <w:instrText xml:space="preserve"> PAGEREF _Toc237946028 \h </w:instrText>
+          <w:instrText xml:space="preserve"> PAGEREF _Toc237948901 \h </w:instrText>
         </w:r>
         <w:r>
           <w:rPr>
@@ -415,7 +415,7 @@
           <w14:ligatures w14:val="standardContextual"/>
         </w:rPr>
       </w:pPr>
-      <w:hyperlink w:anchor="_Toc237946029" w:history="1">
+      <w:hyperlink w:anchor="_Toc237948902" w:history="1">
         <w:r>
           <w:rPr>
             <w:rStyle w:val="Hyperlink"/>
@@ -442,7 +442,7 @@
             <w:noProof/>
             <w:webHidden/>
           </w:rPr>
-          <w:instrText xml:space="preserve"> PAGEREF _Toc237946029 \h </w:instrText>
+          <w:instrText xml:space="preserve"> PAGEREF _Toc237948902 \h </w:instrText>
         </w:r>
         <w:r>
           <w:rPr>
@@ -488,7 +488,7 @@
           <w14:ligatures w14:val="standardContextual"/>
         </w:rPr>
       </w:pPr>
-      <w:hyperlink w:anchor="_Toc237946030" w:history="1">
+      <w:hyperlink w:anchor="_Toc237948903" w:history="1">
         <w:r>
           <w:rPr>
             <w:rStyle w:val="Hyperlink"/>
@@ -515,7 +515,7 @@
             <w:noProof/>
             <w:webHidden/>
           </w:rPr>
-          <w:instrText xml:space="preserve"> PAGEREF _Toc237946030 \h </w:instrText>
+          <w:instrText xml:space="preserve"> PAGEREF _Toc237948903 \h </w:instrText>
         </w:r>
         <w:r>
           <w:rPr>
@@ -561,7 +561,7 @@
           <w14:ligatures w14:val="standardContextual"/>
         </w:rPr>
       </w:pPr>
-      <w:hyperlink w:anchor="_Toc237946031" w:history="1">
+      <w:hyperlink w:anchor="_Toc237948904" w:history="1">
         <w:r>
           <w:rPr>
             <w:rStyle w:val="Hyperlink"/>
@@ -588,7 +588,7 @@
             <w:noProof/>
             <w:webHidden/>
           </w:rPr>
-          <w:instrText xml:space="preserve"> PAGEREF _Toc237946031 \h </w:instrText>
+          <w:instrText xml:space="preserve"> PAGEREF _Toc237948904 \h </w:instrText>
         </w:r>
         <w:r>
           <w:rPr>
@@ -635,7 +635,7 @@
           <w14:ligatures w14:val="standardContextual"/>
         </w:rPr>
       </w:pPr>
-      <w:hyperlink w:anchor="_Toc237946032" w:history="1">
+      <w:hyperlink w:anchor="_Toc237948905" w:history="1">
         <w:r>
           <w:rPr>
             <w:rStyle w:val="Hyperlink"/>
@@ -662,7 +662,7 @@
             <w:noProof/>
             <w:webHidden/>
           </w:rPr>
-          <w:instrText xml:space="preserve"> PAGEREF _Toc237946032 \h </w:instrText>
+          <w:instrText xml:space="preserve"> PAGEREF _Toc237948905 \h </w:instrText>
         </w:r>
         <w:r>
           <w:rPr>
@@ -708,7 +708,7 @@
           <w14:ligatures w14:val="standardContextual"/>
         </w:rPr>
       </w:pPr>
-      <w:hyperlink w:anchor="_Toc237946033" w:history="1">
+      <w:hyperlink w:anchor="_Toc237948906" w:history="1">
         <w:r>
           <w:rPr>
             <w:rStyle w:val="Hyperlink"/>
@@ -735,7 +735,7 @@
             <w:noProof/>
             <w:webHidden/>
           </w:rPr>
-          <w:instrText xml:space="preserve"> PAGEREF _Toc237946033 \h </w:instrText>
+          <w:instrText xml:space="preserve"> PAGEREF _Toc237948906 \h </w:instrText>
         </w:r>
         <w:r>
           <w:rPr>
@@ -781,7 +781,7 @@
           <w14:ligatures w14:val="standardContextual"/>
         </w:rPr>
       </w:pPr>
-      <w:hyperlink w:anchor="_Toc237946034" w:history="1">
+      <w:hyperlink w:anchor="_Toc237948907" w:history="1">
         <w:r>
           <w:rPr>
             <w:rStyle w:val="Hyperlink"/>
@@ -808,7 +808,7 @@
             <w:noProof/>
             <w:webHidden/>
           </w:rPr>
-          <w:instrText xml:space="preserve"> PAGEREF _Toc237946034 \h </w:instrText>
+          <w:instrText xml:space="preserve"> PAGEREF _Toc237948907 \h </w:instrText>
         </w:r>
         <w:r>
           <w:rPr>
@@ -854,7 +854,7 @@
           <w14:ligatures w14:val="standardContextual"/>
         </w:rPr>
       </w:pPr>
-      <w:hyperlink w:anchor="_Toc237946035" w:history="1">
+      <w:hyperlink w:anchor="_Toc237948908" w:history="1">
         <w:r>
           <w:rPr>
             <w:rStyle w:val="Hyperlink"/>
@@ -881,7 +881,7 @@
             <w:noProof/>
             <w:webHidden/>
           </w:rPr>
-          <w:instrText xml:space="preserve"> PAGEREF _Toc237946035 \h </w:instrText>
+          <w:instrText xml:space="preserve"> PAGEREF _Toc237948908 \h </w:instrText>
         </w:r>
         <w:r>
           <w:rPr>
@@ -927,7 +927,7 @@
           <w14:ligatures w14:val="standardContextual"/>
         </w:rPr>
       </w:pPr>
-      <w:hyperlink w:anchor="_Toc237946036" w:history="1">
+      <w:hyperlink w:anchor="_Toc237948909" w:history="1">
         <w:r>
           <w:rPr>
             <w:rStyle w:val="Hyperlink"/>
@@ -954,7 +954,7 @@
             <w:noProof/>
             <w:webHidden/>
           </w:rPr>
-          <w:instrText xml:space="preserve"> PAGEREF _Toc237946036 \h </w:instrText>
+          <w:instrText xml:space="preserve"> PAGEREF _Toc237948909 \h </w:instrText>
         </w:r>
         <w:r>
           <w:rPr>
@@ -1000,7 +1000,7 @@
           <w14:ligatures w14:val="standardContextual"/>
         </w:rPr>
       </w:pPr>
-      <w:hyperlink w:anchor="_Toc237946037" w:history="1">
+      <w:hyperlink w:anchor="_Toc237948910" w:history="1">
         <w:r>
           <w:rPr>
             <w:rStyle w:val="Hyperlink"/>
@@ -1027,7 +1027,7 @@
             <w:noProof/>
             <w:webHidden/>
           </w:rPr>
-          <w:instrText xml:space="preserve"> PAGEREF _Toc237946037 \h </w:instrText>
+          <w:instrText xml:space="preserve"> PAGEREF _Toc237948910 \h </w:instrText>
         </w:r>
         <w:r>
           <w:rPr>
@@ -1073,7 +1073,7 @@
           <w14:ligatures w14:val="standardContextual"/>
         </w:rPr>
       </w:pPr>
-      <w:hyperlink w:anchor="_Toc237946038" w:history="1">
+      <w:hyperlink w:anchor="_Toc237948911" w:history="1">
         <w:r>
           <w:rPr>
             <w:rStyle w:val="Hyperlink"/>
@@ -1100,7 +1100,7 @@
             <w:noProof/>
             <w:webHidden/>
           </w:rPr>
-          <w:instrText xml:space="preserve"> PAGEREF _Toc237946038 \h </w:instrText>
+          <w:instrText xml:space="preserve"> PAGEREF _Toc237948911 \h </w:instrText>
         </w:r>
         <w:r>
           <w:rPr>
@@ -1147,7 +1147,7 @@
           <w14:ligatures w14:val="standardContextual"/>
         </w:rPr>
       </w:pPr>
-      <w:hyperlink w:anchor="_Toc237946039" w:history="1">
+      <w:hyperlink w:anchor="_Toc237948912" w:history="1">
         <w:r>
           <w:rPr>
             <w:rStyle w:val="Hyperlink"/>
@@ -1174,7 +1174,7 @@
             <w:noProof/>
             <w:webHidden/>
           </w:rPr>
-          <w:instrText xml:space="preserve"> PAGEREF _Toc237946039 \h </w:instrText>
+          <w:instrText xml:space="preserve"> PAGEREF _Toc237948912 \h </w:instrText>
         </w:r>
         <w:r>
           <w:rPr>
@@ -1220,7 +1220,7 @@
           <w14:ligatures w14:val="standardContextual"/>
         </w:rPr>
       </w:pPr>
-      <w:hyperlink w:anchor="_Toc237946040" w:history="1">
+      <w:hyperlink w:anchor="_Toc237948913" w:history="1">
         <w:r>
           <w:rPr>
             <w:rStyle w:val="Hyperlink"/>
@@ -1247,7 +1247,7 @@
             <w:noProof/>
             <w:webHidden/>
           </w:rPr>
-          <w:instrText xml:space="preserve"> PAGEREF _Toc237946040 \h </w:instrText>
+          <w:instrText xml:space="preserve"> PAGEREF _Toc237948913 \h </w:instrText>
         </w:r>
         <w:r>
           <w:rPr>
@@ -1293,7 +1293,7 @@
           <w14:ligatures w14:val="standardContextual"/>
         </w:rPr>
       </w:pPr>
-      <w:hyperlink w:anchor="_Toc237946041" w:history="1">
+      <w:hyperlink w:anchor="_Toc237948914" w:history="1">
         <w:r>
           <w:rPr>
             <w:rStyle w:val="Hyperlink"/>
@@ -1320,7 +1320,7 @@
             <w:noProof/>
             <w:webHidden/>
           </w:rPr>
-          <w:instrText xml:space="preserve"> PAGEREF _Toc237946041 \h </w:instrText>
+          <w:instrText xml:space="preserve"> PAGEREF _Toc237948914 \h </w:instrText>
         </w:r>
         <w:r>
           <w:rPr>
@@ -1366,7 +1366,7 @@
           <w14:ligatures w14:val="standardContextual"/>
         </w:rPr>
       </w:pPr>
-      <w:hyperlink w:anchor="_Toc237946042" w:history="1">
+      <w:hyperlink w:anchor="_Toc237948915" w:history="1">
         <w:r>
           <w:rPr>
             <w:rStyle w:val="Hyperlink"/>
@@ -1393,7 +1393,7 @@
             <w:noProof/>
             <w:webHidden/>
           </w:rPr>
-          <w:instrText xml:space="preserve"> PAGEREF _Toc237946042 \h </w:instrText>
+          <w:instrText xml:space="preserve"> PAGEREF _Toc237948915 \h </w:instrText>
         </w:r>
         <w:r>
           <w:rPr>
@@ -1440,7 +1440,7 @@
           <w14:ligatures w14:val="standardContextual"/>
         </w:rPr>
       </w:pPr>
-      <w:hyperlink w:anchor="_Toc237946043" w:history="1">
+      <w:hyperlink w:anchor="_Toc237948916" w:history="1">
         <w:r>
           <w:rPr>
             <w:rStyle w:val="Hyperlink"/>
@@ -1467,7 +1467,7 @@
             <w:noProof/>
             <w:webHidden/>
           </w:rPr>
-          <w:instrText xml:space="preserve"> PAGEREF _Toc237946043 \h </w:instrText>
+          <w:instrText xml:space="preserve"> PAGEREF _Toc237948916 \h </w:instrText>
         </w:r>
         <w:r>
           <w:rPr>
@@ -1513,7 +1513,7 @@
           <w14:ligatures w14:val="standardContextual"/>
         </w:rPr>
       </w:pPr>
-      <w:hyperlink w:anchor="_Toc237946044" w:history="1">
+      <w:hyperlink w:anchor="_Toc237948917" w:history="1">
         <w:r>
           <w:rPr>
             <w:rStyle w:val="Hyperlink"/>
@@ -1540,7 +1540,7 @@
             <w:noProof/>
             <w:webHidden/>
           </w:rPr>
-          <w:instrText xml:space="preserve"> PAGEREF _Toc237946044 \h </w:instrText>
+          <w:instrText xml:space="preserve"> PAGEREF _Toc237948917 \h </w:instrText>
         </w:r>
         <w:r>
           <w:rPr>
@@ -1586,7 +1586,7 @@
           <w14:ligatures w14:val="standardContextual"/>
         </w:rPr>
       </w:pPr>
-      <w:hyperlink w:anchor="_Toc237946045" w:history="1">
+      <w:hyperlink w:anchor="_Toc237948918" w:history="1">
         <w:r>
           <w:rPr>
             <w:rStyle w:val="Hyperlink"/>
@@ -1613,7 +1613,7 @@
             <w:noProof/>
             <w:webHidden/>
           </w:rPr>
-          <w:instrText xml:space="preserve"> PAGEREF _Toc237946045 \h </w:instrText>
+          <w:instrText xml:space="preserve"> PAGEREF _Toc237948918 \h </w:instrText>
         </w:r>
         <w:r>
           <w:rPr>
@@ -1659,7 +1659,7 @@
           <w14:ligatures w14:val="standardContextual"/>
         </w:rPr>
       </w:pPr>
-      <w:hyperlink w:anchor="_Toc237946046" w:history="1">
+      <w:hyperlink w:anchor="_Toc237948919" w:history="1">
         <w:r>
           <w:rPr>
             <w:rStyle w:val="Hyperlink"/>
@@ -1686,7 +1686,7 @@
             <w:noProof/>
             <w:webHidden/>
           </w:rPr>
-          <w:instrText xml:space="preserve"> PAGEREF _Toc237946046 \h </w:instrText>
+          <w:instrText xml:space="preserve"> PAGEREF _Toc237948919 \h </w:instrText>
         </w:r>
         <w:r>
           <w:rPr>
@@ -1732,7 +1732,7 @@
           <w14:ligatures w14:val="standardContextual"/>
         </w:rPr>
       </w:pPr>
-      <w:hyperlink w:anchor="_Toc237946047" w:history="1">
+      <w:hyperlink w:anchor="_Toc237948920" w:history="1">
         <w:r>
           <w:rPr>
             <w:rStyle w:val="Hyperlink"/>
@@ -1759,7 +1759,7 @@
             <w:noProof/>
             <w:webHidden/>
           </w:rPr>
-          <w:instrText xml:space="preserve"> PAGEREF _Toc237946047 \h </w:instrText>
+          <w:instrText xml:space="preserve"> PAGEREF _Toc237948920 \h </w:instrText>
         </w:r>
         <w:r>
           <w:rPr>
@@ -1805,7 +1805,7 @@
           <w14:ligatures w14:val="standardContextual"/>
         </w:rPr>
       </w:pPr>
-      <w:hyperlink w:anchor="_Toc237946048" w:history="1">
+      <w:hyperlink w:anchor="_Toc237948921" w:history="1">
         <w:r>
           <w:rPr>
             <w:rStyle w:val="Hyperlink"/>
@@ -1832,7 +1832,7 @@
             <w:noProof/>
             <w:webHidden/>
           </w:rPr>
-          <w:instrText xml:space="preserve"> PAGEREF _Toc237946048 \h </w:instrText>
+          <w:instrText xml:space="preserve"> PAGEREF _Toc237948921 \h </w:instrText>
         </w:r>
         <w:r>
           <w:rPr>
@@ -1878,7 +1878,7 @@
           <w14:ligatures w14:val="standardContextual"/>
         </w:rPr>
       </w:pPr>
-      <w:hyperlink w:anchor="_Toc237946049" w:history="1">
+      <w:hyperlink w:anchor="_Toc237948922" w:history="1">
         <w:r>
           <w:rPr>
             <w:rStyle w:val="Hyperlink"/>
@@ -1905,7 +1905,7 @@
             <w:noProof/>
             <w:webHidden/>
           </w:rPr>
-          <w:instrText xml:space="preserve"> PAGEREF _Toc237946049 \h </w:instrText>
+          <w:instrText xml:space="preserve"> PAGEREF _Toc237948922 \h </w:instrText>
         </w:r>
         <w:r>
           <w:rPr>
@@ -1952,7 +1952,7 @@
           <w14:ligatures w14:val="standardContextual"/>
         </w:rPr>
       </w:pPr>
-      <w:hyperlink w:anchor="_Toc237946050" w:history="1">
+      <w:hyperlink w:anchor="_Toc237948923" w:history="1">
         <w:r>
           <w:rPr>
             <w:rStyle w:val="Hyperlink"/>
@@ -1979,7 +1979,7 @@
             <w:noProof/>
             <w:webHidden/>
           </w:rPr>
-          <w:instrText xml:space="preserve"> PAGEREF _Toc237946050 \h </w:instrText>
+          <w:instrText xml:space="preserve"> PAGEREF _Toc237948923 \h </w:instrText>
         </w:r>
         <w:r>
           <w:rPr>
@@ -2025,7 +2025,7 @@
           <w14:ligatures w14:val="standardContextual"/>
         </w:rPr>
       </w:pPr>
-      <w:hyperlink w:anchor="_Toc237946051" w:history="1">
+      <w:hyperlink w:anchor="_Toc237948924" w:history="1">
         <w:r>
           <w:rPr>
             <w:rStyle w:val="Hyperlink"/>
@@ -2052,7 +2052,7 @@
             <w:noProof/>
             <w:webHidden/>
           </w:rPr>
-          <w:instrText xml:space="preserve"> PAGEREF _Toc237946051 \h </w:instrText>
+          <w:instrText xml:space="preserve"> PAGEREF _Toc237948924 \h </w:instrText>
         </w:r>
         <w:r>
           <w:rPr>
@@ -2098,7 +2098,7 @@
           <w14:ligatures w14:val="standardContextual"/>
         </w:rPr>
       </w:pPr>
-      <w:hyperlink w:anchor="_Toc237946052" w:history="1">
+      <w:hyperlink w:anchor="_Toc237948925" w:history="1">
         <w:r>
           <w:rPr>
             <w:rStyle w:val="Hyperlink"/>
@@ -2125,7 +2125,7 @@
             <w:noProof/>
             <w:webHidden/>
           </w:rPr>
-          <w:instrText xml:space="preserve"> PAGEREF _Toc237946052 \h </w:instrText>
+          <w:instrText xml:space="preserve"> PAGEREF _Toc237948925 \h </w:instrText>
         </w:r>
         <w:r>
           <w:rPr>
@@ -2171,7 +2171,7 @@
           <w14:ligatures w14:val="standardContextual"/>
         </w:rPr>
       </w:pPr>
-      <w:hyperlink w:anchor="_Toc237946053" w:history="1">
+      <w:hyperlink w:anchor="_Toc237948926" w:history="1">
         <w:r>
           <w:rPr>
             <w:rStyle w:val="Hyperlink"/>
@@ -2198,7 +2198,7 @@
             <w:noProof/>
             <w:webHidden/>
           </w:rPr>
-          <w:instrText xml:space="preserve"> PAGEREF _Toc237946053 \h </w:instrText>
+          <w:instrText xml:space="preserve"> PAGEREF _Toc237948926 \h </w:instrText>
         </w:r>
         <w:r>
           <w:rPr>
@@ -2244,7 +2244,7 @@
           <w14:ligatures w14:val="standardContextual"/>
         </w:rPr>
       </w:pPr>
-      <w:hyperlink w:anchor="_Toc237946054" w:history="1">
+      <w:hyperlink w:anchor="_Toc237948927" w:history="1">
         <w:r>
           <w:rPr>
             <w:rStyle w:val="Hyperlink"/>
@@ -2271,7 +2271,7 @@
             <w:noProof/>
             <w:webHidden/>
           </w:rPr>
-          <w:instrText xml:space="preserve"> PAGEREF _Toc237946054 \h </w:instrText>
+          <w:instrText xml:space="preserve"> PAGEREF _Toc237948927 \h </w:instrText>
         </w:r>
         <w:r>
           <w:rPr>
@@ -2317,7 +2317,7 @@
           <w14:ligatures w14:val="standardContextual"/>
         </w:rPr>
       </w:pPr>
-      <w:hyperlink w:anchor="_Toc237946055" w:history="1">
+      <w:hyperlink w:anchor="_Toc237948928" w:history="1">
         <w:r>
           <w:rPr>
             <w:rStyle w:val="Hyperlink"/>
@@ -2344,7 +2344,7 @@
             <w:noProof/>
             <w:webHidden/>
           </w:rPr>
-          <w:instrText xml:space="preserve"> PAGEREF _Toc237946055 \h </w:instrText>
+          <w:instrText xml:space="preserve"> PAGEREF _Toc237948928 \h </w:instrText>
         </w:r>
         <w:r>
           <w:rPr>
@@ -2390,7 +2390,7 @@
           <w14:ligatures w14:val="standardContextual"/>
         </w:rPr>
       </w:pPr>
-      <w:hyperlink w:anchor="_Toc237946056" w:history="1">
+      <w:hyperlink w:anchor="_Toc237948929" w:history="1">
         <w:r>
           <w:rPr>
             <w:rStyle w:val="Hyperlink"/>
@@ -2417,7 +2417,7 @@
             <w:noProof/>
             <w:webHidden/>
           </w:rPr>
-          <w:instrText xml:space="preserve"> PAGEREF _Toc237946056 \h </w:instrText>
+          <w:instrText xml:space="preserve"> PAGEREF _Toc237948929 \h </w:instrText>
         </w:r>
         <w:r>
           <w:rPr>
@@ -2463,7 +2463,7 @@
           <w14:ligatures w14:val="standardContextual"/>
         </w:rPr>
       </w:pPr>
-      <w:hyperlink w:anchor="_Toc237946057" w:history="1">
+      <w:hyperlink w:anchor="_Toc237948930" w:history="1">
         <w:r>
           <w:rPr>
             <w:rStyle w:val="Hyperlink"/>
@@ -2490,7 +2490,7 @@
             <w:noProof/>
             <w:webHidden/>
           </w:rPr>
-          <w:instrText xml:space="preserve"> PAGEREF _Toc237946057 \h </w:instrText>
+          <w:instrText xml:space="preserve"> PAGEREF _Toc237948930 \h </w:instrText>
         </w:r>
         <w:r>
           <w:rPr>
@@ -2536,7 +2536,7 @@
           <w14:ligatures w14:val="standardContextual"/>
         </w:rPr>
       </w:pPr>
-      <w:hyperlink w:anchor="_Toc237946058" w:history="1">
+      <w:hyperlink w:anchor="_Toc237948931" w:history="1">
         <w:r>
           <w:rPr>
             <w:rStyle w:val="Hyperlink"/>
@@ -2563,7 +2563,7 @@
             <w:noProof/>
             <w:webHidden/>
           </w:rPr>
-          <w:instrText xml:space="preserve"> PAGEREF _Toc237946058 \h </w:instrText>
+          <w:instrText xml:space="preserve"> PAGEREF _Toc237948931 \h </w:instrText>
         </w:r>
         <w:r>
           <w:rPr>
@@ -2609,7 +2609,7 @@
           <w14:ligatures w14:val="standardContextual"/>
         </w:rPr>
       </w:pPr>
-      <w:hyperlink w:anchor="_Toc237946059" w:history="1">
+      <w:hyperlink w:anchor="_Toc237948932" w:history="1">
         <w:r>
           <w:rPr>
             <w:rStyle w:val="Hyperlink"/>
@@ -2636,7 +2636,7 @@
             <w:noProof/>
             <w:webHidden/>
           </w:rPr>
-          <w:instrText xml:space="preserve"> PAGEREF _Toc237946059 \h </w:instrText>
+          <w:instrText xml:space="preserve"> PAGEREF _Toc237948932 \h </w:instrText>
         </w:r>
         <w:r>
           <w:rPr>
@@ -2682,7 +2682,7 @@
           <w14:ligatures w14:val="standardContextual"/>
         </w:rPr>
       </w:pPr>
-      <w:hyperlink w:anchor="_Toc237946060" w:history="1">
+      <w:hyperlink w:anchor="_Toc237948933" w:history="1">
         <w:r>
           <w:rPr>
             <w:rStyle w:val="Hyperlink"/>
@@ -2709,7 +2709,7 @@
             <w:noProof/>
             <w:webHidden/>
           </w:rPr>
-          <w:instrText xml:space="preserve"> PAGEREF _Toc237946060 \h </w:instrText>
+          <w:instrText xml:space="preserve"> PAGEREF _Toc237948933 \h </w:instrText>
         </w:r>
         <w:r>
           <w:rPr>
@@ -2755,7 +2755,7 @@
           <w14:ligatures w14:val="standardContextual"/>
         </w:rPr>
       </w:pPr>
-      <w:hyperlink w:anchor="_Toc237946061" w:history="1">
+      <w:hyperlink w:anchor="_Toc237948934" w:history="1">
         <w:r>
           <w:rPr>
             <w:rStyle w:val="Hyperlink"/>
@@ -2782,7 +2782,7 @@
             <w:noProof/>
             <w:webHidden/>
           </w:rPr>
-          <w:instrText xml:space="preserve"> PAGEREF _Toc237946061 \h </w:instrText>
+          <w:instrText xml:space="preserve"> PAGEREF _Toc237948934 \h </w:instrText>
         </w:r>
         <w:r>
           <w:rPr>
@@ -2828,7 +2828,7 @@
           <w14:ligatures w14:val="standardContextual"/>
         </w:rPr>
       </w:pPr>
-      <w:hyperlink w:anchor="_Toc237946062" w:history="1">
+      <w:hyperlink w:anchor="_Toc237948935" w:history="1">
         <w:r>
           <w:rPr>
             <w:rStyle w:val="Hyperlink"/>
@@ -2855,7 +2855,7 @@
             <w:noProof/>
             <w:webHidden/>
           </w:rPr>
-          <w:instrText xml:space="preserve"> PAGEREF _Toc237946062 \h </w:instrText>
+          <w:instrText xml:space="preserve"> PAGEREF _Toc237948935 \h </w:instrText>
         </w:r>
         <w:r>
           <w:rPr>
@@ -2901,7 +2901,7 @@
           <w14:ligatures w14:val="standardContextual"/>
         </w:rPr>
       </w:pPr>
-      <w:hyperlink w:anchor="_Toc237946063" w:history="1">
+      <w:hyperlink w:anchor="_Toc237948936" w:history="1">
         <w:r>
           <w:rPr>
             <w:rStyle w:val="Hyperlink"/>
@@ -2928,7 +2928,7 @@
             <w:noProof/>
             <w:webHidden/>
           </w:rPr>
-          <w:instrText xml:space="preserve"> PAGEREF _Toc237946063 \h </w:instrText>
+          <w:instrText xml:space="preserve"> PAGEREF _Toc237948936 \h </w:instrText>
         </w:r>
         <w:r>
           <w:rPr>
@@ -2975,7 +2975,7 @@
           <w14:ligatures w14:val="standardContextual"/>
         </w:rPr>
       </w:pPr>
-      <w:hyperlink w:anchor="_Toc237946064" w:history="1">
+      <w:hyperlink w:anchor="_Toc237948937" w:history="1">
         <w:r>
           <w:rPr>
             <w:rStyle w:val="Hyperlink"/>
@@ -3002,7 +3002,7 @@
             <w:noProof/>
             <w:webHidden/>
           </w:rPr>
-          <w:instrText xml:space="preserve"> PAGEREF _Toc237946064 \h </w:instrText>
+          <w:instrText xml:space="preserve"> PAGEREF _Toc237948937 \h </w:instrText>
         </w:r>
         <w:r>
           <w:rPr>
@@ -3048,7 +3048,7 @@
           <w14:ligatures w14:val="standardContextual"/>
         </w:rPr>
       </w:pPr>
-      <w:hyperlink w:anchor="_Toc237946065" w:history="1">
+      <w:hyperlink w:anchor="_Toc237948938" w:history="1">
         <w:r>
           <w:rPr>
             <w:rStyle w:val="Hyperlink"/>
@@ -3075,7 +3075,7 @@
             <w:noProof/>
             <w:webHidden/>
           </w:rPr>
-          <w:instrText xml:space="preserve"> PAGEREF _Toc237946065 \h </w:instrText>
+          <w:instrText xml:space="preserve"> PAGEREF _Toc237948938 \h </w:instrText>
         </w:r>
         <w:r>
           <w:rPr>
@@ -3121,7 +3121,7 @@
           <w14:ligatures w14:val="standardContextual"/>
         </w:rPr>
       </w:pPr>
-      <w:hyperlink w:anchor="_Toc237946066" w:history="1">
+      <w:hyperlink w:anchor="_Toc237948939" w:history="1">
         <w:r>
           <w:rPr>
             <w:rStyle w:val="Hyperlink"/>
@@ -3148,7 +3148,7 @@
             <w:noProof/>
             <w:webHidden/>
           </w:rPr>
-          <w:instrText xml:space="preserve"> PAGEREF _Toc237946066 \h </w:instrText>
+          <w:instrText xml:space="preserve"> PAGEREF _Toc237948939 \h </w:instrText>
         </w:r>
         <w:r>
           <w:rPr>
@@ -3194,7 +3194,7 @@
           <w14:ligatures w14:val="standardContextual"/>
         </w:rPr>
       </w:pPr>
-      <w:hyperlink w:anchor="_Toc237946067" w:history="1">
+      <w:hyperlink w:anchor="_Toc237948940" w:history="1">
         <w:r>
           <w:rPr>
             <w:rStyle w:val="Hyperlink"/>
@@ -3221,7 +3221,7 @@
             <w:noProof/>
             <w:webHidden/>
           </w:rPr>
-          <w:instrText xml:space="preserve"> PAGEREF _Toc237946067 \h </w:instrText>
+          <w:instrText xml:space="preserve"> PAGEREF _Toc237948940 \h </w:instrText>
         </w:r>
         <w:r>
           <w:rPr>
@@ -3267,7 +3267,7 @@
           <w14:ligatures w14:val="standardContextual"/>
         </w:rPr>
       </w:pPr>
-      <w:hyperlink w:anchor="_Toc237946068" w:history="1">
+      <w:hyperlink w:anchor="_Toc237948941" w:history="1">
         <w:r>
           <w:rPr>
             <w:rStyle w:val="Hyperlink"/>
@@ -3294,7 +3294,7 @@
             <w:noProof/>
             <w:webHidden/>
           </w:rPr>
-          <w:instrText xml:space="preserve"> PAGEREF _Toc237946068 \h </w:instrText>
+          <w:instrText xml:space="preserve"> PAGEREF _Toc237948941 \h </w:instrText>
         </w:r>
         <w:r>
           <w:rPr>
@@ -3340,7 +3340,7 @@
           <w14:ligatures w14:val="standardContextual"/>
         </w:rPr>
       </w:pPr>
-      <w:hyperlink w:anchor="_Toc237946069" w:history="1">
+      <w:hyperlink w:anchor="_Toc237948942" w:history="1">
         <w:r>
           <w:rPr>
             <w:rStyle w:val="Hyperlink"/>
@@ -3367,7 +3367,7 @@
             <w:noProof/>
             <w:webHidden/>
           </w:rPr>
-          <w:instrText xml:space="preserve"> PAGEREF _Toc237946069 \h </w:instrText>
+          <w:instrText xml:space="preserve"> PAGEREF _Toc237948942 \h </w:instrText>
         </w:r>
         <w:r>
           <w:rPr>
@@ -3413,7 +3413,7 @@
           <w14:ligatures w14:val="standardContextual"/>
         </w:rPr>
       </w:pPr>
-      <w:hyperlink w:anchor="_Toc237946070" w:history="1">
+      <w:hyperlink w:anchor="_Toc237948943" w:history="1">
         <w:r>
           <w:rPr>
             <w:rStyle w:val="Hyperlink"/>
@@ -3440,7 +3440,7 @@
             <w:noProof/>
             <w:webHidden/>
           </w:rPr>
-          <w:instrText xml:space="preserve"> PAGEREF _Toc237946070 \h </w:instrText>
+          <w:instrText xml:space="preserve"> PAGEREF _Toc237948943 \h </w:instrText>
         </w:r>
         <w:r>
           <w:rPr>
@@ -3486,7 +3486,7 @@
           <w14:ligatures w14:val="standardContextual"/>
         </w:rPr>
       </w:pPr>
-      <w:hyperlink w:anchor="_Toc237946071" w:history="1">
+      <w:hyperlink w:anchor="_Toc237948944" w:history="1">
         <w:r>
           <w:rPr>
             <w:rStyle w:val="Hyperlink"/>
@@ -3513,7 +3513,7 @@
             <w:noProof/>
             <w:webHidden/>
           </w:rPr>
-          <w:instrText xml:space="preserve"> PAGEREF _Toc237946071 \h </w:instrText>
+          <w:instrText xml:space="preserve"> PAGEREF _Toc237948944 \h </w:instrText>
         </w:r>
         <w:r>
           <w:rPr>
@@ -3559,7 +3559,7 @@
           <w14:ligatures w14:val="standardContextual"/>
         </w:rPr>
       </w:pPr>
-      <w:hyperlink w:anchor="_Toc237946072" w:history="1">
+      <w:hyperlink w:anchor="_Toc237948945" w:history="1">
         <w:r>
           <w:rPr>
             <w:rStyle w:val="Hyperlink"/>
@@ -3586,7 +3586,7 @@
             <w:noProof/>
             <w:webHidden/>
           </w:rPr>
-          <w:instrText xml:space="preserve"> PAGEREF _Toc237946072 \h </w:instrText>
+          <w:instrText xml:space="preserve"> PAGEREF _Toc237948945 \h </w:instrText>
         </w:r>
         <w:r>
           <w:rPr>
@@ -3632,7 +3632,7 @@
           <w14:ligatures w14:val="standardContextual"/>
         </w:rPr>
       </w:pPr>
-      <w:hyperlink w:anchor="_Toc237946073" w:history="1">
+      <w:hyperlink w:anchor="_Toc237948946" w:history="1">
         <w:r>
           <w:rPr>
             <w:rStyle w:val="Hyperlink"/>
@@ -3659,7 +3659,7 @@
             <w:noProof/>
             <w:webHidden/>
           </w:rPr>
-          <w:instrText xml:space="preserve"> PAGEREF _Toc237946073 \h </w:instrText>
+          <w:instrText xml:space="preserve"> PAGEREF _Toc237948946 \h </w:instrText>
         </w:r>
         <w:r>
           <w:rPr>
@@ -3705,7 +3705,7 @@
           <w14:ligatures w14:val="standardContextual"/>
         </w:rPr>
       </w:pPr>
-      <w:hyperlink w:anchor="_Toc237946074" w:history="1">
+      <w:hyperlink w:anchor="_Toc237948947" w:history="1">
         <w:r>
           <w:rPr>
             <w:rStyle w:val="Hyperlink"/>
@@ -3732,7 +3732,7 @@
             <w:noProof/>
             <w:webHidden/>
           </w:rPr>
-          <w:instrText xml:space="preserve"> PAGEREF _Toc237946074 \h </w:instrText>
+          <w:instrText xml:space="preserve"> PAGEREF _Toc237948947 \h </w:instrText>
         </w:r>
         <w:r>
           <w:rPr>
@@ -3778,7 +3778,7 @@
           <w14:ligatures w14:val="standardContextual"/>
         </w:rPr>
       </w:pPr>
-      <w:hyperlink w:anchor="_Toc237946075" w:history="1">
+      <w:hyperlink w:anchor="_Toc237948948" w:history="1">
         <w:r>
           <w:rPr>
             <w:rStyle w:val="Hyperlink"/>
@@ -3805,7 +3805,7 @@
             <w:noProof/>
             <w:webHidden/>
           </w:rPr>
-          <w:instrText xml:space="preserve"> PAGEREF _Toc237946075 \h </w:instrText>
+          <w:instrText xml:space="preserve"> PAGEREF _Toc237948948 \h </w:instrText>
         </w:r>
         <w:r>
           <w:rPr>
@@ -3852,7 +3852,7 @@
           <w14:ligatures w14:val="standardContextual"/>
         </w:rPr>
       </w:pPr>
-      <w:hyperlink w:anchor="_Toc237946076" w:history="1">
+      <w:hyperlink w:anchor="_Toc237948949" w:history="1">
         <w:r>
           <w:rPr>
             <w:rStyle w:val="Hyperlink"/>
@@ -3879,7 +3879,7 @@
             <w:noProof/>
             <w:webHidden/>
           </w:rPr>
-          <w:instrText xml:space="preserve"> PAGEREF _Toc237946076 \h </w:instrText>
+          <w:instrText xml:space="preserve"> PAGEREF _Toc237948949 \h </w:instrText>
         </w:r>
         <w:r>
           <w:rPr>
@@ -3925,7 +3925,7 @@
           <w14:ligatures w14:val="standardContextual"/>
         </w:rPr>
       </w:pPr>
-      <w:hyperlink w:anchor="_Toc237946077" w:history="1">
+      <w:hyperlink w:anchor="_Toc237948950" w:history="1">
         <w:r>
           <w:rPr>
             <w:rStyle w:val="Hyperlink"/>
@@ -3952,7 +3952,7 @@
             <w:noProof/>
             <w:webHidden/>
           </w:rPr>
-          <w:instrText xml:space="preserve"> PAGEREF _Toc237946077 \h </w:instrText>
+          <w:instrText xml:space="preserve"> PAGEREF _Toc237948950 \h </w:instrText>
         </w:r>
         <w:r>
           <w:rPr>
@@ -3998,7 +3998,7 @@
           <w14:ligatures w14:val="standardContextual"/>
         </w:rPr>
       </w:pPr>
-      <w:hyperlink w:anchor="_Toc237946078" w:history="1">
+      <w:hyperlink w:anchor="_Toc237948951" w:history="1">
         <w:r>
           <w:rPr>
             <w:rStyle w:val="Hyperlink"/>
@@ -4025,7 +4025,7 @@
             <w:noProof/>
             <w:webHidden/>
           </w:rPr>
-          <w:instrText xml:space="preserve"> PAGEREF _Toc237946078 \h </w:instrText>
+          <w:instrText xml:space="preserve"> PAGEREF _Toc237948951 \h </w:instrText>
         </w:r>
         <w:r>
           <w:rPr>
@@ -4071,7 +4071,7 @@
           <w14:ligatures w14:val="standardContextual"/>
         </w:rPr>
       </w:pPr>
-      <w:hyperlink w:anchor="_Toc237946079" w:history="1">
+      <w:hyperlink w:anchor="_Toc237948952" w:history="1">
         <w:r>
           <w:rPr>
             <w:rStyle w:val="Hyperlink"/>
@@ -4098,7 +4098,7 @@
             <w:noProof/>
             <w:webHidden/>
           </w:rPr>
-          <w:instrText xml:space="preserve"> PAGEREF _Toc237946079 \h </w:instrText>
+          <w:instrText xml:space="preserve"> PAGEREF _Toc237948952 \h </w:instrText>
         </w:r>
         <w:r>
           <w:rPr>
@@ -4144,7 +4144,7 @@
           <w14:ligatures w14:val="standardContextual"/>
         </w:rPr>
       </w:pPr>
-      <w:hyperlink w:anchor="_Toc237946080" w:history="1">
+      <w:hyperlink w:anchor="_Toc237948953" w:history="1">
         <w:r>
           <w:rPr>
             <w:rStyle w:val="Hyperlink"/>
@@ -4171,7 +4171,7 @@
             <w:noProof/>
             <w:webHidden/>
           </w:rPr>
-          <w:instrText xml:space="preserve"> PAGEREF _Toc237946080 \h </w:instrText>
+          <w:instrText xml:space="preserve"> PAGEREF _Toc237948953 \h </w:instrText>
         </w:r>
         <w:r>
           <w:rPr>
@@ -4217,7 +4217,7 @@
           <w14:ligatures w14:val="standardContextual"/>
         </w:rPr>
       </w:pPr>
-      <w:hyperlink w:anchor="_Toc237946081" w:history="1">
+      <w:hyperlink w:anchor="_Toc237948954" w:history="1">
         <w:r>
           <w:rPr>
             <w:rStyle w:val="Hyperlink"/>
@@ -4244,7 +4244,7 @@
             <w:noProof/>
             <w:webHidden/>
           </w:rPr>
-          <w:instrText xml:space="preserve"> PAGEREF _Toc237946081 \h </w:instrText>
+          <w:instrText xml:space="preserve"> PAGEREF _Toc237948954 \h </w:instrText>
         </w:r>
         <w:r>
           <w:rPr>
@@ -4290,7 +4290,7 @@
           <w14:ligatures w14:val="standardContextual"/>
         </w:rPr>
       </w:pPr>
-      <w:hyperlink w:anchor="_Toc237946082" w:history="1">
+      <w:hyperlink w:anchor="_Toc237948955" w:history="1">
         <w:r>
           <w:rPr>
             <w:rStyle w:val="Hyperlink"/>
@@ -4317,7 +4317,7 @@
             <w:noProof/>
             <w:webHidden/>
           </w:rPr>
-          <w:instrText xml:space="preserve"> PAGEREF _Toc237946082 \h </w:instrText>
+          <w:instrText xml:space="preserve"> PAGEREF _Toc237948955 \h </w:instrText>
         </w:r>
         <w:r>
           <w:rPr>
@@ -4364,7 +4364,7 @@
           <w14:ligatures w14:val="standardContextual"/>
         </w:rPr>
       </w:pPr>
-      <w:hyperlink w:anchor="_Toc237946083" w:history="1">
+      <w:hyperlink w:anchor="_Toc237948956" w:history="1">
         <w:r>
           <w:rPr>
             <w:rStyle w:val="Hyperlink"/>
@@ -4391,7 +4391,7 @@
             <w:noProof/>
             <w:webHidden/>
           </w:rPr>
-          <w:instrText xml:space="preserve"> PAGEREF _Toc237946083 \h </w:instrText>
+          <w:instrText xml:space="preserve"> PAGEREF _Toc237948956 \h </w:instrText>
         </w:r>
         <w:r>
           <w:rPr>
@@ -4437,7 +4437,7 @@
           <w14:ligatures w14:val="standardContextual"/>
         </w:rPr>
       </w:pPr>
-      <w:hyperlink w:anchor="_Toc237946084" w:history="1">
+      <w:hyperlink w:anchor="_Toc237948957" w:history="1">
         <w:r>
           <w:rPr>
             <w:rStyle w:val="Hyperlink"/>
@@ -4464,7 +4464,7 @@
             <w:noProof/>
             <w:webHidden/>
           </w:rPr>
-          <w:instrText xml:space="preserve"> PAGEREF _Toc237946084 \h </w:instrText>
+          <w:instrText xml:space="preserve"> PAGEREF _Toc237948957 \h </w:instrText>
         </w:r>
         <w:r>
           <w:rPr>
@@ -4510,7 +4510,7 @@
           <w14:ligatures w14:val="standardContextual"/>
         </w:rPr>
       </w:pPr>
-      <w:hyperlink w:anchor="_Toc237946085" w:history="1">
+      <w:hyperlink w:anchor="_Toc237948958" w:history="1">
         <w:r>
           <w:rPr>
             <w:rStyle w:val="Hyperlink"/>
@@ -4537,7 +4537,7 @@
             <w:noProof/>
             <w:webHidden/>
           </w:rPr>
-          <w:instrText xml:space="preserve"> PAGEREF _Toc237946085 \h </w:instrText>
+          <w:instrText xml:space="preserve"> PAGEREF _Toc237948958 \h </w:instrText>
         </w:r>
         <w:r>
           <w:rPr>
@@ -4584,7 +4584,7 @@
           <w14:ligatures w14:val="standardContextual"/>
         </w:rPr>
       </w:pPr>
-      <w:hyperlink w:anchor="_Toc237946086" w:history="1">
+      <w:hyperlink w:anchor="_Toc237948959" w:history="1">
         <w:r>
           <w:rPr>
             <w:rStyle w:val="Hyperlink"/>
@@ -4611,7 +4611,7 @@
             <w:noProof/>
             <w:webHidden/>
           </w:rPr>
-          <w:instrText xml:space="preserve"> PAGEREF _Toc237946086 \h </w:instrText>
+          <w:instrText xml:space="preserve"> PAGEREF _Toc237948959 \h </w:instrText>
         </w:r>
         <w:r>
           <w:rPr>
@@ -4657,7 +4657,7 @@
           <w14:ligatures w14:val="standardContextual"/>
         </w:rPr>
       </w:pPr>
-      <w:hyperlink w:anchor="_Toc237946087" w:history="1">
+      <w:hyperlink w:anchor="_Toc237948960" w:history="1">
         <w:r>
           <w:rPr>
             <w:rStyle w:val="Hyperlink"/>
@@ -4684,7 +4684,7 @@
             <w:noProof/>
             <w:webHidden/>
           </w:rPr>
-          <w:instrText xml:space="preserve"> PAGEREF _Toc237946087 \h </w:instrText>
+          <w:instrText xml:space="preserve"> PAGEREF _Toc237948960 \h </w:instrText>
         </w:r>
         <w:r>
           <w:rPr>
@@ -4730,7 +4730,7 @@
           <w14:ligatures w14:val="standardContextual"/>
         </w:rPr>
       </w:pPr>
-      <w:hyperlink w:anchor="_Toc237946088" w:history="1">
+      <w:hyperlink w:anchor="_Toc237948961" w:history="1">
         <w:r>
           <w:rPr>
             <w:rStyle w:val="Hyperlink"/>
@@ -4757,7 +4757,7 @@
             <w:noProof/>
             <w:webHidden/>
           </w:rPr>
-          <w:instrText xml:space="preserve"> PAGEREF _Toc237946088 \h </w:instrText>
+          <w:instrText xml:space="preserve"> PAGEREF _Toc237948961 \h </w:instrText>
         </w:r>
         <w:r>
           <w:rPr>
@@ -4803,7 +4803,7 @@
           <w14:ligatures w14:val="standardContextual"/>
         </w:rPr>
       </w:pPr>
-      <w:hyperlink w:anchor="_Toc237946089" w:history="1">
+      <w:hyperlink w:anchor="_Toc237948962" w:history="1">
         <w:r>
           <w:rPr>
             <w:rStyle w:val="Hyperlink"/>
@@ -4830,7 +4830,7 @@
             <w:noProof/>
             <w:webHidden/>
           </w:rPr>
-          <w:instrText xml:space="preserve"> PAGEREF _Toc237946089 \h </w:instrText>
+          <w:instrText xml:space="preserve"> PAGEREF _Toc237948962 \h </w:instrText>
         </w:r>
         <w:r>
           <w:rPr>
@@ -4876,7 +4876,7 @@
           <w14:ligatures w14:val="standardContextual"/>
         </w:rPr>
       </w:pPr>
-      <w:hyperlink w:anchor="_Toc237946090" w:history="1">
+      <w:hyperlink w:anchor="_Toc237948963" w:history="1">
         <w:r>
           <w:rPr>
             <w:rStyle w:val="Hyperlink"/>
@@ -4903,7 +4903,7 @@
             <w:noProof/>
             <w:webHidden/>
           </w:rPr>
-          <w:instrText xml:space="preserve"> PAGEREF _Toc237946090 \h </w:instrText>
+          <w:instrText xml:space="preserve"> PAGEREF _Toc237948963 \h </w:instrText>
         </w:r>
         <w:r>
           <w:rPr>
@@ -4944,7 +4944,7 @@
         <w:pStyle w:val="Heading1"/>
         <w:pageBreakBefore/>
       </w:pPr>
-      <w:bookmarkStart w:id="0" w:name="_Toc237946024"/>
+      <w:bookmarkStart w:id="0" w:name="_Toc237948897"/>
       <w:r>
         <w:lastRenderedPageBreak/>
         <w:t>Contest Notes</w:t>
@@ -4960,7 +4960,7 @@
       <w:pPr>
         <w:pStyle w:val="Heading2"/>
       </w:pPr>
-      <w:bookmarkStart w:id="1" w:name="_Toc237946025"/>
+      <w:bookmarkStart w:id="1" w:name="_Toc237948898"/>
       <w:r>
         <w:t>Setup &amp; don't-forget</w:t>
       </w:r>
@@ -5503,7 +5503,7 @@
       <w:pPr>
         <w:pStyle w:val="Heading2"/>
       </w:pPr>
-      <w:bookmarkStart w:id="2" w:name="_Toc237946026"/>
+      <w:bookmarkStart w:id="2" w:name="_Toc237948899"/>
       <w:r>
         <w:t>Number theory</w:t>
       </w:r>
@@ -5667,7 +5667,7 @@
       <w:pPr>
         <w:pStyle w:val="Heading2"/>
       </w:pPr>
-      <w:bookmarkStart w:id="3" w:name="_Toc237946027"/>
+      <w:bookmarkStart w:id="3" w:name="_Toc237948900"/>
       <w:r>
         <w:t>Bits</w:t>
       </w:r>
@@ -5846,7 +5846,7 @@
       <w:pPr>
         <w:pStyle w:val="Heading2"/>
       </w:pPr>
-      <w:bookmarkStart w:id="4" w:name="_Toc237946028"/>
+      <w:bookmarkStart w:id="4" w:name="_Toc237948901"/>
       <w:r>
         <w:t>Games (Grundy)</w:t>
       </w:r>
@@ -6044,7 +6044,7 @@
       <w:pPr>
         <w:pStyle w:val="Heading2"/>
       </w:pPr>
-      <w:bookmarkStart w:id="5" w:name="_Toc237946029"/>
+      <w:bookmarkStart w:id="5" w:name="_Toc237948902"/>
       <w:r>
         <w:t>Expected value</w:t>
       </w:r>
@@ -6230,7 +6230,7 @@
       <w:pPr>
         <w:pStyle w:val="Heading2"/>
       </w:pPr>
-      <w:bookmarkStart w:id="6" w:name="_Toc237946030"/>
+      <w:bookmarkStart w:id="6" w:name="_Toc237948903"/>
       <w:r>
         <w:t>Misc</w:t>
       </w:r>
@@ -6294,7 +6294,7 @@
       <w:pPr>
         <w:pStyle w:val="Heading2"/>
       </w:pPr>
-      <w:bookmarkStart w:id="7" w:name="_Toc237946031"/>
+      <w:bookmarkStart w:id="7" w:name="_Toc237948904"/>
       <w:r>
         <w:t>Tricks</w:t>
       </w:r>
@@ -6452,6 +6452,41 @@
         <w:pStyle w:val="Bullet"/>
       </w:pPr>
       <w:r>
+        <w:t xml:space="preserve">• Same flip for </w:t>
+      </w:r>
+      <w:r>
+        <w:rPr>
+          <w:b/>
+        </w:rPr>
+        <w:t>subsets</w:t>
+      </w:r>
+      <w:r>
+        <w:t xml:space="preserve">: each element lies in </w:t>
+      </w:r>
+      <w:r>
+        <w:rPr>
+          <w:b/>
+        </w:rPr>
+        <w:t>2^(n−1)</w:t>
+      </w:r>
+      <w:r>
+        <w:t xml:space="preserve"> of the 2^n subsets → sum of sizes over all subsets = </w:t>
+      </w:r>
+      <w:r>
+        <w:rPr>
+          <w:b/>
+        </w:rPr>
+        <w:t>n·2^(n−1)</w:t>
+      </w:r>
+      <w:r>
+        <w:t>; each PAIR lies in 2^(n−2) (Σ over subsets of #pairs = C(n,2)·2^(n−2)), and so on — "sum of f over all subsets" usually collapses to one closed form per element/pair.</w:t>
+      </w:r>
+    </w:p>
+    <w:p>
+      <w:pPr>
+        <w:pStyle w:val="Bullet"/>
+      </w:pPr>
+      <w:r>
         <w:t>• "Count pairs (i, j) with condition" → sort + two pointers, or sweep left→right holding earlier elements in a Fenwick over values (inversions pattern).</w:t>
       </w:r>
     </w:p>
@@ -6821,7 +6856,10 @@
         <w:pStyle w:val="Bullet"/>
       </w:pPr>
       <w:r>
-        <w:t xml:space="preserve">• Each node has exactly one outgoing edge (functional graph) → it's cycles with trees hanging off; k-th successor via binary lifting like </w:t>
+        <w:t xml:space="preserve">• </w:t>
+      </w:r>
+      <w:r>
+        <w:t xml:space="preserve">Each node has exactly one outgoing edge (functional graph) → it's cycles with trees hanging off; k-th successor via binary lifting like </w:t>
       </w:r>
       <w:r>
         <w:rPr>
@@ -6928,7 +6966,7 @@
           <w:szCs w:val="72"/>
         </w:rPr>
       </w:pPr>
-      <w:bookmarkStart w:id="8" w:name="_Toc237946032"/>
+      <w:bookmarkStart w:id="8" w:name="_Toc237948905"/>
       <w:r>
         <w:rPr>
           <w:sz w:val="72"/>
@@ -6944,7 +6982,7 @@
         <w:pStyle w:val="TemplateHeading"/>
         <w:pageBreakBefore/>
       </w:pPr>
-      <w:bookmarkStart w:id="9" w:name="_Toc237946033"/>
+      <w:bookmarkStart w:id="9" w:name="_Toc237948906"/>
       <w:r>
         <w:lastRenderedPageBreak/>
         <w:t>Divisors</w:t>
@@ -7355,7 +7393,7 @@
         <w:pStyle w:val="TemplateHeading"/>
         <w:pageBreakBefore/>
       </w:pPr>
-      <w:bookmarkStart w:id="10" w:name="_Toc237946034"/>
+      <w:bookmarkStart w:id="10" w:name="_Toc237948907"/>
       <w:r>
         <w:lastRenderedPageBreak/>
         <w:t>Euler's Phi (Totient)</w:t>
@@ -7633,7 +7671,7 @@
         <w:pStyle w:val="TemplateHeading"/>
         <w:pageBreakBefore/>
       </w:pPr>
-      <w:bookmarkStart w:id="11" w:name="_Toc237946035"/>
+      <w:bookmarkStart w:id="11" w:name="_Toc237948908"/>
       <w:r>
         <w:lastRenderedPageBreak/>
         <w:t>Extended GCD &amp; CRT</w:t>
@@ -8009,7 +8047,7 @@
         <w:pStyle w:val="TemplateHeading"/>
         <w:pageBreakBefore/>
       </w:pPr>
-      <w:bookmarkStart w:id="12" w:name="_Toc237946036"/>
+      <w:bookmarkStart w:id="12" w:name="_Toc237948909"/>
       <w:r>
         <w:lastRenderedPageBreak/>
         <w:t>Linear Sieve</w:t>
@@ -8278,7 +8316,7 @@
         <w:pStyle w:val="TemplateHeading"/>
         <w:pageBreakBefore/>
       </w:pPr>
-      <w:bookmarkStart w:id="13" w:name="_Toc237946037"/>
+      <w:bookmarkStart w:id="13" w:name="_Toc237948910"/>
       <w:r>
         <w:lastRenderedPageBreak/>
         <w:t>Miller-Rabin Primality</w:t>
@@ -8697,7 +8735,7 @@
         <w:pStyle w:val="TemplateHeading"/>
         <w:pageBreakBefore/>
       </w:pPr>
-      <w:bookmarkStart w:id="14" w:name="_Toc237946038"/>
+      <w:bookmarkStart w:id="14" w:name="_Toc237948911"/>
       <w:r>
         <w:lastRenderedPageBreak/>
         <w:t>Sieve of Eratosthenes</w:t>
@@ -8984,7 +9022,7 @@
           <w:szCs w:val="72"/>
         </w:rPr>
       </w:pPr>
-      <w:bookmarkStart w:id="15" w:name="_Toc237946039"/>
+      <w:bookmarkStart w:id="15" w:name="_Toc237948912"/>
       <w:r>
         <w:rPr>
           <w:sz w:val="72"/>
@@ -9000,7 +9038,7 @@
         <w:pStyle w:val="TemplateHeading"/>
         <w:pageBreakBefore/>
       </w:pPr>
-      <w:bookmarkStart w:id="16" w:name="_Toc237946040"/>
+      <w:bookmarkStart w:id="16" w:name="_Toc237948913"/>
       <w:r>
         <w:lastRenderedPageBreak/>
         <w:t>Combinatorics Toolkit</w:t>
@@ -9542,7 +9580,7 @@
         <w:pStyle w:val="TemplateHeading"/>
         <w:pageBreakBefore/>
       </w:pPr>
-      <w:bookmarkStart w:id="17" w:name="_Toc237946041"/>
+      <w:bookmarkStart w:id="17" w:name="_Toc237948914"/>
       <w:r>
         <w:lastRenderedPageBreak/>
         <w:t>Partitions (Pentagonal Theorem)</w:t>
@@ -9792,7 +9830,7 @@
         <w:pStyle w:val="TemplateHeading"/>
         <w:pageBreakBefore/>
       </w:pPr>
-      <w:bookmarkStart w:id="18" w:name="_Toc237946042"/>
+      <w:bookmarkStart w:id="18" w:name="_Toc237948915"/>
       <w:r>
         <w:lastRenderedPageBreak/>
         <w:t>nCr - Pascal's Triangle</w:t>
@@ -9999,7 +10037,7 @@
           <w:szCs w:val="72"/>
         </w:rPr>
       </w:pPr>
-      <w:bookmarkStart w:id="19" w:name="_Toc237946043"/>
+      <w:bookmarkStart w:id="19" w:name="_Toc237948916"/>
       <w:r>
         <w:rPr>
           <w:sz w:val="72"/>
@@ -10015,7 +10053,7 @@
         <w:pStyle w:val="TemplateHeading"/>
         <w:pageBreakBefore/>
       </w:pPr>
-      <w:bookmarkStart w:id="20" w:name="_Toc237946044"/>
+      <w:bookmarkStart w:id="20" w:name="_Toc237948917"/>
       <w:r>
         <w:lastRenderedPageBreak/>
         <w:t>Digit DP</w:t>
@@ -10443,7 +10481,7 @@
         <w:pStyle w:val="TemplateHeading"/>
         <w:pageBreakBefore/>
       </w:pPr>
-      <w:bookmarkStart w:id="21" w:name="_Toc237946045"/>
+      <w:bookmarkStart w:id="21" w:name="_Toc237948918"/>
       <w:r>
         <w:lastRenderedPageBreak/>
         <w:t>Longest Increasing Subsequence (LIS)</w:t>
@@ -10686,7 +10724,7 @@
         <w:pStyle w:val="TemplateHeading"/>
         <w:pageBreakBefore/>
       </w:pPr>
-      <w:bookmarkStart w:id="22" w:name="_Toc237946046"/>
+      <w:bookmarkStart w:id="22" w:name="_Toc237948919"/>
       <w:r>
         <w:lastRenderedPageBreak/>
         <w:t>Matrix Exponentiation</w:t>
@@ -11037,7 +11075,7 @@
         <w:pStyle w:val="TemplateHeading"/>
         <w:pageBreakBefore/>
       </w:pPr>
-      <w:bookmarkStart w:id="23" w:name="_Toc237946047"/>
+      <w:bookmarkStart w:id="23" w:name="_Toc237948920"/>
       <w:r>
         <w:lastRenderedPageBreak/>
         <w:t>Rerooting</w:t>
@@ -11405,7 +11443,7 @@
         <w:pStyle w:val="TemplateHeading"/>
         <w:pageBreakBefore/>
       </w:pPr>
-      <w:bookmarkStart w:id="24" w:name="_Toc237946048"/>
+      <w:bookmarkStart w:id="24" w:name="_Toc237948921"/>
       <w:r>
         <w:lastRenderedPageBreak/>
         <w:t>SOS DP (Sum over Subsets)</w:t>
@@ -11648,7 +11686,7 @@
         <w:pStyle w:val="TemplateHeading"/>
         <w:pageBreakBefore/>
       </w:pPr>
-      <w:bookmarkStart w:id="25" w:name="_Toc237946049"/>
+      <w:bookmarkStart w:id="25" w:name="_Toc237948922"/>
       <w:r>
         <w:lastRenderedPageBreak/>
         <w:t>Tree Knapsack</w:t>
@@ -11980,7 +12018,7 @@
           <w:szCs w:val="72"/>
         </w:rPr>
       </w:pPr>
-      <w:bookmarkStart w:id="26" w:name="_Toc237946050"/>
+      <w:bookmarkStart w:id="26" w:name="_Toc237948923"/>
       <w:r>
         <w:rPr>
           <w:sz w:val="72"/>
@@ -11996,7 +12034,7 @@
         <w:pStyle w:val="TemplateHeading"/>
         <w:pageBreakBefore/>
       </w:pPr>
-      <w:bookmarkStart w:id="27" w:name="_Toc237946051"/>
+      <w:bookmarkStart w:id="27" w:name="_Toc237948924"/>
       <w:r>
         <w:lastRenderedPageBreak/>
         <w:t>Articulation Points</w:t>
@@ -12308,7 +12346,7 @@
         <w:pStyle w:val="TemplateHeading"/>
         <w:pageBreakBefore/>
       </w:pPr>
-      <w:bookmarkStart w:id="28" w:name="_Toc237946052"/>
+      <w:bookmarkStart w:id="28" w:name="_Toc237948925"/>
       <w:r>
         <w:lastRenderedPageBreak/>
         <w:t>Bellman-Ford</w:t>
@@ -12630,7 +12668,7 @@
         <w:pStyle w:val="TemplateHeading"/>
         <w:pageBreakBefore/>
       </w:pPr>
-      <w:bookmarkStart w:id="29" w:name="_Toc237946053"/>
+      <w:bookmarkStart w:id="29" w:name="_Toc237948926"/>
       <w:r>
         <w:lastRenderedPageBreak/>
         <w:t>Bridges (Tarjan)</w:t>
@@ -12923,7 +12961,7 @@
         <w:pStyle w:val="TemplateHeading"/>
         <w:pageBreakBefore/>
       </w:pPr>
-      <w:bookmarkStart w:id="30" w:name="_Toc237946054"/>
+      <w:bookmarkStart w:id="30" w:name="_Toc237948927"/>
       <w:r>
         <w:lastRenderedPageBreak/>
         <w:t>Bridge Tree</w:t>
@@ -13485,7 +13523,7 @@
         <w:pStyle w:val="TemplateHeading"/>
         <w:pageBreakBefore/>
       </w:pPr>
-      <w:bookmarkStart w:id="31" w:name="_Toc237946055"/>
+      <w:bookmarkStart w:id="31" w:name="_Toc237948928"/>
       <w:r>
         <w:lastRenderedPageBreak/>
         <w:t>Dijkstra</w:t>
@@ -13786,7 +13824,7 @@
         <w:pStyle w:val="TemplateHeading"/>
         <w:pageBreakBefore/>
       </w:pPr>
-      <w:bookmarkStart w:id="32" w:name="_Toc237946056"/>
+      <w:bookmarkStart w:id="32" w:name="_Toc237948929"/>
       <w:r>
         <w:lastRenderedPageBreak/>
         <w:t>DSU (Union-Find)</w:t>
@@ -14119,7 +14157,7 @@
         <w:pStyle w:val="TemplateHeading"/>
         <w:pageBreakBefore/>
       </w:pPr>
-      <w:bookmarkStart w:id="33" w:name="_Toc237946057"/>
+      <w:bookmarkStart w:id="33" w:name="_Toc237948930"/>
       <w:r>
         <w:lastRenderedPageBreak/>
         <w:t>DSU with Rollback</w:t>
@@ -14535,7 +14573,7 @@
         <w:pStyle w:val="TemplateHeading"/>
         <w:pageBreakBefore/>
       </w:pPr>
-      <w:bookmarkStart w:id="34" w:name="_Toc237946058"/>
+      <w:bookmarkStart w:id="34" w:name="_Toc237948931"/>
       <w:r>
         <w:lastRenderedPageBreak/>
         <w:t>Floyd-Warshall</w:t>
@@ -14799,7 +14837,7 @@
         <w:pStyle w:val="TemplateHeading"/>
         <w:pageBreakBefore/>
       </w:pPr>
-      <w:bookmarkStart w:id="35" w:name="_Toc237946059"/>
+      <w:bookmarkStart w:id="35" w:name="_Toc237948932"/>
       <w:r>
         <w:lastRenderedPageBreak/>
         <w:t>Heavy-Light Decomposition (HLD)</w:t>
@@ -15467,7 +15505,7 @@
         <w:pStyle w:val="TemplateHeading"/>
         <w:pageBreakBefore/>
       </w:pPr>
-      <w:bookmarkStart w:id="36" w:name="_Toc237946060"/>
+      <w:bookmarkStart w:id="36" w:name="_Toc237948933"/>
       <w:r>
         <w:lastRenderedPageBreak/>
         <w:t>LCA (Binary Lifting)</w:t>
@@ -15920,7 +15958,7 @@
         <w:pStyle w:val="TemplateHeading"/>
         <w:pageBreakBefore/>
       </w:pPr>
-      <w:bookmarkStart w:id="37" w:name="_Toc237946061"/>
+      <w:bookmarkStart w:id="37" w:name="_Toc237948934"/>
       <w:r>
         <w:lastRenderedPageBreak/>
         <w:t>MST (Kruskal)</w:t>
@@ -16304,7 +16342,7 @@
         <w:pStyle w:val="TemplateHeading"/>
         <w:pageBreakBefore/>
       </w:pPr>
-      <w:bookmarkStart w:id="38" w:name="_Toc237946062"/>
+      <w:bookmarkStart w:id="38" w:name="_Toc237948935"/>
       <w:r>
         <w:lastRenderedPageBreak/>
         <w:t>Strongly Connected Components (SCC)</w:t>
@@ -16939,7 +16977,7 @@
         <w:pStyle w:val="TemplateHeading"/>
         <w:pageBreakBefore/>
       </w:pPr>
-      <w:bookmarkStart w:id="39" w:name="_Toc237946063"/>
+      <w:bookmarkStart w:id="39" w:name="_Toc237948936"/>
       <w:r>
         <w:lastRenderedPageBreak/>
         <w:t>Topological Sort</w:t>
@@ -17202,7 +17240,7 @@
           <w:szCs w:val="72"/>
         </w:rPr>
       </w:pPr>
-      <w:bookmarkStart w:id="40" w:name="_Toc237946064"/>
+      <w:bookmarkStart w:id="40" w:name="_Toc237948937"/>
       <w:r>
         <w:rPr>
           <w:sz w:val="72"/>
@@ -17218,7 +17256,7 @@
         <w:pStyle w:val="TemplateHeading"/>
         <w:pageBreakBefore/>
       </w:pPr>
-      <w:bookmarkStart w:id="41" w:name="_Toc237946065"/>
+      <w:bookmarkStart w:id="41" w:name="_Toc237948938"/>
       <w:r>
         <w:lastRenderedPageBreak/>
         <w:t>Fenwick Tree (Point Update, Range Query)</w:t>
@@ -17560,7 +17598,7 @@
         <w:pStyle w:val="TemplateHeading"/>
         <w:pageBreakBefore/>
       </w:pPr>
-      <w:bookmarkStart w:id="42" w:name="_Toc237946066"/>
+      <w:bookmarkStart w:id="42" w:name="_Toc237948939"/>
       <w:r>
         <w:lastRenderedPageBreak/>
         <w:t>Fenwick Tree (Range Update, Point Query)</w:t>
@@ -17851,7 +17889,7 @@
         <w:pStyle w:val="TemplateHeading"/>
         <w:pageBreakBefore/>
       </w:pPr>
-      <w:bookmarkStart w:id="43" w:name="_Toc237946067"/>
+      <w:bookmarkStart w:id="43" w:name="_Toc237948940"/>
       <w:r>
         <w:lastRenderedPageBreak/>
         <w:t>Lazy Segment Tree</w:t>
@@ -18801,7 +18839,7 @@
         <w:pStyle w:val="TemplateHeading"/>
         <w:pageBreakBefore/>
       </w:pPr>
-      <w:bookmarkStart w:id="44" w:name="_Toc237946068"/>
+      <w:bookmarkStart w:id="44" w:name="_Toc237948941"/>
       <w:r>
         <w:lastRenderedPageBreak/>
         <w:t>Mo's Algorithm</w:t>
@@ -19289,7 +19327,7 @@
         <w:pStyle w:val="TemplateHeading"/>
         <w:pageBreakBefore/>
       </w:pPr>
-      <w:bookmarkStart w:id="45" w:name="_Toc237946069"/>
+      <w:bookmarkStart w:id="45" w:name="_Toc237948942"/>
       <w:r>
         <w:lastRenderedPageBreak/>
         <w:t>Mo on Tree</w:t>
@@ -20312,7 +20350,7 @@
         <w:pStyle w:val="TemplateHeading"/>
         <w:pageBreakBefore/>
       </w:pPr>
-      <w:bookmarkStart w:id="46" w:name="_Toc237946070"/>
+      <w:bookmarkStart w:id="46" w:name="_Toc237948943"/>
       <w:r>
         <w:lastRenderedPageBreak/>
         <w:t>Mo with Rollback</w:t>
@@ -21074,7 +21112,7 @@
         <w:pStyle w:val="TemplateHeading"/>
         <w:pageBreakBefore/>
       </w:pPr>
-      <w:bookmarkStart w:id="47" w:name="_Toc237946071"/>
+      <w:bookmarkStart w:id="47" w:name="_Toc237948944"/>
       <w:r>
         <w:lastRenderedPageBreak/>
         <w:t>Segment Tree</w:t>
@@ -21598,7 +21636,7 @@
         <w:pStyle w:val="TemplateHeading"/>
         <w:pageBreakBefore/>
       </w:pPr>
-      <w:bookmarkStart w:id="48" w:name="_Toc237946072"/>
+      <w:bookmarkStart w:id="48" w:name="_Toc237948945"/>
       <w:r>
         <w:lastRenderedPageBreak/>
         <w:t>Segment Tree (Iterative)</w:t>
@@ -22083,7 +22121,7 @@
         <w:pStyle w:val="TemplateHeading"/>
         <w:pageBreakBefore/>
       </w:pPr>
-      <w:bookmarkStart w:id="49" w:name="_Toc237946073"/>
+      <w:bookmarkStart w:id="49" w:name="_Toc237948946"/>
       <w:r>
         <w:lastRenderedPageBreak/>
         <w:t>Sliding Window Min/Max</w:t>
@@ -22337,7 +22375,7 @@
         <w:pStyle w:val="TemplateHeading"/>
         <w:pageBreakBefore/>
       </w:pPr>
-      <w:bookmarkStart w:id="50" w:name="_Toc237946074"/>
+      <w:bookmarkStart w:id="50" w:name="_Toc237948947"/>
       <w:r>
         <w:lastRenderedPageBreak/>
         <w:t>Sparse Table</w:t>
@@ -22684,7 +22722,7 @@
         <w:pStyle w:val="TemplateHeading"/>
         <w:pageBreakBefore/>
       </w:pPr>
-      <w:bookmarkStart w:id="51" w:name="_Toc237946075"/>
+      <w:bookmarkStart w:id="51" w:name="_Toc237948948"/>
       <w:r>
         <w:lastRenderedPageBreak/>
         <w:t>Sqrt Decomposition</w:t>
@@ -23000,7 +23038,7 @@
           <w:szCs w:val="72"/>
         </w:rPr>
       </w:pPr>
-      <w:bookmarkStart w:id="52" w:name="_Toc237946076"/>
+      <w:bookmarkStart w:id="52" w:name="_Toc237948949"/>
       <w:r>
         <w:rPr>
           <w:sz w:val="72"/>
@@ -23016,7 +23054,7 @@
         <w:pStyle w:val="TemplateHeading"/>
         <w:pageBreakBefore/>
       </w:pPr>
-      <w:bookmarkStart w:id="53" w:name="_Toc237946077"/>
+      <w:bookmarkStart w:id="53" w:name="_Toc237948950"/>
       <w:r>
         <w:lastRenderedPageBreak/>
         <w:t>Binary Trie (XOR)</w:t>
@@ -23637,7 +23675,7 @@
         <w:pStyle w:val="TemplateHeading"/>
         <w:pageBreakBefore/>
       </w:pPr>
-      <w:bookmarkStart w:id="54" w:name="_Toc237946078"/>
+      <w:bookmarkStart w:id="54" w:name="_Toc237948951"/>
       <w:r>
         <w:lastRenderedPageBreak/>
         <w:t>String Hashing</w:t>
@@ -24097,7 +24135,7 @@
         <w:pStyle w:val="TemplateHeading"/>
         <w:pageBreakBefore/>
       </w:pPr>
-      <w:bookmarkStart w:id="55" w:name="_Toc237946079"/>
+      <w:bookmarkStart w:id="55" w:name="_Toc237948952"/>
       <w:r>
         <w:lastRenderedPageBreak/>
         <w:t>KMP (Prefix Function)</w:t>
@@ -24393,7 +24431,7 @@
         <w:pStyle w:val="TemplateHeading"/>
         <w:pageBreakBefore/>
       </w:pPr>
-      <w:bookmarkStart w:id="56" w:name="_Toc237946080"/>
+      <w:bookmarkStart w:id="56" w:name="_Toc237948953"/>
       <w:r>
         <w:lastRenderedPageBreak/>
         <w:t>Manacher (Palindromes)</w:t>
@@ -24694,7 +24732,7 @@
         <w:pStyle w:val="TemplateHeading"/>
         <w:pageBreakBefore/>
       </w:pPr>
-      <w:bookmarkStart w:id="57" w:name="_Toc237946081"/>
+      <w:bookmarkStart w:id="57" w:name="_Toc237948954"/>
       <w:r>
         <w:lastRenderedPageBreak/>
         <w:t>Multiset Hashing</w:t>
@@ -25086,7 +25124,7 @@
         <w:pStyle w:val="TemplateHeading"/>
         <w:pageBreakBefore/>
       </w:pPr>
-      <w:bookmarkStart w:id="58" w:name="_Toc237946082"/>
+      <w:bookmarkStart w:id="58" w:name="_Toc237948955"/>
       <w:r>
         <w:lastRenderedPageBreak/>
         <w:t>Trie</w:t>
@@ -25712,7 +25750,7 @@
           <w:szCs w:val="72"/>
         </w:rPr>
       </w:pPr>
-      <w:bookmarkStart w:id="59" w:name="_Toc237946083"/>
+      <w:bookmarkStart w:id="59" w:name="_Toc237948956"/>
       <w:r>
         <w:rPr>
           <w:sz w:val="72"/>
@@ -25728,7 +25766,7 @@
         <w:pStyle w:val="TemplateHeading"/>
         <w:pageBreakBefore/>
       </w:pPr>
-      <w:bookmarkStart w:id="60" w:name="_Toc237946084"/>
+      <w:bookmarkStart w:id="60" w:name="_Toc237948957"/>
       <w:r>
         <w:lastRenderedPageBreak/>
         <w:t>Closest Pair of Points</w:t>
@@ -25976,7 +26014,7 @@
         <w:pStyle w:val="TemplateHeading"/>
         <w:pageBreakBefore/>
       </w:pPr>
-      <w:bookmarkStart w:id="61" w:name="_Toc237946085"/>
+      <w:bookmarkStart w:id="61" w:name="_Toc237948958"/>
       <w:r>
         <w:lastRenderedPageBreak/>
         <w:t>Geometry Basics</w:t>
@@ -26531,7 +26569,7 @@
           <w:szCs w:val="72"/>
         </w:rPr>
       </w:pPr>
-      <w:bookmarkStart w:id="62" w:name="_Toc237946086"/>
+      <w:bookmarkStart w:id="62" w:name="_Toc237948959"/>
       <w:r>
         <w:rPr>
           <w:sz w:val="72"/>
@@ -26547,7 +26585,7 @@
         <w:pStyle w:val="TemplateHeading"/>
         <w:pageBreakBefore/>
       </w:pPr>
-      <w:bookmarkStart w:id="63" w:name="_Toc237946087"/>
+      <w:bookmarkStart w:id="63" w:name="_Toc237948960"/>
       <w:r>
         <w:lastRenderedPageBreak/>
         <w:t>Bit Tricks</w:t>
@@ -26795,7 +26833,7 @@
         <w:pStyle w:val="TemplateHeading"/>
         <w:pageBreakBefore/>
       </w:pPr>
-      <w:bookmarkStart w:id="64" w:name="_Toc237946088"/>
+      <w:bookmarkStart w:id="64" w:name="_Toc237948961"/>
       <w:r>
         <w:lastRenderedPageBreak/>
         <w:t>Coordinate Compression</w:t>
@@ -26953,7 +26991,7 @@
         <w:pStyle w:val="TemplateHeading"/>
         <w:pageBreakBefore/>
       </w:pPr>
-      <w:bookmarkStart w:id="65" w:name="_Toc237946089"/>
+      <w:bookmarkStart w:id="65" w:name="_Toc237948962"/>
       <w:r>
         <w:lastRenderedPageBreak/>
         <w:t>Ordered Multiset (PBDS)</w:t>
@@ -27187,7 +27225,7 @@
         <w:pStyle w:val="TemplateHeading"/>
         <w:pageBreakBefore/>
       </w:pPr>
-      <w:bookmarkStart w:id="66" w:name="_Toc237946090"/>
+      <w:bookmarkStart w:id="66" w:name="_Toc237948963"/>
       <w:r>
         <w:lastRenderedPageBreak/>
         <w:t>Random (RNG)</w:t>

</xml_diff>